<commit_message>
RD6 report: qualitative phase in progress, corrected challenge figures
The qualitative study is now reported as in progress and nearly complete,
the plan and deviations tables are updated accordingly, the PhysioNet 2019
winner is quoted as 0.43 on its own hospitals and -0.12 on the unseen
hospital (overall 0.36), the second supervisor is listed, and personal
labels are replaced with professional wording.

Co-Authored-By: Claude Opus 5.5 <noreply@anthropic.com>
Claude-Session: https://claude.ai/code/session_01LgDqxV9dzSvE8XpquGaBd5
</commit_message>
<xml_diff>
--- a/dev/presentation/RD6_Progress_Report_Elrggal_Oct2026.docx
+++ b/dev/presentation/RD6_Progress_Report_Elrggal_Oct2026.docx
@@ -391,7 +391,7 @@
                 <w:sz w:val="20"/>
                 <w:szCs w:val="20"/>
               </w:rPr>
-              <w:t xml:space="preserve">School</w:t>
+              <w:t xml:space="preserve">Second Supervisor</w:t>
             </w:r>
           </w:p>
         </w:tc>
@@ -425,7 +425,7 @@
                 <w:sz w:val="20"/>
                 <w:szCs w:val="20"/>
               </w:rPr>
-              <w:t xml:space="preserve">School of Computing, Engineering and the Built Environment</w:t>
+              <w:t xml:space="preserve">Kia</w:t>
             </w:r>
           </w:p>
         </w:tc>
@@ -465,7 +465,7 @@
                 <w:sz w:val="20"/>
                 <w:szCs w:val="20"/>
               </w:rPr>
-              <w:t xml:space="preserve">University</w:t>
+              <w:t xml:space="preserve">School</w:t>
             </w:r>
           </w:p>
         </w:tc>
@@ -500,7 +500,7 @@
                 <w:sz w:val="20"/>
                 <w:szCs w:val="20"/>
               </w:rPr>
-              <w:t xml:space="preserve">Edinburgh Napier University</w:t>
+              <w:t xml:space="preserve">School of Computing, Engineering and the Built Environment</w:t>
             </w:r>
           </w:p>
         </w:tc>
@@ -539,7 +539,7 @@
                 <w:sz w:val="20"/>
                 <w:szCs w:val="20"/>
               </w:rPr>
-              <w:t xml:space="preserve">Reporting period</w:t>
+              <w:t xml:space="preserve">University</w:t>
             </w:r>
           </w:p>
         </w:tc>
@@ -573,7 +573,7 @@
                 <w:sz w:val="20"/>
                 <w:szCs w:val="20"/>
               </w:rPr>
-              <w:t xml:space="preserve">April 2026 - October 2026</w:t>
+              <w:t xml:space="preserve">Edinburgh Napier University</w:t>
             </w:r>
           </w:p>
         </w:tc>
@@ -613,7 +613,7 @@
                 <w:sz w:val="20"/>
                 <w:szCs w:val="20"/>
               </w:rPr>
-              <w:t xml:space="preserve">Report type</w:t>
+              <w:t xml:space="preserve">Reporting period</w:t>
             </w:r>
           </w:p>
         </w:tc>
@@ -648,7 +648,7 @@
                 <w:sz w:val="20"/>
                 <w:szCs w:val="20"/>
               </w:rPr>
-              <w:t xml:space="preserve">RD6 - Six-Monthly Progress Review</w:t>
+              <w:t xml:space="preserve">April 2026 - October 2026</w:t>
             </w:r>
           </w:p>
         </w:tc>
@@ -687,6 +687,80 @@
                 <w:sz w:val="20"/>
                 <w:szCs w:val="20"/>
               </w:rPr>
+              <w:t xml:space="preserve">Report type</w:t>
+            </w:r>
+          </w:p>
+        </w:tc>
+        <w:tc>
+          <w:tcPr>
+            <w:tcW w:type="dxa" w:w="6400"/>
+            <w:tcBorders>
+              <w:top w:val="single" w:color="D5DCE4" w:sz="4"/>
+              <w:left w:val="single" w:color="D5DCE4" w:sz="4"/>
+              <w:bottom w:val="single" w:color="D5DCE4" w:sz="4"/>
+              <w:right w:val="single" w:color="D5DCE4" w:sz="4"/>
+            </w:tcBorders>
+            <w:tcMar>
+              <w:top w:type="dxa" w:w="60"/>
+              <w:left w:type="dxa" w:w="100"/>
+              <w:bottom w:type="dxa" w:w="60"/>
+              <w:right w:type="dxa" w:w="100"/>
+            </w:tcMar>
+            <w:vAlign w:val="center"/>
+          </w:tcPr>
+          <w:p>
+            <w:pPr>
+              <w:spacing w:after="40" w:line="260"/>
+            </w:pPr>
+            <w:r>
+              <w:rPr>
+                <w:rFonts w:ascii="Calibri" w:cs="Calibri" w:eastAsia="Calibri" w:hAnsi="Calibri"/>
+                <w:b w:val="false"/>
+                <w:bCs w:val="false"/>
+                <w:color w:val="000000"/>
+                <w:sz w:val="20"/>
+                <w:szCs w:val="20"/>
+              </w:rPr>
+              <w:t xml:space="preserve">RD6 - Six-Monthly Progress Review</w:t>
+            </w:r>
+          </w:p>
+        </w:tc>
+      </w:tr>
+      <w:tr>
+        <w:trPr>
+          <w:cantSplit/>
+        </w:trPr>
+        <w:tc>
+          <w:tcPr>
+            <w:tcW w:type="dxa" w:w="2600"/>
+            <w:tcBorders>
+              <w:top w:val="single" w:color="D5DCE4" w:sz="4"/>
+              <w:left w:val="single" w:color="D5DCE4" w:sz="4"/>
+              <w:bottom w:val="single" w:color="D5DCE4" w:sz="4"/>
+              <w:right w:val="single" w:color="D5DCE4" w:sz="4"/>
+            </w:tcBorders>
+            <w:shd w:fill="EEF3F7" w:color="auto" w:val="clear"/>
+            <w:tcMar>
+              <w:top w:type="dxa" w:w="60"/>
+              <w:left w:type="dxa" w:w="100"/>
+              <w:bottom w:type="dxa" w:w="60"/>
+              <w:right w:type="dxa" w:w="100"/>
+            </w:tcMar>
+            <w:vAlign w:val="center"/>
+          </w:tcPr>
+          <w:p>
+            <w:pPr>
+              <w:spacing w:after="40" w:line="260"/>
+            </w:pPr>
+            <w:r>
+              <w:rPr>
+                <w:rFonts w:ascii="Calibri" w:cs="Calibri" w:eastAsia="Calibri" w:hAnsi="Calibri"/>
+                <w:b w:val="false"/>
+                <w:bCs w:val="false"/>
+                <w:color w:val="000000"/>
+                <w:sz w:val="20"/>
+                <w:szCs w:val="20"/>
+              </w:rPr>
               <w:t xml:space="preserve">Status of results in this report</w:t>
             </w:r>
           </w:p>
@@ -700,6 +774,7 @@
               <w:bottom w:val="single" w:color="D5DCE4" w:sz="4"/>
               <w:right w:val="single" w:color="D5DCE4" w:sz="4"/>
             </w:tcBorders>
+            <w:shd w:fill="EEF3F7" w:color="auto" w:val="clear"/>
             <w:tcMar>
               <w:top w:type="dxa" w:w="60"/>
               <w:left w:type="dxa" w:w="100"/>
@@ -779,7 +854,7 @@
           <w:sz w:val="22"/>
           <w:szCs w:val="22"/>
         </w:rPr>
-        <w:t xml:space="preserve">Published sepsis prediction models report excellent discrimination on their own data and fail where it matters. The winning entry of the PhysioNet 2019 Challenge scored a normalised utility of 0.36 on the two hospitals it trained on and -0.12 on a hidden third hospital, worse than never alarming (Reyna et al., 2020). The Epic Sepsis Model, deployed in hundreds of US hospitals, achieved an AUROC of 0.63 in independent validation against a vendor claim of 0.76 to 0.83, missing 67 per cent of sepsis patients while alerting on 18 per cent of all admissions (Wong et al., 2021). Three causes recur: information from the future leaks into training; models are scored by ranking rather than by whether an alarm would help; and every study defines sepsis its own way.</w:t>
+        <w:t xml:space="preserve">Published sepsis prediction models report excellent discrimination on their own data and fail where it matters. The winning entry of the PhysioNet 2019 Challenge scored a normalised utility of 0.43 on new patients from the two hospitals it trained on and -0.12 on a hidden third hospital, worse than never alarming (overall official score 0.36; Reyna et al., 2020; Morrill et al., 2020). The Epic Sepsis Model, deployed in hundreds of US hospitals, achieved an AUROC of 0.63 in independent validation against a vendor claim of 0.76 to 0.83, missing 67 per cent of sepsis patients while alerting on 18 per cent of all admissions (Wong et al., 2021). Three causes recur: information from the future leaks into training; models are scored by ranking rather than by whether an alarm would help; and every study defines sepsis its own way.</w:t>
       </w:r>
     </w:p>
     <w:p>
@@ -798,7 +873,7 @@
           <w:sz w:val="22"/>
           <w:szCs w:val="22"/>
         </w:rPr>
-        <w:t xml:space="preserve">This reporting period therefore re-oriented the programme. An audit of the candidate's own earlier pipeline found look-ahead leakage; those models were retired and their results are no longer reported. The work moved from the challenge's prepared tables to two raw ICU databases, MIMIC-IV 3.1 and eICU-CRD 2.0, with one shared Sepsis-3 definition, strict hour-by-hour causality, a clinician-defined predictor set, and evaluation by clinical utility with a sealed holdout. The research design became mixed-methods: the quantitative modelling now under way, a qualitative study with the ICU clinicians who would receive the alarm, and, as the future direction, a prospective test on hospital patients.</w:t>
+        <w:t xml:space="preserve">This reporting period therefore re-oriented the programme. An audit of the candidate's own earlier pipeline found look-ahead leakage; those models were retired and their results are no longer reported. The work moved from the challenge's prepared tables to two raw ICU databases, MIMIC-IV 3.1 and eICU-CRD 2.0, with one shared Sepsis-3 definition, strict hour-by-hour causality, a clinician-defined predictor set, and evaluation by clinical utility with a sealed holdout. The research design became mixed-methods: the quantitative modelling now under way, a qualitative study with the healthcare professionals who would receive the alert (now nearly complete), and, as the future direction, a prospective test on hospital patients.</w:t>
       </w:r>
     </w:p>
     <w:p>
@@ -975,7 +1050,7 @@
           <w:sz w:val="22"/>
           <w:szCs w:val="22"/>
         </w:rPr>
-        <w:t xml:space="preserve">Conduct a qualitative study with ICU doctors, nurses and pharmacists on whether they would act on the alarm, what explanation they need, and what false-alarm rate they would accept.</w:t>
+        <w:t xml:space="preserve">Conduct a qualitative study with healthcare professionals on whether they would trust and act on the alert, what explanation they need, and what false-alarm rate they would accept (in progress).</w:t>
       </w:r>
     </w:p>
     <w:p>
@@ -1416,7 +1491,7 @@
                 <w:sz w:val="20"/>
                 <w:szCs w:val="20"/>
               </w:rPr>
-              <w:t xml:space="preserve">Phase 2 - Qualitative (planned, 2027)</w:t>
+              <w:t xml:space="preserve">Phase 2 - Qualitative (in progress, nearly complete)</w:t>
             </w:r>
           </w:p>
         </w:tc>
@@ -1451,7 +1526,7 @@
                 <w:sz w:val="20"/>
                 <w:szCs w:val="20"/>
               </w:rPr>
-              <w:t xml:space="preserve">Semi-structured interviews with patient vignettes and a survey built on the model's own alarms, with ICU doctors, nurses and pharmacists; thematic analysis; ethics approval to be sought.</w:t>
+              <w:t xml:space="preserve">Study with healthcare professionals on trust in and use of an AI sepsis alert: whether they would act on it, the explanation they need and the alarm burden they accept.</w:t>
             </w:r>
           </w:p>
         </w:tc>
@@ -4855,7 +4930,7 @@
                 <w:sz w:val="20"/>
                 <w:szCs w:val="20"/>
               </w:rPr>
-              <w:t xml:space="preserve">PhysioNet 2019 winner: 0.36 on its training hospitals, -0.12 on the hidden hospital; our causal OSTA on PhysioNet: 0.22</w:t>
+              <w:t xml:space="preserve">PhysioNet 2019 winner: 0.43 on new patients from its training hospitals, -0.12 on the hidden hospital; our causal OSTA on PhysioNet: 0.22</w:t>
             </w:r>
           </w:p>
         </w:tc>
@@ -5609,7 +5684,7 @@
                 <w:sz w:val="20"/>
                 <w:szCs w:val="20"/>
               </w:rPr>
-              <w:t xml:space="preserve">Now the qualitative phase of a mixed-methods design (Feb-Apr 2027)</w:t>
+              <w:t xml:space="preserve">Now the qualitative phase of a mixed-methods design; in progress and nearly complete</w:t>
             </w:r>
           </w:p>
         </w:tc>
@@ -5643,7 +5718,7 @@
                 <w:sz w:val="20"/>
                 <w:szCs w:val="20"/>
               </w:rPr>
-              <w:t xml:space="preserve">sequenced after the full-cohort results so that the alarms shown to clinicians are real</w:t>
+              <w:t xml:space="preserve">its findings set the alarm policy before the holdout is opened</w:t>
             </w:r>
           </w:p>
         </w:tc>
@@ -7416,7 +7491,7 @@
           <w:sz w:val="22"/>
           <w:szCs w:val="22"/>
         </w:rPr>
-        <w:t xml:space="preserve">Skills developed this period: large-scale extraction from raw ICU databases (DuckDB over multi-gigabyte tables; item dictionaries and unit audits), the ricu and YAIB benchmark tooling, causal and availability-aware feature design, utility-based evaluation and the official PhysioNet scorer, prespecified analysis protocols with sealed holdouts, reproducible notebook engineering with automated checks, and GPU training on cloud runtimes. The candidate also led the clinical specification of the predictor set, the antibiotic classification rule and the proxy analysis, which is where a pharmacist's training directly shaped the method.</w:t>
+        <w:t xml:space="preserve">Skills developed this period: large-scale extraction from raw ICU databases (DuckDB over multi-gigabyte tables; item dictionaries and unit audits), the ricu and YAIB benchmark tooling, causal and availability-aware feature design, utility-based evaluation and the official PhysioNet scorer, prespecified analysis protocols with sealed holdouts, reproducible notebook engineering with automated checks, and GPU training on cloud runtimes. The candidate also led the clinical specification of the predictor set, the antibiotic classification rule and the proxy analysis, where the candidate's clinical training directly shaped the method.</w:t>
       </w:r>
     </w:p>
     <w:p>
@@ -7919,7 +7994,7 @@
                 <w:sz w:val="20"/>
                 <w:szCs w:val="20"/>
               </w:rPr>
-              <w:t xml:space="preserve">Feb - Apr 2027</w:t>
+              <w:t xml:space="preserve">Nov - Dec 2026</w:t>
             </w:r>
           </w:p>
         </w:tc>
@@ -7954,7 +8029,7 @@
                 <w:sz w:val="20"/>
                 <w:szCs w:val="20"/>
               </w:rPr>
-              <w:t xml:space="preserve">Qualitative study: ethics application, interviews with vignettes and a survey using the model's own alarms, with ICU doctors, nurses and pharmacists; thematic analysis</w:t>
+              <w:t xml:space="preserve">Complete the qualitative study with healthcare professionals and its analysis</w:t>
             </w:r>
           </w:p>
         </w:tc>
@@ -7989,7 +8064,7 @@
                 <w:sz w:val="20"/>
                 <w:szCs w:val="20"/>
               </w:rPr>
-              <w:t xml:space="preserve">ethics approval; interview guide and survey; findings on trust, explanation and alarm burden</w:t>
+              <w:t xml:space="preserve">findings on trust, explanation and alarm burden; input to the alarm policy</w:t>
             </w:r>
           </w:p>
         </w:tc>
@@ -8357,7 +8432,7 @@
           <w:sz w:val="22"/>
           <w:szCs w:val="22"/>
         </w:rPr>
-        <w:t xml:space="preserve">Ethics lead time for the qualitative study and the prospective phase. </w:t>
+        <w:t xml:space="preserve">Ethics lead time for the prospective phase. </w:t>
       </w:r>
       <w:r>
         <w:rPr>
@@ -8370,7 +8445,7 @@
           <w:sz w:val="22"/>
           <w:szCs w:val="22"/>
         </w:rPr>
-        <w:t xml:space="preserve">Mitigation: start the ethics application in January 2027 and secure a clinical partner during the qualitative phase.</w:t>
+        <w:t xml:space="preserve">Mitigation: start the ethics and data-governance applications in early 2027 and build on contacts made during the qualitative study to secure a clinical partner.</w:t>
       </w:r>
     </w:p>
     <w:p>

</xml_diff>

<commit_message>
Add second supervisor and qualitative-study details to deck and RD6 report
Second supervisor Dr Kia Dashtipour; the qualitative phase is described as
online interviews and round-table discussions with 20 infectious disease and
critical care consultants from different hospitals.

Co-Authored-By: Claude Opus 5.5 <noreply@anthropic.com>
Claude-Session: https://claude.ai/code/session_01LgDqxV9dzSvE8XpquGaBd5
</commit_message>
<xml_diff>
--- a/dev/presentation/RD6_Progress_Report_Elrggal_Oct2026.docx
+++ b/dev/presentation/RD6_Progress_Report_Elrggal_Oct2026.docx
@@ -425,7 +425,7 @@
                 <w:sz w:val="20"/>
                 <w:szCs w:val="20"/>
               </w:rPr>
-              <w:t xml:space="preserve">Kia</w:t>
+              <w:t xml:space="preserve">Dr Kia Dashtipour</w:t>
             </w:r>
           </w:p>
         </w:tc>
@@ -1050,7 +1050,7 @@
           <w:sz w:val="22"/>
           <w:szCs w:val="22"/>
         </w:rPr>
-        <w:t xml:space="preserve">Conduct a qualitative study with healthcare professionals on whether they would trust and act on the alert, what explanation they need, and what false-alarm rate they would accept (in progress).</w:t>
+        <w:t xml:space="preserve">Conduct a qualitative study (online interviews and round-table discussions with 20 infectious disease and critical care consultants from different hospitals) on whether they would trust and act on the alert, what explanation they need, and what false-alarm rate they would accept (in progress, nearly complete).</w:t>
       </w:r>
     </w:p>
     <w:p>
@@ -1526,7 +1526,7 @@
                 <w:sz w:val="20"/>
                 <w:szCs w:val="20"/>
               </w:rPr>
-              <w:t xml:space="preserve">Study with healthcare professionals on trust in and use of an AI sepsis alert: whether they would act on it, the explanation they need and the alarm burden they accept.</w:t>
+              <w:t xml:space="preserve">Online semi-structured interviews and round-table discussions with 20 infectious disease and critical care consultants from different hospitals on trust in and use of an AI sepsis alert: whether they would act on it, the explanation they need and the alarm burden they accept.</w:t>
             </w:r>
           </w:p>
         </w:tc>
@@ -8029,7 +8029,7 @@
                 <w:sz w:val="20"/>
                 <w:szCs w:val="20"/>
               </w:rPr>
-              <w:t xml:space="preserve">Complete the qualitative study with healthcare professionals and its analysis</w:t>
+              <w:t xml:space="preserve">Complete the qualitative study (20 consultants) and its thematic analysis</w:t>
             </w:r>
           </w:p>
         </w:tc>

</xml_diff>

<commit_message>
Presentation and RD6 report: completed MIMIC-IV development comparison results
Slide 13 and the overfitting backup now show the 21-model comparison
(all utilities above zero, OSTA 0.23, winner's method 0.15, GRU-D chosen
on validation 0.19). RD6 sections 4.4-4.5 and the conclusion carry the
same results, the prespecified decisions and the eICU transfer finding.

Co-Authored-By: Claude Opus 5.5 <noreply@anthropic.com>
Claude-Session: https://claude.ai/code/session_01LgDqxV9dzSvE8XpquGaBd5
</commit_message>
<xml_diff>
--- a/dev/presentation/RD6_Progress_Report_Elrggal_Oct2026.docx
+++ b/dev/presentation/RD6_Progress_Report_Elrggal_Oct2026.docx
@@ -4322,7 +4322,7 @@
           <w:sz w:val="22"/>
           <w:szCs w:val="22"/>
         </w:rPr>
-        <w:t xml:space="preserve">The following are preliminary results on the development test split of the 10,000-stay samples (one to three seeds). The sealed holdout has not been opened and nothing has been tuned on test data. Full results will appear in the manuscript in preparation.</w:t>
+        <w:t xml:space="preserve">The following are preliminary results from the prespecified comparison on the MIMIC-IV development test split of the 10,000-stay sample (one run). Every model was scored on identical hours with the official PhysioNet utility scorer. The sealed holdout has not been opened and nothing was tuned on test data. Full results will appear in the manuscript in preparation.</w:t>
       </w:r>
     </w:p>
     <w:tbl>
@@ -4526,7 +4526,7 @@
                 <w:sz w:val="20"/>
                 <w:szCs w:val="20"/>
               </w:rPr>
-              <w:t xml:space="preserve">Hourly AUROC</w:t>
+              <w:t xml:space="preserve">Models compared</w:t>
             </w:r>
           </w:p>
         </w:tc>
@@ -4561,7 +4561,7 @@
                 <w:sz w:val="20"/>
                 <w:szCs w:val="20"/>
               </w:rPr>
-              <w:t xml:space="preserve">0.81 (three seeds, SD 0.012) for OSTA and the CNN-Transformer; 0.80 output fusion; 0.78 logistic regression; 0.76 boosted trees</w:t>
+              <w:t xml:space="preserve">21: sixteen architectures, loss comparators (cross-entropy and time-to-onset weighted) and a mean ensemble</w:t>
             </w:r>
           </w:p>
         </w:tc>
@@ -4600,7 +4600,7 @@
                 <w:sz w:val="20"/>
                 <w:szCs w:val="20"/>
               </w:rPr>
-              <w:t xml:space="preserve">Hourly AUPRC</w:t>
+              <w:t xml:space="preserve">Normalised utility</w:t>
             </w:r>
           </w:p>
         </w:tc>
@@ -4634,7 +4634,7 @@
                 <w:sz w:val="20"/>
                 <w:szCs w:val="20"/>
               </w:rPr>
-              <w:t xml:space="preserve">0.03 to 0.04 at 0.65 % prevalence (chance 0.0065)</w:t>
+              <w:t xml:space="preserve">all 21 models above zero, every 95 % CI above zero; range 0.08 to 0.29</w:t>
             </w:r>
           </w:p>
         </w:tc>
@@ -4674,7 +4674,7 @@
                 <w:sz w:val="20"/>
                 <w:szCs w:val="20"/>
               </w:rPr>
-              <w:t xml:space="preserve">Sensitivity at 0.5 false alarms per patient-day</w:t>
+              <w:t xml:space="preserve">OSTA-Transformer</w:t>
             </w:r>
           </w:p>
         </w:tc>
@@ -4709,7 +4709,7 @@
                 <w:sz w:val="20"/>
                 <w:szCs w:val="20"/>
               </w:rPr>
-              <w:t xml:space="preserve">about one sepsis event in two</w:t>
+              <w:t xml:space="preserve">0.23 (95 % CI 0.13 to 0.34)</w:t>
             </w:r>
           </w:p>
         </w:tc>
@@ -4748,7 +4748,7 @@
                 <w:sz w:val="20"/>
                 <w:szCs w:val="20"/>
               </w:rPr>
-              <w:t xml:space="preserve">Median warning before onset</w:t>
+              <w:t xml:space="preserve">Winner's method rebuilt in this pipeline</w:t>
             </w:r>
           </w:p>
         </w:tc>
@@ -4782,7 +4782,7 @@
                 <w:sz w:val="20"/>
                 <w:szCs w:val="20"/>
               </w:rPr>
-              <w:t xml:space="preserve">5 hours</w:t>
+              <w:t xml:space="preserve">0.15 (95 % CI 0.06 to 0.22)</w:t>
             </w:r>
           </w:p>
         </w:tc>
@@ -4822,7 +4822,7 @@
                 <w:sz w:val="20"/>
                 <w:szCs w:val="20"/>
               </w:rPr>
-              <w:t xml:space="preserve">Normalised utility</w:t>
+              <w:t xml:space="preserve">Highest point estimates</w:t>
             </w:r>
           </w:p>
         </w:tc>
@@ -4857,7 +4857,7 @@
                 <w:sz w:val="20"/>
                 <w:szCs w:val="20"/>
               </w:rPr>
-              <w:t xml:space="preserve">best model 0.18 (95 % CI 0.08 to 0.27); OSTA 0.12</w:t>
+              <w:t xml:space="preserve">self-supervised CNN encoder with OSTA head 0.29 (0.17 to 0.39); CNN with OSTA head 0.28; mean ensemble 0.28</w:t>
             </w:r>
           </w:p>
         </w:tc>
@@ -4896,6 +4896,228 @@
                 <w:sz w:val="20"/>
                 <w:szCs w:val="20"/>
               </w:rPr>
+              <w:t xml:space="preserve">Model chosen by the validation rule</w:t>
+            </w:r>
+          </w:p>
+        </w:tc>
+        <w:tc>
+          <w:tcPr>
+            <w:tcW w:type="dxa" w:w="5800"/>
+            <w:tcBorders>
+              <w:top w:val="single" w:color="D5DCE4" w:sz="4"/>
+              <w:left w:val="single" w:color="D5DCE4" w:sz="4"/>
+              <w:bottom w:val="single" w:color="D5DCE4" w:sz="4"/>
+              <w:right w:val="single" w:color="D5DCE4" w:sz="4"/>
+            </w:tcBorders>
+            <w:tcMar>
+              <w:top w:type="dxa" w:w="60"/>
+              <w:left w:type="dxa" w:w="100"/>
+              <w:bottom w:type="dxa" w:w="60"/>
+              <w:right w:type="dxa" w:w="100"/>
+            </w:tcMar>
+            <w:vAlign w:val="center"/>
+          </w:tcPr>
+          <w:p>
+            <w:pPr>
+              <w:spacing w:after="40" w:line="260"/>
+            </w:pPr>
+            <w:r>
+              <w:rPr>
+                <w:rFonts w:ascii="Calibri" w:cs="Calibri" w:eastAsia="Calibri" w:hAnsi="Calibri"/>
+                <w:b w:val="false"/>
+                <w:bCs w:val="false"/>
+                <w:color w:val="000000"/>
+                <w:sz w:val="20"/>
+                <w:szCs w:val="20"/>
+              </w:rPr>
+              <w:t xml:space="preserve">GRU-D, 0.19 (0.08 to 0.29)</w:t>
+            </w:r>
+          </w:p>
+        </w:tc>
+      </w:tr>
+      <w:tr>
+        <w:trPr>
+          <w:cantSplit/>
+        </w:trPr>
+        <w:tc>
+          <w:tcPr>
+            <w:tcW w:type="dxa" w:w="3200"/>
+            <w:tcBorders>
+              <w:top w:val="single" w:color="D5DCE4" w:sz="4"/>
+              <w:left w:val="single" w:color="D5DCE4" w:sz="4"/>
+              <w:bottom w:val="single" w:color="D5DCE4" w:sz="4"/>
+              <w:right w:val="single" w:color="D5DCE4" w:sz="4"/>
+            </w:tcBorders>
+            <w:shd w:fill="EEF3F7" w:color="auto" w:val="clear"/>
+            <w:tcMar>
+              <w:top w:type="dxa" w:w="60"/>
+              <w:left w:type="dxa" w:w="100"/>
+              <w:bottom w:type="dxa" w:w="60"/>
+              <w:right w:type="dxa" w:w="100"/>
+            </w:tcMar>
+            <w:vAlign w:val="center"/>
+          </w:tcPr>
+          <w:p>
+            <w:pPr>
+              <w:spacing w:after="40" w:line="260"/>
+            </w:pPr>
+            <w:r>
+              <w:rPr>
+                <w:rFonts w:ascii="Calibri" w:cs="Calibri" w:eastAsia="Calibri" w:hAnsi="Calibri"/>
+                <w:b w:val="false"/>
+                <w:bCs w:val="false"/>
+                <w:color w:val="000000"/>
+                <w:sz w:val="20"/>
+                <w:szCs w:val="20"/>
+              </w:rPr>
+              <w:t xml:space="preserve">Logistic regression</w:t>
+            </w:r>
+          </w:p>
+        </w:tc>
+        <w:tc>
+          <w:tcPr>
+            <w:tcW w:type="dxa" w:w="5800"/>
+            <w:tcBorders>
+              <w:top w:val="single" w:color="D5DCE4" w:sz="4"/>
+              <w:left w:val="single" w:color="D5DCE4" w:sz="4"/>
+              <w:bottom w:val="single" w:color="D5DCE4" w:sz="4"/>
+              <w:right w:val="single" w:color="D5DCE4" w:sz="4"/>
+            </w:tcBorders>
+            <w:shd w:fill="EEF3F7" w:color="auto" w:val="clear"/>
+            <w:tcMar>
+              <w:top w:type="dxa" w:w="60"/>
+              <w:left w:type="dxa" w:w="100"/>
+              <w:bottom w:type="dxa" w:w="60"/>
+              <w:right w:type="dxa" w:w="100"/>
+            </w:tcMar>
+            <w:vAlign w:val="center"/>
+          </w:tcPr>
+          <w:p>
+            <w:pPr>
+              <w:spacing w:after="40" w:line="260"/>
+            </w:pPr>
+            <w:r>
+              <w:rPr>
+                <w:rFonts w:ascii="Calibri" w:cs="Calibri" w:eastAsia="Calibri" w:hAnsi="Calibri"/>
+                <w:b w:val="false"/>
+                <w:bCs w:val="false"/>
+                <w:color w:val="000000"/>
+                <w:sz w:val="20"/>
+                <w:szCs w:val="20"/>
+              </w:rPr>
+              <w:t xml:space="preserve">0.08 (0.01 to 0.16)</w:t>
+            </w:r>
+          </w:p>
+        </w:tc>
+      </w:tr>
+      <w:tr>
+        <w:trPr>
+          <w:cantSplit/>
+        </w:trPr>
+        <w:tc>
+          <w:tcPr>
+            <w:tcW w:type="dxa" w:w="3200"/>
+            <w:tcBorders>
+              <w:top w:val="single" w:color="D5DCE4" w:sz="4"/>
+              <w:left w:val="single" w:color="D5DCE4" w:sz="4"/>
+              <w:bottom w:val="single" w:color="D5DCE4" w:sz="4"/>
+              <w:right w:val="single" w:color="D5DCE4" w:sz="4"/>
+            </w:tcBorders>
+            <w:tcMar>
+              <w:top w:type="dxa" w:w="60"/>
+              <w:left w:type="dxa" w:w="100"/>
+              <w:bottom w:type="dxa" w:w="60"/>
+              <w:right w:type="dxa" w:w="100"/>
+            </w:tcMar>
+            <w:vAlign w:val="center"/>
+          </w:tcPr>
+          <w:p>
+            <w:pPr>
+              <w:spacing w:after="40" w:line="260"/>
+            </w:pPr>
+            <w:r>
+              <w:rPr>
+                <w:rFonts w:ascii="Calibri" w:cs="Calibri" w:eastAsia="Calibri" w:hAnsi="Calibri"/>
+                <w:b w:val="false"/>
+                <w:bCs w:val="false"/>
+                <w:color w:val="000000"/>
+                <w:sz w:val="20"/>
+                <w:szCs w:val="20"/>
+              </w:rPr>
+              <w:t xml:space="preserve">Hourly AUROC</w:t>
+            </w:r>
+          </w:p>
+        </w:tc>
+        <w:tc>
+          <w:tcPr>
+            <w:tcW w:type="dxa" w:w="5800"/>
+            <w:tcBorders>
+              <w:top w:val="single" w:color="D5DCE4" w:sz="4"/>
+              <w:left w:val="single" w:color="D5DCE4" w:sz="4"/>
+              <w:bottom w:val="single" w:color="D5DCE4" w:sz="4"/>
+              <w:right w:val="single" w:color="D5DCE4" w:sz="4"/>
+            </w:tcBorders>
+            <w:tcMar>
+              <w:top w:type="dxa" w:w="60"/>
+              <w:left w:type="dxa" w:w="100"/>
+              <w:bottom w:type="dxa" w:w="60"/>
+              <w:right w:type="dxa" w:w="100"/>
+            </w:tcMar>
+            <w:vAlign w:val="center"/>
+          </w:tcPr>
+          <w:p>
+            <w:pPr>
+              <w:spacing w:after="40" w:line="260"/>
+            </w:pPr>
+            <w:r>
+              <w:rPr>
+                <w:rFonts w:ascii="Calibri" w:cs="Calibri" w:eastAsia="Calibri" w:hAnsi="Calibri"/>
+                <w:b w:val="false"/>
+                <w:bCs w:val="false"/>
+                <w:color w:val="000000"/>
+                <w:sz w:val="20"/>
+                <w:szCs w:val="20"/>
+              </w:rPr>
+              <w:t xml:space="preserve">0.72 to 0.84 across models</w:t>
+            </w:r>
+          </w:p>
+        </w:tc>
+      </w:tr>
+      <w:tr>
+        <w:trPr>
+          <w:cantSplit/>
+        </w:trPr>
+        <w:tc>
+          <w:tcPr>
+            <w:tcW w:type="dxa" w:w="3200"/>
+            <w:tcBorders>
+              <w:top w:val="single" w:color="D5DCE4" w:sz="4"/>
+              <w:left w:val="single" w:color="D5DCE4" w:sz="4"/>
+              <w:bottom w:val="single" w:color="D5DCE4" w:sz="4"/>
+              <w:right w:val="single" w:color="D5DCE4" w:sz="4"/>
+            </w:tcBorders>
+            <w:shd w:fill="EEF3F7" w:color="auto" w:val="clear"/>
+            <w:tcMar>
+              <w:top w:type="dxa" w:w="60"/>
+              <w:left w:type="dxa" w:w="100"/>
+              <w:bottom w:type="dxa" w:w="60"/>
+              <w:right w:type="dxa" w:w="100"/>
+            </w:tcMar>
+            <w:vAlign w:val="center"/>
+          </w:tcPr>
+          <w:p>
+            <w:pPr>
+              <w:spacing w:after="40" w:line="260"/>
+            </w:pPr>
+            <w:r>
+              <w:rPr>
+                <w:rFonts w:ascii="Calibri" w:cs="Calibri" w:eastAsia="Calibri" w:hAnsi="Calibri"/>
+                <w:b w:val="false"/>
+                <w:bCs w:val="false"/>
+                <w:color w:val="000000"/>
+                <w:sz w:val="20"/>
+                <w:szCs w:val="20"/>
+              </w:rPr>
               <w:t xml:space="preserve">Reference points</w:t>
             </w:r>
           </w:p>
@@ -4909,6 +5131,7 @@
               <w:bottom w:val="single" w:color="D5DCE4" w:sz="4"/>
               <w:right w:val="single" w:color="D5DCE4" w:sz="4"/>
             </w:tcBorders>
+            <w:shd w:fill="EEF3F7" w:color="auto" w:val="clear"/>
             <w:tcMar>
               <w:top w:type="dxa" w:w="60"/>
               <w:left w:type="dxa" w:w="100"/>
@@ -4957,7 +5180,7 @@
           <w:sz w:val="22"/>
           <w:szCs w:val="22"/>
         </w:rPr>
-        <w:t xml:space="preserve">The utility on MIMIC-IV is modest but clearly positive on a database built from raw tables with every hour scored causally, whereas the best competition entry fell below zero as soon as it left its training hospitals. On eICU the development-split AUROC is 0.67 to 0.69 and the utility is not yet distinguishable from zero; eICU has the weaker antibiotic-only label and, before the audit, the poorest coverage, and it is the focus of the full-cohort, leave-hospital-out and label-harmonisation work planned below. The candidate's replication of the winner's own method on both databases is in progress.</w:t>
+        <w:t xml:space="preserve">On a database built from raw tables with every hour scored causally, every model keeps a positive utility, including the competition winner's own method, whereas the published winner fell below zero as soon as it left its training hospitals. The architectures differ more in point estimate than their overlapping intervals can support at this sample size. Transfer is the open problem: MIMIC-IV models scored on eICU development patients give utilities of -0.03 to 0.04 with intervals that include zero (hourly AUROC 0.58 to 0.68). eICU has the weaker antibiotic-only label and is the focus of the native eICU results (running at the time of writing), the full cohort, leave-hospital-out evaluation and label harmonisation.</w:t>
       </w:r>
     </w:p>
     <w:p>
@@ -4969,7 +5192,7 @@
         <w:rPr>
           <w:rFonts w:ascii="Calibri" w:cs="Calibri" w:eastAsia="Calibri" w:hAnsi="Calibri"/>
         </w:rPr>
-        <w:t xml:space="preserve">4.5 Overfitting and the architecture comparison</w:t>
+        <w:t xml:space="preserve">4.5 Overfitting and the prespecified decisions</w:t>
       </w:r>
     </w:p>
     <w:p>
@@ -4988,7 +5211,7 @@
           <w:sz w:val="22"/>
           <w:szCs w:val="22"/>
         </w:rPr>
-        <w:t xml:space="preserve">Training records show that every rich-feature neural model reaches its best validation score within one to three epochs while the training loss keeps falling: a training split contains about 175 septic stays, too few for 300 to 650 predictors. The AUROCs of OSTA, the CNN-Transformer, output fusion and the gated variants differ by less than the seed-to-seed noise, and OSTA with and without attention gates gives identical results because the chosen checkpoint is the first epoch either way. The conclusion is that on this sample size nothing separates the architectures, and that the next lever is data: the full cohort (about nine times more sepsis cases), self-supervised pretraining on unlabelled stays, and a training loss chosen by utility.</w:t>
+        <w:t xml:space="preserve">Training records show that every rich-feature neural model reaches its best validation score within one to three epochs while the training loss keeps falling: a training split contains about 175 septic stays, too few for 300 to 650 predictors. The validation split is also too small to rank models reliably: OSTA and OSTA without organ grouping tie on test (0.23 each) but score 0.12 and 0.28 on validation, and the validation leaders (GRU-D 0.29, TCN 0.29) are mid-table on test.</w:t>
       </w:r>
     </w:p>
     <w:p>
@@ -5007,7 +5230,7 @@
           <w:sz w:val="22"/>
           <w:szCs w:val="22"/>
         </w:rPr>
-        <w:t xml:space="preserve">The prespecified comparison of sixteen models, three losses and the organ-structure ablation, with self-supervised pretraining and the winner's method, is running at the time of writing; its shortlist, chosen by the validation rule, goes to the full-cohort run.</w:t>
+        <w:t xml:space="preserve">The decision rules fixed before any result were applied on validation only. Organ structure is not supported at this sample size: OSTA did not beat its flat counterpart on validation, and this is reported as found. The loss comparison is undecided (cross-entropy ranked first for OSTA, the utility-weighted loss for the self-supervised model, the time-to-onset loss last for both). The shortlist for the full cohort is GRU-D, the temporal CNN and flat OSTA, plus the baselines and the winner's method; any further model added to it will be declared as a deviation. The next lever is data: the full cohort has about nine times more sepsis cases and runs with three seeds.</w:t>
       </w:r>
     </w:p>
     <w:p>
@@ -8409,7 +8632,7 @@
           <w:sz w:val="22"/>
           <w:szCs w:val="22"/>
         </w:rPr>
-        <w:t xml:space="preserve">Mitigation: scale, self-supervised pretraining, three seeds, and a shortlist chosen on validation rather than test.</w:t>
+        <w:t xml:space="preserve">Mitigation: scale, self-supervised pretraining, three seeds, and a shortlist chosen on validation rather than test; the full cohort also gives a validation split large enough to rank models.</w:t>
       </w:r>
     </w:p>
     <w:p>
@@ -8476,7 +8699,7 @@
           <w:sz w:val="22"/>
           <w:szCs w:val="22"/>
         </w:rPr>
-        <w:t xml:space="preserve">The period turned a set of promising but leaky results into an honest, transferable research programme. The candidate audited and retired the earlier models, built a causal pipeline across two raw ICU databases with one shared definition of sepsis and a clinician-defined predictor set, moved evaluation to clinical utility with a sealed holdout, and produced preliminary evidence that a causally scored warning keeps positive utility on MIMIC-IV where the best published competition entry collapsed on an unseen hospital. Three manuscripts were submitted. The next period scales the evaluation to the full cohort, opens the holdout once, brings in the clinicians who would receive the alarm, and prepares the prospective test on hospital patients that the whole programme points towards.</w:t>
+        <w:t xml:space="preserve">The period turned a set of promising but leaky results into an honest, transferable research programme. The candidate audited and retired the earlier models, built a causal pipeline across two raw ICU databases with one shared definition of sepsis and a clinician-defined predictor set, moved evaluation to clinical utility with a sealed holdout, and produced preliminary evidence that, on identical MIMIC-IV hours, all 21 models compared, including the competition winner's own method, keep a positive utility, while transfer to a second hospital system remains the open problem. Three manuscripts were submitted. The next period scales the evaluation to the full cohort, opens the holdout once, brings in the clinicians who would receive the alarm, and prepares the prospective test on hospital patients that the whole programme points towards.</w:t>
       </w:r>
     </w:p>
     <w:sectPr>

</xml_diff>

<commit_message>
Deck and RD6: how the models evolved, why each was built, and how they differ
New backup slide 20 traces the three stages (PhysioNet 2019 CNN-Transformer and
OSTA, the V10 observer-integration arms and controls, the V11 comparison) and the
finding that triggered each. RD6 gains section 4.6 with the narrative, Table 4
covering every model (including retired ones), and a reference list.

Co-Authored-By: Claude Opus 5.5 <noreply@anthropic.com>
Claude-Session: https://claude.ai/code/session_01LgDqxV9dzSvE8XpquGaBd5
</commit_message>
<xml_diff>
--- a/dev/presentation/RD6_Progress_Report_Elrggal_Oct2026.docx
+++ b/dev/presentation/RD6_Progress_Report_Elrggal_Oct2026.docx
@@ -5242,7 +5242,4101 @@
         <w:rPr>
           <w:rFonts w:ascii="Calibri" w:cs="Calibri" w:eastAsia="Calibri" w:hAnsi="Calibri"/>
         </w:rPr>
-        <w:t xml:space="preserve">4.6 Publications and dissemination</w:t>
+        <w:t xml:space="preserve">4.6 How the models evolved: why each was built and how they differ</w:t>
+      </w:r>
+    </w:p>
+    <w:p>
+      <w:pPr>
+        <w:spacing w:after="120" w:before="0" w:line="276"/>
+        <w:jc w:val="left"/>
+      </w:pPr>
+      <w:r>
+        <w:rPr>
+          <w:rFonts w:ascii="Calibri" w:cs="Calibri" w:eastAsia="Calibri" w:hAnsi="Calibri"/>
+          <w:b w:val="false"/>
+          <w:bCs w:val="false"/>
+          <w:i w:val="false"/>
+          <w:iCs w:val="false"/>
+          <w:color w:val="000000"/>
+          <w:sz w:val="22"/>
+          <w:szCs w:val="22"/>
+        </w:rPr>
+        <w:t xml:space="preserve">The models in this project were not chosen at once. They were built in three stages, and each stage was triggered by a finding from the one before. This section explains what led to each model, how it differs from its predecessors, and what became of it. Table 4 lists every model.</w:t>
+      </w:r>
+    </w:p>
+    <w:p>
+      <w:pPr>
+        <w:pStyle w:val="Heading3"/>
+        <w:spacing w:after="100" w:before="200"/>
+      </w:pPr>
+      <w:r>
+        <w:rPr>
+          <w:rFonts w:ascii="Calibri" w:cs="Calibri" w:eastAsia="Calibri" w:hAnsi="Calibri"/>
+        </w:rPr>
+        <w:t xml:space="preserve">Stage 1, earlier work on PhysioNet 2019: from a general architecture to an organ-structured one</w:t>
+      </w:r>
+    </w:p>
+    <w:p>
+      <w:pPr>
+        <w:spacing w:after="120" w:before="0" w:line="276"/>
+        <w:jc w:val="left"/>
+      </w:pPr>
+      <w:r>
+        <w:rPr>
+          <w:rFonts w:ascii="Calibri" w:cs="Calibri" w:eastAsia="Calibri" w:hAnsi="Calibri"/>
+          <w:b w:val="false"/>
+          <w:bCs w:val="false"/>
+          <w:i w:val="false"/>
+          <w:iCs w:val="false"/>
+          <w:color w:val="000000"/>
+          <w:sz w:val="22"/>
+          <w:szCs w:val="22"/>
+        </w:rPr>
+        <w:t xml:space="preserve">The first model was a CNN-Transformer: convolutional layers capture short local trends in the hourly vital signs and laboratory values, and transformer attention (Vaswani et al., 2017) links them across the whole stay. It treats every variable alike and offers no clinical explanation. The OSTA-Transformer was proposed to address that. Clinicians assess sepsis organ by organ, as the SOFA score does (Vincent et al., 1996), so OSTA groups the predictors by organ system, reads each organ over time with its own attention, lets the organs attend to each other, and outputs a sepsis risk together with a risk per organ that a clinician can read. It was trained with a purpose-built loss: focal loss for the rare positive hours (Lin et al., 2017), time weights that emphasise the hours nearest onset, and two organ terms that encourage the per-organ risks to agree with the overall risk and to stay diverse. The leakage audit (Section 4.1; Kapoor and Narayanan, 2023) then showed that both models had been trained with information from the future. Both were withdrawn, and OSTA was rebuilt causally, giving the honest PhysioNet baseline: hourly AUROC 0.80, patient AUROC 0.81 and normalised utility 0.22.</w:t>
+      </w:r>
+    </w:p>
+    <w:p>
+      <w:pPr>
+        <w:pStyle w:val="Heading3"/>
+        <w:spacing w:after="100" w:before="200"/>
+      </w:pPr>
+      <w:r>
+        <w:rPr>
+          <w:rFonts w:ascii="Calibri" w:cs="Calibri" w:eastAsia="Calibri" w:hAnsi="Calibri"/>
+        </w:rPr>
+        <w:t xml:space="preserve">Stage 2, V10 on MIMIC-IV and eICU: can independent organ evidence guide OSTA?</w:t>
+      </w:r>
+    </w:p>
+    <w:p>
+      <w:pPr>
+        <w:spacing w:after="120" w:before="0" w:line="276"/>
+        <w:jc w:val="left"/>
+      </w:pPr>
+      <w:r>
+        <w:rPr>
+          <w:rFonts w:ascii="Calibri" w:cs="Calibri" w:eastAsia="Calibri" w:hAnsi="Calibri"/>
+          <w:b w:val="false"/>
+          <w:bCs w:val="false"/>
+          <w:i w:val="false"/>
+          <w:iCs w:val="false"/>
+          <w:color w:val="000000"/>
+          <w:sz w:val="22"/>
+          <w:szCs w:val="22"/>
+        </w:rPr>
+        <w:t xml:space="preserve">Moving to the raw databases raised a design question. OSTA learns how much each organ matters only from the sepsis labels. A bank of small per-organ "observer" networks, each trained on a separate group of patients (the observer-fit split) to estimate risk from one organ's measurements, could act like specialty consultations and give OSTA independent evidence. Four ways of using that evidence were compared on identical hours, and the protocol stated in advance that none was to be assumed to win: observer features (the observers' outputs as extra inputs), output fusion (added to OSTA's output through a learned weight), gated attention guidance (the observers steer OSTA's cross-organ attention, with learned gates deciding when to trust them), and ungated guidance (the same steering always on, as a control for the gate). Two controls ran alongside: the same models on raw values only, to test whether feature engineering adds anything, and OSTA trained on the observers' patients as well, to test whether any gain from observers merely reflects extra labelled patients. When the purpose-built OSTA loss was found to have been replaced by plain cross-entropy in the new code, it was restored for fidelity and compared directly.</w:t>
+      </w:r>
+    </w:p>
+    <w:p>
+      <w:pPr>
+        <w:spacing w:after="120" w:before="0" w:line="276"/>
+        <w:jc w:val="left"/>
+      </w:pPr>
+      <w:r>
+        <w:rPr>
+          <w:rFonts w:ascii="Calibri" w:cs="Calibri" w:eastAsia="Calibri" w:hAnsi="Calibri"/>
+          <w:b w:val="false"/>
+          <w:bCs w:val="false"/>
+          <w:i w:val="false"/>
+          <w:iCs w:val="false"/>
+          <w:color w:val="000000"/>
+          <w:sz w:val="22"/>
+          <w:szCs w:val="22"/>
+        </w:rPr>
+        <w:t xml:space="preserve">The findings were consistent. No integration beat OSTA: over three seeds the gated minus OSTA AUPRC difference was +0.002 (95 % CI -0.001 to 0.005), and the ungated control was lower than the gated arm. Output fusion was the strongest of the family. Raw values matched engineered features on MIMIC-IV, extra labelled patients did not help, and the restored OSTA loss performed no better than cross-entropy. The training records explained why the variants could not separate: every rich-feature neural model reached its best validation score within one to three epochs, so the chosen checkpoint was close to the shared starting point. The sample, not the architecture, was the limit.</w:t>
+      </w:r>
+    </w:p>
+    <w:p>
+      <w:pPr>
+        <w:pStyle w:val="Heading3"/>
+        <w:spacing w:after="100" w:before="200"/>
+      </w:pPr>
+      <w:r>
+        <w:rPr>
+          <w:rFonts w:ascii="Calibri" w:cs="Calibri" w:eastAsia="Calibri" w:hAnsi="Calibri"/>
+        </w:rPr>
+        <w:t xml:space="preserve">Stage 3, V11: test the idea, learn from the literature, use scarce labels better</w:t>
+      </w:r>
+    </w:p>
+    <w:p>
+      <w:pPr>
+        <w:spacing w:after="120" w:before="0" w:line="276"/>
+        <w:jc w:val="left"/>
+      </w:pPr>
+      <w:r>
+        <w:rPr>
+          <w:rFonts w:ascii="Calibri" w:cs="Calibri" w:eastAsia="Calibri" w:hAnsi="Calibri"/>
+          <w:b w:val="false"/>
+          <w:bCs w:val="false"/>
+          <w:i w:val="false"/>
+          <w:iCs w:val="false"/>
+          <w:color w:val="000000"/>
+          <w:sz w:val="22"/>
+          <w:szCs w:val="22"/>
+        </w:rPr>
+        <w:t xml:space="preserve">Stage 3 was designed from those findings. First, the organ hypothesis is tested directly: flat OSTA is the same model with all predictors in one group, and organ structure is kept only if OSTA beats it on validation. Second, models built for irregular ICU data in the sepsis literature (Moor et al., 2021) were added on identical hours: GRU-D, which lets stale measurements decay towards normal (Che et al., 2018); a causal temporal convolutional network (Bai et al., 2018); and the PhysioNet 2019 winner's method, path signatures with boosted trees (Morrill et al., 2020). Third, because labelled sepsis cases are scarce, the self-supervised models first learn physiology from unlabelled stays by forecasting values and organ scores (Yèche et al., 2021), a per-channel encoder reads each signal with its own measurement pattern, event attention uses only fresh measurements (Horn et al., 2020), and a discrete-time hazard head uses when onset happens rather than only whether (Gensheimer and Narasimhan, 2019). Finally, the training loss was aligned with the clinical score: the utility-weighted loss weights each hour by what an alarm there is worth, compared against plain cross-entropy and temporal label smoothing (Yèche et al., 2023). The observer features, gated and ungated guidance, the extra-label control and the original OSTA loss were retired; output fusion, the CNN-Transformer, OSTA and the two baselines were kept. The preliminary outcome is in Sections 4.4 and 4.5: all 21 models have positive utility on MIMIC-IV, organ structure is not supported at this sample size, and the full cohort will rank the shortlisted models.</w:t>
+      </w:r>
+    </w:p>
+    <w:p>
+      <w:pPr>
+        <w:spacing w:after="80" w:before="0" w:line="276"/>
+        <w:jc w:val="left"/>
+      </w:pPr>
+      <w:r>
+        <w:rPr>
+          <w:rFonts w:ascii="Calibri" w:cs="Calibri" w:eastAsia="Calibri" w:hAnsi="Calibri"/>
+          <w:b/>
+          <w:bCs/>
+          <w:i w:val="false"/>
+          <w:iCs w:val="false"/>
+          <w:color w:val="000000"/>
+          <w:sz w:val="22"/>
+          <w:szCs w:val="22"/>
+        </w:rPr>
+        <w:t xml:space="preserve">Table 4. Every model in the project: what led to it, how it differs, and its status.</w:t>
+      </w:r>
+    </w:p>
+    <w:tbl>
+      <w:tblPr>
+        <w:tblW w:type="dxa" w:w="9000"/>
+        <w:tblBorders>
+          <w:top w:val="single" w:color="auto" w:sz="4"/>
+          <w:left w:val="single" w:color="auto" w:sz="4"/>
+          <w:bottom w:val="single" w:color="auto" w:sz="4"/>
+          <w:right w:val="single" w:color="auto" w:sz="4"/>
+          <w:insideH w:val="single" w:color="auto" w:sz="4"/>
+          <w:insideV w:val="single" w:color="auto" w:sz="4"/>
+        </w:tblBorders>
+        <w:tblLayout w:type="fixed"/>
+      </w:tblPr>
+      <w:tblGrid>
+        <w:gridCol w:w="1750"/>
+        <w:gridCol w:w="1000"/>
+        <w:gridCol w:w="2150"/>
+        <w:gridCol w:w="2200"/>
+        <w:gridCol w:w="1900"/>
+      </w:tblGrid>
+      <w:tr>
+        <w:trPr>
+          <w:cantSplit/>
+          <w:tblHeader/>
+        </w:trPr>
+        <w:tc>
+          <w:tcPr>
+            <w:tcW w:type="dxa" w:w="1750"/>
+            <w:tcBorders>
+              <w:top w:val="single" w:color="D5DCE4" w:sz="4"/>
+              <w:left w:val="single" w:color="D5DCE4" w:sz="4"/>
+              <w:bottom w:val="single" w:color="D5DCE4" w:sz="4"/>
+              <w:right w:val="single" w:color="D5DCE4" w:sz="4"/>
+            </w:tcBorders>
+            <w:shd w:fill="14213D" w:color="auto" w:val="clear"/>
+            <w:tcMar>
+              <w:top w:type="dxa" w:w="60"/>
+              <w:left w:type="dxa" w:w="100"/>
+              <w:bottom w:type="dxa" w:w="60"/>
+              <w:right w:type="dxa" w:w="100"/>
+            </w:tcMar>
+            <w:vAlign w:val="center"/>
+          </w:tcPr>
+          <w:p>
+            <w:pPr>
+              <w:spacing w:after="40" w:line="260"/>
+            </w:pPr>
+            <w:r>
+              <w:rPr>
+                <w:rFonts w:ascii="Calibri" w:cs="Calibri" w:eastAsia="Calibri" w:hAnsi="Calibri"/>
+                <w:b/>
+                <w:bCs/>
+                <w:color w:val="FFFFFF"/>
+                <w:sz w:val="20"/>
+                <w:szCs w:val="20"/>
+              </w:rPr>
+              <w:t xml:space="preserve">Model</w:t>
+            </w:r>
+          </w:p>
+        </w:tc>
+        <w:tc>
+          <w:tcPr>
+            <w:tcW w:type="dxa" w:w="1000"/>
+            <w:tcBorders>
+              <w:top w:val="single" w:color="D5DCE4" w:sz="4"/>
+              <w:left w:val="single" w:color="D5DCE4" w:sz="4"/>
+              <w:bottom w:val="single" w:color="D5DCE4" w:sz="4"/>
+              <w:right w:val="single" w:color="D5DCE4" w:sz="4"/>
+            </w:tcBorders>
+            <w:shd w:fill="14213D" w:color="auto" w:val="clear"/>
+            <w:tcMar>
+              <w:top w:type="dxa" w:w="60"/>
+              <w:left w:type="dxa" w:w="100"/>
+              <w:bottom w:type="dxa" w:w="60"/>
+              <w:right w:type="dxa" w:w="100"/>
+            </w:tcMar>
+            <w:vAlign w:val="center"/>
+          </w:tcPr>
+          <w:p>
+            <w:pPr>
+              <w:spacing w:after="40" w:line="260"/>
+            </w:pPr>
+            <w:r>
+              <w:rPr>
+                <w:rFonts w:ascii="Calibri" w:cs="Calibri" w:eastAsia="Calibri" w:hAnsi="Calibri"/>
+                <w:b/>
+                <w:bCs/>
+                <w:color w:val="FFFFFF"/>
+                <w:sz w:val="20"/>
+                <w:szCs w:val="20"/>
+              </w:rPr>
+              <w:t xml:space="preserve">Stage</w:t>
+            </w:r>
+          </w:p>
+        </w:tc>
+        <w:tc>
+          <w:tcPr>
+            <w:tcW w:type="dxa" w:w="2150"/>
+            <w:tcBorders>
+              <w:top w:val="single" w:color="D5DCE4" w:sz="4"/>
+              <w:left w:val="single" w:color="D5DCE4" w:sz="4"/>
+              <w:bottom w:val="single" w:color="D5DCE4" w:sz="4"/>
+              <w:right w:val="single" w:color="D5DCE4" w:sz="4"/>
+            </w:tcBorders>
+            <w:shd w:fill="14213D" w:color="auto" w:val="clear"/>
+            <w:tcMar>
+              <w:top w:type="dxa" w:w="60"/>
+              <w:left w:type="dxa" w:w="100"/>
+              <w:bottom w:type="dxa" w:w="60"/>
+              <w:right w:type="dxa" w:w="100"/>
+            </w:tcMar>
+            <w:vAlign w:val="center"/>
+          </w:tcPr>
+          <w:p>
+            <w:pPr>
+              <w:spacing w:after="40" w:line="260"/>
+            </w:pPr>
+            <w:r>
+              <w:rPr>
+                <w:rFonts w:ascii="Calibri" w:cs="Calibri" w:eastAsia="Calibri" w:hAnsi="Calibri"/>
+                <w:b/>
+                <w:bCs/>
+                <w:color w:val="FFFFFF"/>
+                <w:sz w:val="20"/>
+                <w:szCs w:val="20"/>
+              </w:rPr>
+              <w:t xml:space="preserve">What led to it</w:t>
+            </w:r>
+          </w:p>
+        </w:tc>
+        <w:tc>
+          <w:tcPr>
+            <w:tcW w:type="dxa" w:w="2200"/>
+            <w:tcBorders>
+              <w:top w:val="single" w:color="D5DCE4" w:sz="4"/>
+              <w:left w:val="single" w:color="D5DCE4" w:sz="4"/>
+              <w:bottom w:val="single" w:color="D5DCE4" w:sz="4"/>
+              <w:right w:val="single" w:color="D5DCE4" w:sz="4"/>
+            </w:tcBorders>
+            <w:shd w:fill="14213D" w:color="auto" w:val="clear"/>
+            <w:tcMar>
+              <w:top w:type="dxa" w:w="60"/>
+              <w:left w:type="dxa" w:w="100"/>
+              <w:bottom w:type="dxa" w:w="60"/>
+              <w:right w:type="dxa" w:w="100"/>
+            </w:tcMar>
+            <w:vAlign w:val="center"/>
+          </w:tcPr>
+          <w:p>
+            <w:pPr>
+              <w:spacing w:after="40" w:line="260"/>
+            </w:pPr>
+            <w:r>
+              <w:rPr>
+                <w:rFonts w:ascii="Calibri" w:cs="Calibri" w:eastAsia="Calibri" w:hAnsi="Calibri"/>
+                <w:b/>
+                <w:bCs/>
+                <w:color w:val="FFFFFF"/>
+                <w:sz w:val="20"/>
+                <w:szCs w:val="20"/>
+              </w:rPr>
+              <w:t xml:space="preserve">How it differs</w:t>
+            </w:r>
+          </w:p>
+        </w:tc>
+        <w:tc>
+          <w:tcPr>
+            <w:tcW w:type="dxa" w:w="1900"/>
+            <w:tcBorders>
+              <w:top w:val="single" w:color="D5DCE4" w:sz="4"/>
+              <w:left w:val="single" w:color="D5DCE4" w:sz="4"/>
+              <w:bottom w:val="single" w:color="D5DCE4" w:sz="4"/>
+              <w:right w:val="single" w:color="D5DCE4" w:sz="4"/>
+            </w:tcBorders>
+            <w:shd w:fill="14213D" w:color="auto" w:val="clear"/>
+            <w:tcMar>
+              <w:top w:type="dxa" w:w="60"/>
+              <w:left w:type="dxa" w:w="100"/>
+              <w:bottom w:type="dxa" w:w="60"/>
+              <w:right w:type="dxa" w:w="100"/>
+            </w:tcMar>
+            <w:vAlign w:val="center"/>
+          </w:tcPr>
+          <w:p>
+            <w:pPr>
+              <w:spacing w:after="40" w:line="260"/>
+            </w:pPr>
+            <w:r>
+              <w:rPr>
+                <w:rFonts w:ascii="Calibri" w:cs="Calibri" w:eastAsia="Calibri" w:hAnsi="Calibri"/>
+                <w:b/>
+                <w:bCs/>
+                <w:color w:val="FFFFFF"/>
+                <w:sz w:val="20"/>
+                <w:szCs w:val="20"/>
+              </w:rPr>
+              <w:t xml:space="preserve">Status</w:t>
+            </w:r>
+          </w:p>
+        </w:tc>
+      </w:tr>
+      <w:tr>
+        <w:trPr>
+          <w:cantSplit/>
+        </w:trPr>
+        <w:tc>
+          <w:tcPr>
+            <w:tcW w:type="dxa" w:w="1750"/>
+            <w:tcBorders>
+              <w:top w:val="single" w:color="D5DCE4" w:sz="4"/>
+              <w:left w:val="single" w:color="D5DCE4" w:sz="4"/>
+              <w:bottom w:val="single" w:color="D5DCE4" w:sz="4"/>
+              <w:right w:val="single" w:color="D5DCE4" w:sz="4"/>
+            </w:tcBorders>
+            <w:tcMar>
+              <w:top w:type="dxa" w:w="60"/>
+              <w:left w:type="dxa" w:w="100"/>
+              <w:bottom w:type="dxa" w:w="60"/>
+              <w:right w:type="dxa" w:w="100"/>
+            </w:tcMar>
+            <w:vAlign w:val="center"/>
+          </w:tcPr>
+          <w:p>
+            <w:pPr>
+              <w:spacing w:after="40" w:line="260"/>
+            </w:pPr>
+            <w:r>
+              <w:rPr>
+                <w:rFonts w:ascii="Calibri" w:cs="Calibri" w:eastAsia="Calibri" w:hAnsi="Calibri"/>
+                <w:b w:val="false"/>
+                <w:bCs w:val="false"/>
+                <w:color w:val="000000"/>
+                <w:sz w:val="20"/>
+                <w:szCs w:val="20"/>
+              </w:rPr>
+              <w:t xml:space="preserve">CNN-Transformer</w:t>
+            </w:r>
+          </w:p>
+        </w:tc>
+        <w:tc>
+          <w:tcPr>
+            <w:tcW w:type="dxa" w:w="1000"/>
+            <w:tcBorders>
+              <w:top w:val="single" w:color="D5DCE4" w:sz="4"/>
+              <w:left w:val="single" w:color="D5DCE4" w:sz="4"/>
+              <w:bottom w:val="single" w:color="D5DCE4" w:sz="4"/>
+              <w:right w:val="single" w:color="D5DCE4" w:sz="4"/>
+            </w:tcBorders>
+            <w:tcMar>
+              <w:top w:type="dxa" w:w="60"/>
+              <w:left w:type="dxa" w:w="100"/>
+              <w:bottom w:type="dxa" w:w="60"/>
+              <w:right w:type="dxa" w:w="100"/>
+            </w:tcMar>
+            <w:vAlign w:val="center"/>
+          </w:tcPr>
+          <w:p>
+            <w:pPr>
+              <w:spacing w:after="40" w:line="260"/>
+            </w:pPr>
+            <w:r>
+              <w:rPr>
+                <w:rFonts w:ascii="Calibri" w:cs="Calibri" w:eastAsia="Calibri" w:hAnsi="Calibri"/>
+                <w:b w:val="false"/>
+                <w:bCs w:val="false"/>
+                <w:color w:val="000000"/>
+                <w:sz w:val="20"/>
+                <w:szCs w:val="20"/>
+              </w:rPr>
+              <w:t xml:space="preserve">Stage 1</w:t>
+            </w:r>
+          </w:p>
+        </w:tc>
+        <w:tc>
+          <w:tcPr>
+            <w:tcW w:type="dxa" w:w="2150"/>
+            <w:tcBorders>
+              <w:top w:val="single" w:color="D5DCE4" w:sz="4"/>
+              <w:left w:val="single" w:color="D5DCE4" w:sz="4"/>
+              <w:bottom w:val="single" w:color="D5DCE4" w:sz="4"/>
+              <w:right w:val="single" w:color="D5DCE4" w:sz="4"/>
+            </w:tcBorders>
+            <w:tcMar>
+              <w:top w:type="dxa" w:w="60"/>
+              <w:left w:type="dxa" w:w="100"/>
+              <w:bottom w:type="dxa" w:w="60"/>
+              <w:right w:type="dxa" w:w="100"/>
+            </w:tcMar>
+            <w:vAlign w:val="center"/>
+          </w:tcPr>
+          <w:p>
+            <w:pPr>
+              <w:spacing w:after="40" w:line="260"/>
+            </w:pPr>
+            <w:r>
+              <w:rPr>
+                <w:rFonts w:ascii="Calibri" w:cs="Calibri" w:eastAsia="Calibri" w:hAnsi="Calibri"/>
+                <w:b w:val="false"/>
+                <w:bCs w:val="false"/>
+                <w:color w:val="000000"/>
+                <w:sz w:val="20"/>
+                <w:szCs w:val="20"/>
+              </w:rPr>
+              <w:t xml:space="preserve">First architecture: local trends plus long-range attention</w:t>
+            </w:r>
+          </w:p>
+        </w:tc>
+        <w:tc>
+          <w:tcPr>
+            <w:tcW w:type="dxa" w:w="2200"/>
+            <w:tcBorders>
+              <w:top w:val="single" w:color="D5DCE4" w:sz="4"/>
+              <w:left w:val="single" w:color="D5DCE4" w:sz="4"/>
+              <w:bottom w:val="single" w:color="D5DCE4" w:sz="4"/>
+              <w:right w:val="single" w:color="D5DCE4" w:sz="4"/>
+            </w:tcBorders>
+            <w:tcMar>
+              <w:top w:type="dxa" w:w="60"/>
+              <w:left w:type="dxa" w:w="100"/>
+              <w:bottom w:type="dxa" w:w="60"/>
+              <w:right w:type="dxa" w:w="100"/>
+            </w:tcMar>
+            <w:vAlign w:val="center"/>
+          </w:tcPr>
+          <w:p>
+            <w:pPr>
+              <w:spacing w:after="40" w:line="260"/>
+            </w:pPr>
+            <w:r>
+              <w:rPr>
+                <w:rFonts w:ascii="Calibri" w:cs="Calibri" w:eastAsia="Calibri" w:hAnsi="Calibri"/>
+                <w:b w:val="false"/>
+                <w:bCs w:val="false"/>
+                <w:color w:val="000000"/>
+                <w:sz w:val="20"/>
+                <w:szCs w:val="20"/>
+              </w:rPr>
+              <w:t xml:space="preserve">Treats all variables alike; no clinical structure</w:t>
+            </w:r>
+          </w:p>
+        </w:tc>
+        <w:tc>
+          <w:tcPr>
+            <w:tcW w:type="dxa" w:w="1900"/>
+            <w:tcBorders>
+              <w:top w:val="single" w:color="D5DCE4" w:sz="4"/>
+              <w:left w:val="single" w:color="D5DCE4" w:sz="4"/>
+              <w:bottom w:val="single" w:color="D5DCE4" w:sz="4"/>
+              <w:right w:val="single" w:color="D5DCE4" w:sz="4"/>
+            </w:tcBorders>
+            <w:tcMar>
+              <w:top w:type="dxa" w:w="60"/>
+              <w:left w:type="dxa" w:w="100"/>
+              <w:bottom w:type="dxa" w:w="60"/>
+              <w:right w:type="dxa" w:w="100"/>
+            </w:tcMar>
+            <w:vAlign w:val="center"/>
+          </w:tcPr>
+          <w:p>
+            <w:pPr>
+              <w:spacing w:after="40" w:line="260"/>
+            </w:pPr>
+            <w:r>
+              <w:rPr>
+                <w:rFonts w:ascii="Calibri" w:cs="Calibri" w:eastAsia="Calibri" w:hAnsi="Calibri"/>
+                <w:b w:val="false"/>
+                <w:bCs w:val="false"/>
+                <w:color w:val="000000"/>
+                <w:sz w:val="20"/>
+                <w:szCs w:val="20"/>
+              </w:rPr>
+              <w:t xml:space="preserve">Leaky version withdrawn; causal version kept as a comparator</w:t>
+            </w:r>
+          </w:p>
+        </w:tc>
+      </w:tr>
+      <w:tr>
+        <w:trPr>
+          <w:cantSplit/>
+        </w:trPr>
+        <w:tc>
+          <w:tcPr>
+            <w:tcW w:type="dxa" w:w="1750"/>
+            <w:tcBorders>
+              <w:top w:val="single" w:color="D5DCE4" w:sz="4"/>
+              <w:left w:val="single" w:color="D5DCE4" w:sz="4"/>
+              <w:bottom w:val="single" w:color="D5DCE4" w:sz="4"/>
+              <w:right w:val="single" w:color="D5DCE4" w:sz="4"/>
+            </w:tcBorders>
+            <w:shd w:fill="EEF3F7" w:color="auto" w:val="clear"/>
+            <w:tcMar>
+              <w:top w:type="dxa" w:w="60"/>
+              <w:left w:type="dxa" w:w="100"/>
+              <w:bottom w:type="dxa" w:w="60"/>
+              <w:right w:type="dxa" w:w="100"/>
+            </w:tcMar>
+            <w:vAlign w:val="center"/>
+          </w:tcPr>
+          <w:p>
+            <w:pPr>
+              <w:spacing w:after="40" w:line="260"/>
+            </w:pPr>
+            <w:r>
+              <w:rPr>
+                <w:rFonts w:ascii="Calibri" w:cs="Calibri" w:eastAsia="Calibri" w:hAnsi="Calibri"/>
+                <w:b w:val="false"/>
+                <w:bCs w:val="false"/>
+                <w:color w:val="000000"/>
+                <w:sz w:val="20"/>
+                <w:szCs w:val="20"/>
+              </w:rPr>
+              <w:t xml:space="preserve">OSTA-Transformer</w:t>
+            </w:r>
+          </w:p>
+        </w:tc>
+        <w:tc>
+          <w:tcPr>
+            <w:tcW w:type="dxa" w:w="1000"/>
+            <w:tcBorders>
+              <w:top w:val="single" w:color="D5DCE4" w:sz="4"/>
+              <w:left w:val="single" w:color="D5DCE4" w:sz="4"/>
+              <w:bottom w:val="single" w:color="D5DCE4" w:sz="4"/>
+              <w:right w:val="single" w:color="D5DCE4" w:sz="4"/>
+            </w:tcBorders>
+            <w:shd w:fill="EEF3F7" w:color="auto" w:val="clear"/>
+            <w:tcMar>
+              <w:top w:type="dxa" w:w="60"/>
+              <w:left w:type="dxa" w:w="100"/>
+              <w:bottom w:type="dxa" w:w="60"/>
+              <w:right w:type="dxa" w:w="100"/>
+            </w:tcMar>
+            <w:vAlign w:val="center"/>
+          </w:tcPr>
+          <w:p>
+            <w:pPr>
+              <w:spacing w:after="40" w:line="260"/>
+            </w:pPr>
+            <w:r>
+              <w:rPr>
+                <w:rFonts w:ascii="Calibri" w:cs="Calibri" w:eastAsia="Calibri" w:hAnsi="Calibri"/>
+                <w:b w:val="false"/>
+                <w:bCs w:val="false"/>
+                <w:color w:val="000000"/>
+                <w:sz w:val="20"/>
+                <w:szCs w:val="20"/>
+              </w:rPr>
+              <w:t xml:space="preserve">Stage 1</w:t>
+            </w:r>
+          </w:p>
+        </w:tc>
+        <w:tc>
+          <w:tcPr>
+            <w:tcW w:type="dxa" w:w="2150"/>
+            <w:tcBorders>
+              <w:top w:val="single" w:color="D5DCE4" w:sz="4"/>
+              <w:left w:val="single" w:color="D5DCE4" w:sz="4"/>
+              <w:bottom w:val="single" w:color="D5DCE4" w:sz="4"/>
+              <w:right w:val="single" w:color="D5DCE4" w:sz="4"/>
+            </w:tcBorders>
+            <w:shd w:fill="EEF3F7" w:color="auto" w:val="clear"/>
+            <w:tcMar>
+              <w:top w:type="dxa" w:w="60"/>
+              <w:left w:type="dxa" w:w="100"/>
+              <w:bottom w:type="dxa" w:w="60"/>
+              <w:right w:type="dxa" w:w="100"/>
+            </w:tcMar>
+            <w:vAlign w:val="center"/>
+          </w:tcPr>
+          <w:p>
+            <w:pPr>
+              <w:spacing w:after="40" w:line="260"/>
+            </w:pPr>
+            <w:r>
+              <w:rPr>
+                <w:rFonts w:ascii="Calibri" w:cs="Calibri" w:eastAsia="Calibri" w:hAnsi="Calibri"/>
+                <w:b w:val="false"/>
+                <w:bCs w:val="false"/>
+                <w:color w:val="000000"/>
+                <w:sz w:val="20"/>
+                <w:szCs w:val="20"/>
+              </w:rPr>
+              <w:t xml:space="preserve">Need for clinical structure and explanation</w:t>
+            </w:r>
+          </w:p>
+        </w:tc>
+        <w:tc>
+          <w:tcPr>
+            <w:tcW w:type="dxa" w:w="2200"/>
+            <w:tcBorders>
+              <w:top w:val="single" w:color="D5DCE4" w:sz="4"/>
+              <w:left w:val="single" w:color="D5DCE4" w:sz="4"/>
+              <w:bottom w:val="single" w:color="D5DCE4" w:sz="4"/>
+              <w:right w:val="single" w:color="D5DCE4" w:sz="4"/>
+            </w:tcBorders>
+            <w:shd w:fill="EEF3F7" w:color="auto" w:val="clear"/>
+            <w:tcMar>
+              <w:top w:type="dxa" w:w="60"/>
+              <w:left w:type="dxa" w:w="100"/>
+              <w:bottom w:type="dxa" w:w="60"/>
+              <w:right w:type="dxa" w:w="100"/>
+            </w:tcMar>
+            <w:vAlign w:val="center"/>
+          </w:tcPr>
+          <w:p>
+            <w:pPr>
+              <w:spacing w:after="40" w:line="260"/>
+            </w:pPr>
+            <w:r>
+              <w:rPr>
+                <w:rFonts w:ascii="Calibri" w:cs="Calibri" w:eastAsia="Calibri" w:hAnsi="Calibri"/>
+                <w:b w:val="false"/>
+                <w:bCs w:val="false"/>
+                <w:color w:val="000000"/>
+                <w:sz w:val="20"/>
+                <w:szCs w:val="20"/>
+              </w:rPr>
+              <w:t xml:space="preserve">Organ groups, cross-organ attention, risk per organ, purpose-built loss</w:t>
+            </w:r>
+          </w:p>
+        </w:tc>
+        <w:tc>
+          <w:tcPr>
+            <w:tcW w:type="dxa" w:w="1900"/>
+            <w:tcBorders>
+              <w:top w:val="single" w:color="D5DCE4" w:sz="4"/>
+              <w:left w:val="single" w:color="D5DCE4" w:sz="4"/>
+              <w:bottom w:val="single" w:color="D5DCE4" w:sz="4"/>
+              <w:right w:val="single" w:color="D5DCE4" w:sz="4"/>
+            </w:tcBorders>
+            <w:shd w:fill="EEF3F7" w:color="auto" w:val="clear"/>
+            <w:tcMar>
+              <w:top w:type="dxa" w:w="60"/>
+              <w:left w:type="dxa" w:w="100"/>
+              <w:bottom w:type="dxa" w:w="60"/>
+              <w:right w:type="dxa" w:w="100"/>
+            </w:tcMar>
+            <w:vAlign w:val="center"/>
+          </w:tcPr>
+          <w:p>
+            <w:pPr>
+              <w:spacing w:after="40" w:line="260"/>
+            </w:pPr>
+            <w:r>
+              <w:rPr>
+                <w:rFonts w:ascii="Calibri" w:cs="Calibri" w:eastAsia="Calibri" w:hAnsi="Calibri"/>
+                <w:b w:val="false"/>
+                <w:bCs w:val="false"/>
+                <w:color w:val="000000"/>
+                <w:sz w:val="20"/>
+                <w:szCs w:val="20"/>
+              </w:rPr>
+              <w:t xml:space="preserve">Leaky version withdrawn; causal rebuild is the PhysioNet baseline and a V11 arm</w:t>
+            </w:r>
+          </w:p>
+        </w:tc>
+      </w:tr>
+      <w:tr>
+        <w:trPr>
+          <w:cantSplit/>
+        </w:trPr>
+        <w:tc>
+          <w:tcPr>
+            <w:tcW w:type="dxa" w:w="1750"/>
+            <w:tcBorders>
+              <w:top w:val="single" w:color="D5DCE4" w:sz="4"/>
+              <w:left w:val="single" w:color="D5DCE4" w:sz="4"/>
+              <w:bottom w:val="single" w:color="D5DCE4" w:sz="4"/>
+              <w:right w:val="single" w:color="D5DCE4" w:sz="4"/>
+            </w:tcBorders>
+            <w:tcMar>
+              <w:top w:type="dxa" w:w="60"/>
+              <w:left w:type="dxa" w:w="100"/>
+              <w:bottom w:type="dxa" w:w="60"/>
+              <w:right w:type="dxa" w:w="100"/>
+            </w:tcMar>
+            <w:vAlign w:val="center"/>
+          </w:tcPr>
+          <w:p>
+            <w:pPr>
+              <w:spacing w:after="40" w:line="260"/>
+            </w:pPr>
+            <w:r>
+              <w:rPr>
+                <w:rFonts w:ascii="Calibri" w:cs="Calibri" w:eastAsia="Calibri" w:hAnsi="Calibri"/>
+                <w:b w:val="false"/>
+                <w:bCs w:val="false"/>
+                <w:color w:val="000000"/>
+                <w:sz w:val="20"/>
+                <w:szCs w:val="20"/>
+              </w:rPr>
+              <w:t xml:space="preserve">Observer features</w:t>
+            </w:r>
+          </w:p>
+        </w:tc>
+        <w:tc>
+          <w:tcPr>
+            <w:tcW w:type="dxa" w:w="1000"/>
+            <w:tcBorders>
+              <w:top w:val="single" w:color="D5DCE4" w:sz="4"/>
+              <w:left w:val="single" w:color="D5DCE4" w:sz="4"/>
+              <w:bottom w:val="single" w:color="D5DCE4" w:sz="4"/>
+              <w:right w:val="single" w:color="D5DCE4" w:sz="4"/>
+            </w:tcBorders>
+            <w:tcMar>
+              <w:top w:type="dxa" w:w="60"/>
+              <w:left w:type="dxa" w:w="100"/>
+              <w:bottom w:type="dxa" w:w="60"/>
+              <w:right w:type="dxa" w:w="100"/>
+            </w:tcMar>
+            <w:vAlign w:val="center"/>
+          </w:tcPr>
+          <w:p>
+            <w:pPr>
+              <w:spacing w:after="40" w:line="260"/>
+            </w:pPr>
+            <w:r>
+              <w:rPr>
+                <w:rFonts w:ascii="Calibri" w:cs="Calibri" w:eastAsia="Calibri" w:hAnsi="Calibri"/>
+                <w:b w:val="false"/>
+                <w:bCs w:val="false"/>
+                <w:color w:val="000000"/>
+                <w:sz w:val="20"/>
+                <w:szCs w:val="20"/>
+              </w:rPr>
+              <w:t xml:space="preserve">Stage 2</w:t>
+            </w:r>
+          </w:p>
+        </w:tc>
+        <w:tc>
+          <w:tcPr>
+            <w:tcW w:type="dxa" w:w="2150"/>
+            <w:tcBorders>
+              <w:top w:val="single" w:color="D5DCE4" w:sz="4"/>
+              <w:left w:val="single" w:color="D5DCE4" w:sz="4"/>
+              <w:bottom w:val="single" w:color="D5DCE4" w:sz="4"/>
+              <w:right w:val="single" w:color="D5DCE4" w:sz="4"/>
+            </w:tcBorders>
+            <w:tcMar>
+              <w:top w:type="dxa" w:w="60"/>
+              <w:left w:type="dxa" w:w="100"/>
+              <w:bottom w:type="dxa" w:w="60"/>
+              <w:right w:type="dxa" w:w="100"/>
+            </w:tcMar>
+            <w:vAlign w:val="center"/>
+          </w:tcPr>
+          <w:p>
+            <w:pPr>
+              <w:spacing w:after="40" w:line="260"/>
+            </w:pPr>
+            <w:r>
+              <w:rPr>
+                <w:rFonts w:ascii="Calibri" w:cs="Calibri" w:eastAsia="Calibri" w:hAnsi="Calibri"/>
+                <w:b w:val="false"/>
+                <w:bCs w:val="false"/>
+                <w:color w:val="000000"/>
+                <w:sz w:val="20"/>
+                <w:szCs w:val="20"/>
+              </w:rPr>
+              <w:t xml:space="preserve">Give OSTA independent per-organ evidence</w:t>
+            </w:r>
+          </w:p>
+        </w:tc>
+        <w:tc>
+          <w:tcPr>
+            <w:tcW w:type="dxa" w:w="2200"/>
+            <w:tcBorders>
+              <w:top w:val="single" w:color="D5DCE4" w:sz="4"/>
+              <w:left w:val="single" w:color="D5DCE4" w:sz="4"/>
+              <w:bottom w:val="single" w:color="D5DCE4" w:sz="4"/>
+              <w:right w:val="single" w:color="D5DCE4" w:sz="4"/>
+            </w:tcBorders>
+            <w:tcMar>
+              <w:top w:type="dxa" w:w="60"/>
+              <w:left w:type="dxa" w:w="100"/>
+              <w:bottom w:type="dxa" w:w="60"/>
+              <w:right w:type="dxa" w:w="100"/>
+            </w:tcMar>
+            <w:vAlign w:val="center"/>
+          </w:tcPr>
+          <w:p>
+            <w:pPr>
+              <w:spacing w:after="40" w:line="260"/>
+            </w:pPr>
+            <w:r>
+              <w:rPr>
+                <w:rFonts w:ascii="Calibri" w:cs="Calibri" w:eastAsia="Calibri" w:hAnsi="Calibri"/>
+                <w:b w:val="false"/>
+                <w:bCs w:val="false"/>
+                <w:color w:val="000000"/>
+                <w:sz w:val="20"/>
+                <w:szCs w:val="20"/>
+              </w:rPr>
+              <w:t xml:space="preserve">Observer outputs as extra inputs</w:t>
+            </w:r>
+          </w:p>
+        </w:tc>
+        <w:tc>
+          <w:tcPr>
+            <w:tcW w:type="dxa" w:w="1900"/>
+            <w:tcBorders>
+              <w:top w:val="single" w:color="D5DCE4" w:sz="4"/>
+              <w:left w:val="single" w:color="D5DCE4" w:sz="4"/>
+              <w:bottom w:val="single" w:color="D5DCE4" w:sz="4"/>
+              <w:right w:val="single" w:color="D5DCE4" w:sz="4"/>
+            </w:tcBorders>
+            <w:tcMar>
+              <w:top w:type="dxa" w:w="60"/>
+              <w:left w:type="dxa" w:w="100"/>
+              <w:bottom w:type="dxa" w:w="60"/>
+              <w:right w:type="dxa" w:w="100"/>
+            </w:tcMar>
+            <w:vAlign w:val="center"/>
+          </w:tcPr>
+          <w:p>
+            <w:pPr>
+              <w:spacing w:after="40" w:line="260"/>
+            </w:pPr>
+            <w:r>
+              <w:rPr>
+                <w:rFonts w:ascii="Calibri" w:cs="Calibri" w:eastAsia="Calibri" w:hAnsi="Calibri"/>
+                <w:b w:val="false"/>
+                <w:bCs w:val="false"/>
+                <w:color w:val="000000"/>
+                <w:sz w:val="20"/>
+                <w:szCs w:val="20"/>
+              </w:rPr>
+              <w:t xml:space="preserve">No gain; retired</w:t>
+            </w:r>
+          </w:p>
+        </w:tc>
+      </w:tr>
+      <w:tr>
+        <w:trPr>
+          <w:cantSplit/>
+        </w:trPr>
+        <w:tc>
+          <w:tcPr>
+            <w:tcW w:type="dxa" w:w="1750"/>
+            <w:tcBorders>
+              <w:top w:val="single" w:color="D5DCE4" w:sz="4"/>
+              <w:left w:val="single" w:color="D5DCE4" w:sz="4"/>
+              <w:bottom w:val="single" w:color="D5DCE4" w:sz="4"/>
+              <w:right w:val="single" w:color="D5DCE4" w:sz="4"/>
+            </w:tcBorders>
+            <w:shd w:fill="EEF3F7" w:color="auto" w:val="clear"/>
+            <w:tcMar>
+              <w:top w:type="dxa" w:w="60"/>
+              <w:left w:type="dxa" w:w="100"/>
+              <w:bottom w:type="dxa" w:w="60"/>
+              <w:right w:type="dxa" w:w="100"/>
+            </w:tcMar>
+            <w:vAlign w:val="center"/>
+          </w:tcPr>
+          <w:p>
+            <w:pPr>
+              <w:spacing w:after="40" w:line="260"/>
+            </w:pPr>
+            <w:r>
+              <w:rPr>
+                <w:rFonts w:ascii="Calibri" w:cs="Calibri" w:eastAsia="Calibri" w:hAnsi="Calibri"/>
+                <w:b w:val="false"/>
+                <w:bCs w:val="false"/>
+                <w:color w:val="000000"/>
+                <w:sz w:val="20"/>
+                <w:szCs w:val="20"/>
+              </w:rPr>
+              <w:t xml:space="preserve">Output fusion</w:t>
+            </w:r>
+          </w:p>
+        </w:tc>
+        <w:tc>
+          <w:tcPr>
+            <w:tcW w:type="dxa" w:w="1000"/>
+            <w:tcBorders>
+              <w:top w:val="single" w:color="D5DCE4" w:sz="4"/>
+              <w:left w:val="single" w:color="D5DCE4" w:sz="4"/>
+              <w:bottom w:val="single" w:color="D5DCE4" w:sz="4"/>
+              <w:right w:val="single" w:color="D5DCE4" w:sz="4"/>
+            </w:tcBorders>
+            <w:shd w:fill="EEF3F7" w:color="auto" w:val="clear"/>
+            <w:tcMar>
+              <w:top w:type="dxa" w:w="60"/>
+              <w:left w:type="dxa" w:w="100"/>
+              <w:bottom w:type="dxa" w:w="60"/>
+              <w:right w:type="dxa" w:w="100"/>
+            </w:tcMar>
+            <w:vAlign w:val="center"/>
+          </w:tcPr>
+          <w:p>
+            <w:pPr>
+              <w:spacing w:after="40" w:line="260"/>
+            </w:pPr>
+            <w:r>
+              <w:rPr>
+                <w:rFonts w:ascii="Calibri" w:cs="Calibri" w:eastAsia="Calibri" w:hAnsi="Calibri"/>
+                <w:b w:val="false"/>
+                <w:bCs w:val="false"/>
+                <w:color w:val="000000"/>
+                <w:sz w:val="20"/>
+                <w:szCs w:val="20"/>
+              </w:rPr>
+              <w:t xml:space="preserve">Stage 2</w:t>
+            </w:r>
+          </w:p>
+        </w:tc>
+        <w:tc>
+          <w:tcPr>
+            <w:tcW w:type="dxa" w:w="2150"/>
+            <w:tcBorders>
+              <w:top w:val="single" w:color="D5DCE4" w:sz="4"/>
+              <w:left w:val="single" w:color="D5DCE4" w:sz="4"/>
+              <w:bottom w:val="single" w:color="D5DCE4" w:sz="4"/>
+              <w:right w:val="single" w:color="D5DCE4" w:sz="4"/>
+            </w:tcBorders>
+            <w:shd w:fill="EEF3F7" w:color="auto" w:val="clear"/>
+            <w:tcMar>
+              <w:top w:type="dxa" w:w="60"/>
+              <w:left w:type="dxa" w:w="100"/>
+              <w:bottom w:type="dxa" w:w="60"/>
+              <w:right w:type="dxa" w:w="100"/>
+            </w:tcMar>
+            <w:vAlign w:val="center"/>
+          </w:tcPr>
+          <w:p>
+            <w:pPr>
+              <w:spacing w:after="40" w:line="260"/>
+            </w:pPr>
+            <w:r>
+              <w:rPr>
+                <w:rFonts w:ascii="Calibri" w:cs="Calibri" w:eastAsia="Calibri" w:hAnsi="Calibri"/>
+                <w:b w:val="false"/>
+                <w:bCs w:val="false"/>
+                <w:color w:val="000000"/>
+                <w:sz w:val="20"/>
+                <w:szCs w:val="20"/>
+              </w:rPr>
+              <w:t xml:space="preserve">The same evidence without changing OSTA</w:t>
+            </w:r>
+          </w:p>
+        </w:tc>
+        <w:tc>
+          <w:tcPr>
+            <w:tcW w:type="dxa" w:w="2200"/>
+            <w:tcBorders>
+              <w:top w:val="single" w:color="D5DCE4" w:sz="4"/>
+              <w:left w:val="single" w:color="D5DCE4" w:sz="4"/>
+              <w:bottom w:val="single" w:color="D5DCE4" w:sz="4"/>
+              <w:right w:val="single" w:color="D5DCE4" w:sz="4"/>
+            </w:tcBorders>
+            <w:shd w:fill="EEF3F7" w:color="auto" w:val="clear"/>
+            <w:tcMar>
+              <w:top w:type="dxa" w:w="60"/>
+              <w:left w:type="dxa" w:w="100"/>
+              <w:bottom w:type="dxa" w:w="60"/>
+              <w:right w:type="dxa" w:w="100"/>
+            </w:tcMar>
+            <w:vAlign w:val="center"/>
+          </w:tcPr>
+          <w:p>
+            <w:pPr>
+              <w:spacing w:after="40" w:line="260"/>
+            </w:pPr>
+            <w:r>
+              <w:rPr>
+                <w:rFonts w:ascii="Calibri" w:cs="Calibri" w:eastAsia="Calibri" w:hAnsi="Calibri"/>
+                <w:b w:val="false"/>
+                <w:bCs w:val="false"/>
+                <w:color w:val="000000"/>
+                <w:sz w:val="20"/>
+                <w:szCs w:val="20"/>
+              </w:rPr>
+              <w:t xml:space="preserve">Observer outputs added at the output</w:t>
+            </w:r>
+          </w:p>
+        </w:tc>
+        <w:tc>
+          <w:tcPr>
+            <w:tcW w:type="dxa" w:w="1900"/>
+            <w:tcBorders>
+              <w:top w:val="single" w:color="D5DCE4" w:sz="4"/>
+              <w:left w:val="single" w:color="D5DCE4" w:sz="4"/>
+              <w:bottom w:val="single" w:color="D5DCE4" w:sz="4"/>
+              <w:right w:val="single" w:color="D5DCE4" w:sz="4"/>
+            </w:tcBorders>
+            <w:shd w:fill="EEF3F7" w:color="auto" w:val="clear"/>
+            <w:tcMar>
+              <w:top w:type="dxa" w:w="60"/>
+              <w:left w:type="dxa" w:w="100"/>
+              <w:bottom w:type="dxa" w:w="60"/>
+              <w:right w:type="dxa" w:w="100"/>
+            </w:tcMar>
+            <w:vAlign w:val="center"/>
+          </w:tcPr>
+          <w:p>
+            <w:pPr>
+              <w:spacing w:after="40" w:line="260"/>
+            </w:pPr>
+            <w:r>
+              <w:rPr>
+                <w:rFonts w:ascii="Calibri" w:cs="Calibri" w:eastAsia="Calibri" w:hAnsi="Calibri"/>
+                <w:b w:val="false"/>
+                <w:bCs w:val="false"/>
+                <w:color w:val="000000"/>
+                <w:sz w:val="20"/>
+                <w:szCs w:val="20"/>
+              </w:rPr>
+              <w:t xml:space="preserve">Strongest of the family; kept</w:t>
+            </w:r>
+          </w:p>
+        </w:tc>
+      </w:tr>
+      <w:tr>
+        <w:trPr>
+          <w:cantSplit/>
+        </w:trPr>
+        <w:tc>
+          <w:tcPr>
+            <w:tcW w:type="dxa" w:w="1750"/>
+            <w:tcBorders>
+              <w:top w:val="single" w:color="D5DCE4" w:sz="4"/>
+              <w:left w:val="single" w:color="D5DCE4" w:sz="4"/>
+              <w:bottom w:val="single" w:color="D5DCE4" w:sz="4"/>
+              <w:right w:val="single" w:color="D5DCE4" w:sz="4"/>
+            </w:tcBorders>
+            <w:tcMar>
+              <w:top w:type="dxa" w:w="60"/>
+              <w:left w:type="dxa" w:w="100"/>
+              <w:bottom w:type="dxa" w:w="60"/>
+              <w:right w:type="dxa" w:w="100"/>
+            </w:tcMar>
+            <w:vAlign w:val="center"/>
+          </w:tcPr>
+          <w:p>
+            <w:pPr>
+              <w:spacing w:after="40" w:line="260"/>
+            </w:pPr>
+            <w:r>
+              <w:rPr>
+                <w:rFonts w:ascii="Calibri" w:cs="Calibri" w:eastAsia="Calibri" w:hAnsi="Calibri"/>
+                <w:b w:val="false"/>
+                <w:bCs w:val="false"/>
+                <w:color w:val="000000"/>
+                <w:sz w:val="20"/>
+                <w:szCs w:val="20"/>
+              </w:rPr>
+              <w:t xml:space="preserve">Gated attention guidance</w:t>
+            </w:r>
+          </w:p>
+        </w:tc>
+        <w:tc>
+          <w:tcPr>
+            <w:tcW w:type="dxa" w:w="1000"/>
+            <w:tcBorders>
+              <w:top w:val="single" w:color="D5DCE4" w:sz="4"/>
+              <w:left w:val="single" w:color="D5DCE4" w:sz="4"/>
+              <w:bottom w:val="single" w:color="D5DCE4" w:sz="4"/>
+              <w:right w:val="single" w:color="D5DCE4" w:sz="4"/>
+            </w:tcBorders>
+            <w:tcMar>
+              <w:top w:type="dxa" w:w="60"/>
+              <w:left w:type="dxa" w:w="100"/>
+              <w:bottom w:type="dxa" w:w="60"/>
+              <w:right w:type="dxa" w:w="100"/>
+            </w:tcMar>
+            <w:vAlign w:val="center"/>
+          </w:tcPr>
+          <w:p>
+            <w:pPr>
+              <w:spacing w:after="40" w:line="260"/>
+            </w:pPr>
+            <w:r>
+              <w:rPr>
+                <w:rFonts w:ascii="Calibri" w:cs="Calibri" w:eastAsia="Calibri" w:hAnsi="Calibri"/>
+                <w:b w:val="false"/>
+                <w:bCs w:val="false"/>
+                <w:color w:val="000000"/>
+                <w:sz w:val="20"/>
+                <w:szCs w:val="20"/>
+              </w:rPr>
+              <w:t xml:space="preserve">Stage 2</w:t>
+            </w:r>
+          </w:p>
+        </w:tc>
+        <w:tc>
+          <w:tcPr>
+            <w:tcW w:type="dxa" w:w="2150"/>
+            <w:tcBorders>
+              <w:top w:val="single" w:color="D5DCE4" w:sz="4"/>
+              <w:left w:val="single" w:color="D5DCE4" w:sz="4"/>
+              <w:bottom w:val="single" w:color="D5DCE4" w:sz="4"/>
+              <w:right w:val="single" w:color="D5DCE4" w:sz="4"/>
+            </w:tcBorders>
+            <w:tcMar>
+              <w:top w:type="dxa" w:w="60"/>
+              <w:left w:type="dxa" w:w="100"/>
+              <w:bottom w:type="dxa" w:w="60"/>
+              <w:right w:type="dxa" w:w="100"/>
+            </w:tcMar>
+            <w:vAlign w:val="center"/>
+          </w:tcPr>
+          <w:p>
+            <w:pPr>
+              <w:spacing w:after="40" w:line="260"/>
+            </w:pPr>
+            <w:r>
+              <w:rPr>
+                <w:rFonts w:ascii="Calibri" w:cs="Calibri" w:eastAsia="Calibri" w:hAnsi="Calibri"/>
+                <w:b w:val="false"/>
+                <w:bCs w:val="false"/>
+                <w:color w:val="000000"/>
+                <w:sz w:val="20"/>
+                <w:szCs w:val="20"/>
+              </w:rPr>
+              <w:t xml:space="preserve">Let the evidence steer which organs OSTA attends to</w:t>
+            </w:r>
+          </w:p>
+        </w:tc>
+        <w:tc>
+          <w:tcPr>
+            <w:tcW w:type="dxa" w:w="2200"/>
+            <w:tcBorders>
+              <w:top w:val="single" w:color="D5DCE4" w:sz="4"/>
+              <w:left w:val="single" w:color="D5DCE4" w:sz="4"/>
+              <w:bottom w:val="single" w:color="D5DCE4" w:sz="4"/>
+              <w:right w:val="single" w:color="D5DCE4" w:sz="4"/>
+            </w:tcBorders>
+            <w:tcMar>
+              <w:top w:type="dxa" w:w="60"/>
+              <w:left w:type="dxa" w:w="100"/>
+              <w:bottom w:type="dxa" w:w="60"/>
+              <w:right w:type="dxa" w:w="100"/>
+            </w:tcMar>
+            <w:vAlign w:val="center"/>
+          </w:tcPr>
+          <w:p>
+            <w:pPr>
+              <w:spacing w:after="40" w:line="260"/>
+            </w:pPr>
+            <w:r>
+              <w:rPr>
+                <w:rFonts w:ascii="Calibri" w:cs="Calibri" w:eastAsia="Calibri" w:hAnsi="Calibri"/>
+                <w:b w:val="false"/>
+                <w:bCs w:val="false"/>
+                <w:color w:val="000000"/>
+                <w:sz w:val="20"/>
+                <w:szCs w:val="20"/>
+              </w:rPr>
+              <w:t xml:space="preserve">Learned gates on cross-organ attention</w:t>
+            </w:r>
+          </w:p>
+        </w:tc>
+        <w:tc>
+          <w:tcPr>
+            <w:tcW w:type="dxa" w:w="1900"/>
+            <w:tcBorders>
+              <w:top w:val="single" w:color="D5DCE4" w:sz="4"/>
+              <w:left w:val="single" w:color="D5DCE4" w:sz="4"/>
+              <w:bottom w:val="single" w:color="D5DCE4" w:sz="4"/>
+              <w:right w:val="single" w:color="D5DCE4" w:sz="4"/>
+            </w:tcBorders>
+            <w:tcMar>
+              <w:top w:type="dxa" w:w="60"/>
+              <w:left w:type="dxa" w:w="100"/>
+              <w:bottom w:type="dxa" w:w="60"/>
+              <w:right w:type="dxa" w:w="100"/>
+            </w:tcMar>
+            <w:vAlign w:val="center"/>
+          </w:tcPr>
+          <w:p>
+            <w:pPr>
+              <w:spacing w:after="40" w:line="260"/>
+            </w:pPr>
+            <w:r>
+              <w:rPr>
+                <w:rFonts w:ascii="Calibri" w:cs="Calibri" w:eastAsia="Calibri" w:hAnsi="Calibri"/>
+                <w:b w:val="false"/>
+                <w:bCs w:val="false"/>
+                <w:color w:val="000000"/>
+                <w:sz w:val="20"/>
+                <w:szCs w:val="20"/>
+              </w:rPr>
+              <w:t xml:space="preserve">Equal to OSTA; retired</w:t>
+            </w:r>
+          </w:p>
+        </w:tc>
+      </w:tr>
+      <w:tr>
+        <w:trPr>
+          <w:cantSplit/>
+        </w:trPr>
+        <w:tc>
+          <w:tcPr>
+            <w:tcW w:type="dxa" w:w="1750"/>
+            <w:tcBorders>
+              <w:top w:val="single" w:color="D5DCE4" w:sz="4"/>
+              <w:left w:val="single" w:color="D5DCE4" w:sz="4"/>
+              <w:bottom w:val="single" w:color="D5DCE4" w:sz="4"/>
+              <w:right w:val="single" w:color="D5DCE4" w:sz="4"/>
+            </w:tcBorders>
+            <w:shd w:fill="EEF3F7" w:color="auto" w:val="clear"/>
+            <w:tcMar>
+              <w:top w:type="dxa" w:w="60"/>
+              <w:left w:type="dxa" w:w="100"/>
+              <w:bottom w:type="dxa" w:w="60"/>
+              <w:right w:type="dxa" w:w="100"/>
+            </w:tcMar>
+            <w:vAlign w:val="center"/>
+          </w:tcPr>
+          <w:p>
+            <w:pPr>
+              <w:spacing w:after="40" w:line="260"/>
+            </w:pPr>
+            <w:r>
+              <w:rPr>
+                <w:rFonts w:ascii="Calibri" w:cs="Calibri" w:eastAsia="Calibri" w:hAnsi="Calibri"/>
+                <w:b w:val="false"/>
+                <w:bCs w:val="false"/>
+                <w:color w:val="000000"/>
+                <w:sz w:val="20"/>
+                <w:szCs w:val="20"/>
+              </w:rPr>
+              <w:t xml:space="preserve">Ungated attention guidance</w:t>
+            </w:r>
+          </w:p>
+        </w:tc>
+        <w:tc>
+          <w:tcPr>
+            <w:tcW w:type="dxa" w:w="1000"/>
+            <w:tcBorders>
+              <w:top w:val="single" w:color="D5DCE4" w:sz="4"/>
+              <w:left w:val="single" w:color="D5DCE4" w:sz="4"/>
+              <w:bottom w:val="single" w:color="D5DCE4" w:sz="4"/>
+              <w:right w:val="single" w:color="D5DCE4" w:sz="4"/>
+            </w:tcBorders>
+            <w:shd w:fill="EEF3F7" w:color="auto" w:val="clear"/>
+            <w:tcMar>
+              <w:top w:type="dxa" w:w="60"/>
+              <w:left w:type="dxa" w:w="100"/>
+              <w:bottom w:type="dxa" w:w="60"/>
+              <w:right w:type="dxa" w:w="100"/>
+            </w:tcMar>
+            <w:vAlign w:val="center"/>
+          </w:tcPr>
+          <w:p>
+            <w:pPr>
+              <w:spacing w:after="40" w:line="260"/>
+            </w:pPr>
+            <w:r>
+              <w:rPr>
+                <w:rFonts w:ascii="Calibri" w:cs="Calibri" w:eastAsia="Calibri" w:hAnsi="Calibri"/>
+                <w:b w:val="false"/>
+                <w:bCs w:val="false"/>
+                <w:color w:val="000000"/>
+                <w:sz w:val="20"/>
+                <w:szCs w:val="20"/>
+              </w:rPr>
+              <w:t xml:space="preserve">Stage 2</w:t>
+            </w:r>
+          </w:p>
+        </w:tc>
+        <w:tc>
+          <w:tcPr>
+            <w:tcW w:type="dxa" w:w="2150"/>
+            <w:tcBorders>
+              <w:top w:val="single" w:color="D5DCE4" w:sz="4"/>
+              <w:left w:val="single" w:color="D5DCE4" w:sz="4"/>
+              <w:bottom w:val="single" w:color="D5DCE4" w:sz="4"/>
+              <w:right w:val="single" w:color="D5DCE4" w:sz="4"/>
+            </w:tcBorders>
+            <w:shd w:fill="EEF3F7" w:color="auto" w:val="clear"/>
+            <w:tcMar>
+              <w:top w:type="dxa" w:w="60"/>
+              <w:left w:type="dxa" w:w="100"/>
+              <w:bottom w:type="dxa" w:w="60"/>
+              <w:right w:type="dxa" w:w="100"/>
+            </w:tcMar>
+            <w:vAlign w:val="center"/>
+          </w:tcPr>
+          <w:p>
+            <w:pPr>
+              <w:spacing w:after="40" w:line="260"/>
+            </w:pPr>
+            <w:r>
+              <w:rPr>
+                <w:rFonts w:ascii="Calibri" w:cs="Calibri" w:eastAsia="Calibri" w:hAnsi="Calibri"/>
+                <w:b w:val="false"/>
+                <w:bCs w:val="false"/>
+                <w:color w:val="000000"/>
+                <w:sz w:val="20"/>
+                <w:szCs w:val="20"/>
+              </w:rPr>
+              <w:t xml:space="preserve">Control for the gate</w:t>
+            </w:r>
+          </w:p>
+        </w:tc>
+        <w:tc>
+          <w:tcPr>
+            <w:tcW w:type="dxa" w:w="2200"/>
+            <w:tcBorders>
+              <w:top w:val="single" w:color="D5DCE4" w:sz="4"/>
+              <w:left w:val="single" w:color="D5DCE4" w:sz="4"/>
+              <w:bottom w:val="single" w:color="D5DCE4" w:sz="4"/>
+              <w:right w:val="single" w:color="D5DCE4" w:sz="4"/>
+            </w:tcBorders>
+            <w:shd w:fill="EEF3F7" w:color="auto" w:val="clear"/>
+            <w:tcMar>
+              <w:top w:type="dxa" w:w="60"/>
+              <w:left w:type="dxa" w:w="100"/>
+              <w:bottom w:type="dxa" w:w="60"/>
+              <w:right w:type="dxa" w:w="100"/>
+            </w:tcMar>
+            <w:vAlign w:val="center"/>
+          </w:tcPr>
+          <w:p>
+            <w:pPr>
+              <w:spacing w:after="40" w:line="260"/>
+            </w:pPr>
+            <w:r>
+              <w:rPr>
+                <w:rFonts w:ascii="Calibri" w:cs="Calibri" w:eastAsia="Calibri" w:hAnsi="Calibri"/>
+                <w:b w:val="false"/>
+                <w:bCs w:val="false"/>
+                <w:color w:val="000000"/>
+                <w:sz w:val="20"/>
+                <w:szCs w:val="20"/>
+              </w:rPr>
+              <w:t xml:space="preserve">Guidance always on</w:t>
+            </w:r>
+          </w:p>
+        </w:tc>
+        <w:tc>
+          <w:tcPr>
+            <w:tcW w:type="dxa" w:w="1900"/>
+            <w:tcBorders>
+              <w:top w:val="single" w:color="D5DCE4" w:sz="4"/>
+              <w:left w:val="single" w:color="D5DCE4" w:sz="4"/>
+              <w:bottom w:val="single" w:color="D5DCE4" w:sz="4"/>
+              <w:right w:val="single" w:color="D5DCE4" w:sz="4"/>
+            </w:tcBorders>
+            <w:shd w:fill="EEF3F7" w:color="auto" w:val="clear"/>
+            <w:tcMar>
+              <w:top w:type="dxa" w:w="60"/>
+              <w:left w:type="dxa" w:w="100"/>
+              <w:bottom w:type="dxa" w:w="60"/>
+              <w:right w:type="dxa" w:w="100"/>
+            </w:tcMar>
+            <w:vAlign w:val="center"/>
+          </w:tcPr>
+          <w:p>
+            <w:pPr>
+              <w:spacing w:after="40" w:line="260"/>
+            </w:pPr>
+            <w:r>
+              <w:rPr>
+                <w:rFonts w:ascii="Calibri" w:cs="Calibri" w:eastAsia="Calibri" w:hAnsi="Calibri"/>
+                <w:b w:val="false"/>
+                <w:bCs w:val="false"/>
+                <w:color w:val="000000"/>
+                <w:sz w:val="20"/>
+                <w:szCs w:val="20"/>
+              </w:rPr>
+              <w:t xml:space="preserve">Lower than gated; retired</w:t>
+            </w:r>
+          </w:p>
+        </w:tc>
+      </w:tr>
+      <w:tr>
+        <w:trPr>
+          <w:cantSplit/>
+        </w:trPr>
+        <w:tc>
+          <w:tcPr>
+            <w:tcW w:type="dxa" w:w="1750"/>
+            <w:tcBorders>
+              <w:top w:val="single" w:color="D5DCE4" w:sz="4"/>
+              <w:left w:val="single" w:color="D5DCE4" w:sz="4"/>
+              <w:bottom w:val="single" w:color="D5DCE4" w:sz="4"/>
+              <w:right w:val="single" w:color="D5DCE4" w:sz="4"/>
+            </w:tcBorders>
+            <w:tcMar>
+              <w:top w:type="dxa" w:w="60"/>
+              <w:left w:type="dxa" w:w="100"/>
+              <w:bottom w:type="dxa" w:w="60"/>
+              <w:right w:type="dxa" w:w="100"/>
+            </w:tcMar>
+            <w:vAlign w:val="center"/>
+          </w:tcPr>
+          <w:p>
+            <w:pPr>
+              <w:spacing w:after="40" w:line="260"/>
+            </w:pPr>
+            <w:r>
+              <w:rPr>
+                <w:rFonts w:ascii="Calibri" w:cs="Calibri" w:eastAsia="Calibri" w:hAnsi="Calibri"/>
+                <w:b w:val="false"/>
+                <w:bCs w:val="false"/>
+                <w:color w:val="000000"/>
+                <w:sz w:val="20"/>
+                <w:szCs w:val="20"/>
+              </w:rPr>
+              <w:t xml:space="preserve">Raw-value control</w:t>
+            </w:r>
+          </w:p>
+        </w:tc>
+        <w:tc>
+          <w:tcPr>
+            <w:tcW w:type="dxa" w:w="1000"/>
+            <w:tcBorders>
+              <w:top w:val="single" w:color="D5DCE4" w:sz="4"/>
+              <w:left w:val="single" w:color="D5DCE4" w:sz="4"/>
+              <w:bottom w:val="single" w:color="D5DCE4" w:sz="4"/>
+              <w:right w:val="single" w:color="D5DCE4" w:sz="4"/>
+            </w:tcBorders>
+            <w:tcMar>
+              <w:top w:type="dxa" w:w="60"/>
+              <w:left w:type="dxa" w:w="100"/>
+              <w:bottom w:type="dxa" w:w="60"/>
+              <w:right w:type="dxa" w:w="100"/>
+            </w:tcMar>
+            <w:vAlign w:val="center"/>
+          </w:tcPr>
+          <w:p>
+            <w:pPr>
+              <w:spacing w:after="40" w:line="260"/>
+            </w:pPr>
+            <w:r>
+              <w:rPr>
+                <w:rFonts w:ascii="Calibri" w:cs="Calibri" w:eastAsia="Calibri" w:hAnsi="Calibri"/>
+                <w:b w:val="false"/>
+                <w:bCs w:val="false"/>
+                <w:color w:val="000000"/>
+                <w:sz w:val="20"/>
+                <w:szCs w:val="20"/>
+              </w:rPr>
+              <w:t xml:space="preserve">Stage 2</w:t>
+            </w:r>
+          </w:p>
+        </w:tc>
+        <w:tc>
+          <w:tcPr>
+            <w:tcW w:type="dxa" w:w="2150"/>
+            <w:tcBorders>
+              <w:top w:val="single" w:color="D5DCE4" w:sz="4"/>
+              <w:left w:val="single" w:color="D5DCE4" w:sz="4"/>
+              <w:bottom w:val="single" w:color="D5DCE4" w:sz="4"/>
+              <w:right w:val="single" w:color="D5DCE4" w:sz="4"/>
+            </w:tcBorders>
+            <w:tcMar>
+              <w:top w:type="dxa" w:w="60"/>
+              <w:left w:type="dxa" w:w="100"/>
+              <w:bottom w:type="dxa" w:w="60"/>
+              <w:right w:type="dxa" w:w="100"/>
+            </w:tcMar>
+            <w:vAlign w:val="center"/>
+          </w:tcPr>
+          <w:p>
+            <w:pPr>
+              <w:spacing w:after="40" w:line="260"/>
+            </w:pPr>
+            <w:r>
+              <w:rPr>
+                <w:rFonts w:ascii="Calibri" w:cs="Calibri" w:eastAsia="Calibri" w:hAnsi="Calibri"/>
+                <w:b w:val="false"/>
+                <w:bCs w:val="false"/>
+                <w:color w:val="000000"/>
+                <w:sz w:val="20"/>
+                <w:szCs w:val="20"/>
+              </w:rPr>
+              <w:t xml:space="preserve">Does feature engineering add anything?</w:t>
+            </w:r>
+          </w:p>
+        </w:tc>
+        <w:tc>
+          <w:tcPr>
+            <w:tcW w:type="dxa" w:w="2200"/>
+            <w:tcBorders>
+              <w:top w:val="single" w:color="D5DCE4" w:sz="4"/>
+              <w:left w:val="single" w:color="D5DCE4" w:sz="4"/>
+              <w:bottom w:val="single" w:color="D5DCE4" w:sz="4"/>
+              <w:right w:val="single" w:color="D5DCE4" w:sz="4"/>
+            </w:tcBorders>
+            <w:tcMar>
+              <w:top w:type="dxa" w:w="60"/>
+              <w:left w:type="dxa" w:w="100"/>
+              <w:bottom w:type="dxa" w:w="60"/>
+              <w:right w:type="dxa" w:w="100"/>
+            </w:tcMar>
+            <w:vAlign w:val="center"/>
+          </w:tcPr>
+          <w:p>
+            <w:pPr>
+              <w:spacing w:after="40" w:line="260"/>
+            </w:pPr>
+            <w:r>
+              <w:rPr>
+                <w:rFonts w:ascii="Calibri" w:cs="Calibri" w:eastAsia="Calibri" w:hAnsi="Calibri"/>
+                <w:b w:val="false"/>
+                <w:bCs w:val="false"/>
+                <w:color w:val="000000"/>
+                <w:sz w:val="20"/>
+                <w:szCs w:val="20"/>
+              </w:rPr>
+              <w:t xml:space="preserve">Raw values, masks and ages only</w:t>
+            </w:r>
+          </w:p>
+        </w:tc>
+        <w:tc>
+          <w:tcPr>
+            <w:tcW w:type="dxa" w:w="1900"/>
+            <w:tcBorders>
+              <w:top w:val="single" w:color="D5DCE4" w:sz="4"/>
+              <w:left w:val="single" w:color="D5DCE4" w:sz="4"/>
+              <w:bottom w:val="single" w:color="D5DCE4" w:sz="4"/>
+              <w:right w:val="single" w:color="D5DCE4" w:sz="4"/>
+            </w:tcBorders>
+            <w:tcMar>
+              <w:top w:type="dxa" w:w="60"/>
+              <w:left w:type="dxa" w:w="100"/>
+              <w:bottom w:type="dxa" w:w="60"/>
+              <w:right w:type="dxa" w:w="100"/>
+            </w:tcMar>
+            <w:vAlign w:val="center"/>
+          </w:tcPr>
+          <w:p>
+            <w:pPr>
+              <w:spacing w:after="40" w:line="260"/>
+            </w:pPr>
+            <w:r>
+              <w:rPr>
+                <w:rFonts w:ascii="Calibri" w:cs="Calibri" w:eastAsia="Calibri" w:hAnsi="Calibri"/>
+                <w:b w:val="false"/>
+                <w:bCs w:val="false"/>
+                <w:color w:val="000000"/>
+                <w:sz w:val="20"/>
+                <w:szCs w:val="20"/>
+              </w:rPr>
+              <w:t xml:space="preserve">Matched engineered features on MIMIC-IV; kept as a control</w:t>
+            </w:r>
+          </w:p>
+        </w:tc>
+      </w:tr>
+      <w:tr>
+        <w:trPr>
+          <w:cantSplit/>
+        </w:trPr>
+        <w:tc>
+          <w:tcPr>
+            <w:tcW w:type="dxa" w:w="1750"/>
+            <w:tcBorders>
+              <w:top w:val="single" w:color="D5DCE4" w:sz="4"/>
+              <w:left w:val="single" w:color="D5DCE4" w:sz="4"/>
+              <w:bottom w:val="single" w:color="D5DCE4" w:sz="4"/>
+              <w:right w:val="single" w:color="D5DCE4" w:sz="4"/>
+            </w:tcBorders>
+            <w:shd w:fill="EEF3F7" w:color="auto" w:val="clear"/>
+            <w:tcMar>
+              <w:top w:type="dxa" w:w="60"/>
+              <w:left w:type="dxa" w:w="100"/>
+              <w:bottom w:type="dxa" w:w="60"/>
+              <w:right w:type="dxa" w:w="100"/>
+            </w:tcMar>
+            <w:vAlign w:val="center"/>
+          </w:tcPr>
+          <w:p>
+            <w:pPr>
+              <w:spacing w:after="40" w:line="260"/>
+            </w:pPr>
+            <w:r>
+              <w:rPr>
+                <w:rFonts w:ascii="Calibri" w:cs="Calibri" w:eastAsia="Calibri" w:hAnsi="Calibri"/>
+                <w:b w:val="false"/>
+                <w:bCs w:val="false"/>
+                <w:color w:val="000000"/>
+                <w:sz w:val="20"/>
+                <w:szCs w:val="20"/>
+              </w:rPr>
+              <w:t xml:space="preserve">Extra-label control</w:t>
+            </w:r>
+          </w:p>
+        </w:tc>
+        <w:tc>
+          <w:tcPr>
+            <w:tcW w:type="dxa" w:w="1000"/>
+            <w:tcBorders>
+              <w:top w:val="single" w:color="D5DCE4" w:sz="4"/>
+              <w:left w:val="single" w:color="D5DCE4" w:sz="4"/>
+              <w:bottom w:val="single" w:color="D5DCE4" w:sz="4"/>
+              <w:right w:val="single" w:color="D5DCE4" w:sz="4"/>
+            </w:tcBorders>
+            <w:shd w:fill="EEF3F7" w:color="auto" w:val="clear"/>
+            <w:tcMar>
+              <w:top w:type="dxa" w:w="60"/>
+              <w:left w:type="dxa" w:w="100"/>
+              <w:bottom w:type="dxa" w:w="60"/>
+              <w:right w:type="dxa" w:w="100"/>
+            </w:tcMar>
+            <w:vAlign w:val="center"/>
+          </w:tcPr>
+          <w:p>
+            <w:pPr>
+              <w:spacing w:after="40" w:line="260"/>
+            </w:pPr>
+            <w:r>
+              <w:rPr>
+                <w:rFonts w:ascii="Calibri" w:cs="Calibri" w:eastAsia="Calibri" w:hAnsi="Calibri"/>
+                <w:b w:val="false"/>
+                <w:bCs w:val="false"/>
+                <w:color w:val="000000"/>
+                <w:sz w:val="20"/>
+                <w:szCs w:val="20"/>
+              </w:rPr>
+              <w:t xml:space="preserve">Stage 2</w:t>
+            </w:r>
+          </w:p>
+        </w:tc>
+        <w:tc>
+          <w:tcPr>
+            <w:tcW w:type="dxa" w:w="2150"/>
+            <w:tcBorders>
+              <w:top w:val="single" w:color="D5DCE4" w:sz="4"/>
+              <w:left w:val="single" w:color="D5DCE4" w:sz="4"/>
+              <w:bottom w:val="single" w:color="D5DCE4" w:sz="4"/>
+              <w:right w:val="single" w:color="D5DCE4" w:sz="4"/>
+            </w:tcBorders>
+            <w:shd w:fill="EEF3F7" w:color="auto" w:val="clear"/>
+            <w:tcMar>
+              <w:top w:type="dxa" w:w="60"/>
+              <w:left w:type="dxa" w:w="100"/>
+              <w:bottom w:type="dxa" w:w="60"/>
+              <w:right w:type="dxa" w:w="100"/>
+            </w:tcMar>
+            <w:vAlign w:val="center"/>
+          </w:tcPr>
+          <w:p>
+            <w:pPr>
+              <w:spacing w:after="40" w:line="260"/>
+            </w:pPr>
+            <w:r>
+              <w:rPr>
+                <w:rFonts w:ascii="Calibri" w:cs="Calibri" w:eastAsia="Calibri" w:hAnsi="Calibri"/>
+                <w:b w:val="false"/>
+                <w:bCs w:val="false"/>
+                <w:color w:val="000000"/>
+                <w:sz w:val="20"/>
+                <w:szCs w:val="20"/>
+              </w:rPr>
+              <w:t xml:space="preserve">Is an observer gain only extra labels?</w:t>
+            </w:r>
+          </w:p>
+        </w:tc>
+        <w:tc>
+          <w:tcPr>
+            <w:tcW w:type="dxa" w:w="2200"/>
+            <w:tcBorders>
+              <w:top w:val="single" w:color="D5DCE4" w:sz="4"/>
+              <w:left w:val="single" w:color="D5DCE4" w:sz="4"/>
+              <w:bottom w:val="single" w:color="D5DCE4" w:sz="4"/>
+              <w:right w:val="single" w:color="D5DCE4" w:sz="4"/>
+            </w:tcBorders>
+            <w:shd w:fill="EEF3F7" w:color="auto" w:val="clear"/>
+            <w:tcMar>
+              <w:top w:type="dxa" w:w="60"/>
+              <w:left w:type="dxa" w:w="100"/>
+              <w:bottom w:type="dxa" w:w="60"/>
+              <w:right w:type="dxa" w:w="100"/>
+            </w:tcMar>
+            <w:vAlign w:val="center"/>
+          </w:tcPr>
+          <w:p>
+            <w:pPr>
+              <w:spacing w:after="40" w:line="260"/>
+            </w:pPr>
+            <w:r>
+              <w:rPr>
+                <w:rFonts w:ascii="Calibri" w:cs="Calibri" w:eastAsia="Calibri" w:hAnsi="Calibri"/>
+                <w:b w:val="false"/>
+                <w:bCs w:val="false"/>
+                <w:color w:val="000000"/>
+                <w:sz w:val="20"/>
+                <w:szCs w:val="20"/>
+              </w:rPr>
+              <w:t xml:space="preserve">OSTA trained on the observers' patients too</w:t>
+            </w:r>
+          </w:p>
+        </w:tc>
+        <w:tc>
+          <w:tcPr>
+            <w:tcW w:type="dxa" w:w="1900"/>
+            <w:tcBorders>
+              <w:top w:val="single" w:color="D5DCE4" w:sz="4"/>
+              <w:left w:val="single" w:color="D5DCE4" w:sz="4"/>
+              <w:bottom w:val="single" w:color="D5DCE4" w:sz="4"/>
+              <w:right w:val="single" w:color="D5DCE4" w:sz="4"/>
+            </w:tcBorders>
+            <w:shd w:fill="EEF3F7" w:color="auto" w:val="clear"/>
+            <w:tcMar>
+              <w:top w:type="dxa" w:w="60"/>
+              <w:left w:type="dxa" w:w="100"/>
+              <w:bottom w:type="dxa" w:w="60"/>
+              <w:right w:type="dxa" w:w="100"/>
+            </w:tcMar>
+            <w:vAlign w:val="center"/>
+          </w:tcPr>
+          <w:p>
+            <w:pPr>
+              <w:spacing w:after="40" w:line="260"/>
+            </w:pPr>
+            <w:r>
+              <w:rPr>
+                <w:rFonts w:ascii="Calibri" w:cs="Calibri" w:eastAsia="Calibri" w:hAnsi="Calibri"/>
+                <w:b w:val="false"/>
+                <w:bCs w:val="false"/>
+                <w:color w:val="000000"/>
+                <w:sz w:val="20"/>
+                <w:szCs w:val="20"/>
+              </w:rPr>
+              <w:t xml:space="preserve">No gain; retired</w:t>
+            </w:r>
+          </w:p>
+        </w:tc>
+      </w:tr>
+      <w:tr>
+        <w:trPr>
+          <w:cantSplit/>
+        </w:trPr>
+        <w:tc>
+          <w:tcPr>
+            <w:tcW w:type="dxa" w:w="1750"/>
+            <w:tcBorders>
+              <w:top w:val="single" w:color="D5DCE4" w:sz="4"/>
+              <w:left w:val="single" w:color="D5DCE4" w:sz="4"/>
+              <w:bottom w:val="single" w:color="D5DCE4" w:sz="4"/>
+              <w:right w:val="single" w:color="D5DCE4" w:sz="4"/>
+            </w:tcBorders>
+            <w:tcMar>
+              <w:top w:type="dxa" w:w="60"/>
+              <w:left w:type="dxa" w:w="100"/>
+              <w:bottom w:type="dxa" w:w="60"/>
+              <w:right w:type="dxa" w:w="100"/>
+            </w:tcMar>
+            <w:vAlign w:val="center"/>
+          </w:tcPr>
+          <w:p>
+            <w:pPr>
+              <w:spacing w:after="40" w:line="260"/>
+            </w:pPr>
+            <w:r>
+              <w:rPr>
+                <w:rFonts w:ascii="Calibri" w:cs="Calibri" w:eastAsia="Calibri" w:hAnsi="Calibri"/>
+                <w:b w:val="false"/>
+                <w:bCs w:val="false"/>
+                <w:color w:val="000000"/>
+                <w:sz w:val="20"/>
+                <w:szCs w:val="20"/>
+              </w:rPr>
+              <w:t xml:space="preserve">Original OSTA loss</w:t>
+            </w:r>
+          </w:p>
+        </w:tc>
+        <w:tc>
+          <w:tcPr>
+            <w:tcW w:type="dxa" w:w="1000"/>
+            <w:tcBorders>
+              <w:top w:val="single" w:color="D5DCE4" w:sz="4"/>
+              <w:left w:val="single" w:color="D5DCE4" w:sz="4"/>
+              <w:bottom w:val="single" w:color="D5DCE4" w:sz="4"/>
+              <w:right w:val="single" w:color="D5DCE4" w:sz="4"/>
+            </w:tcBorders>
+            <w:tcMar>
+              <w:top w:type="dxa" w:w="60"/>
+              <w:left w:type="dxa" w:w="100"/>
+              <w:bottom w:type="dxa" w:w="60"/>
+              <w:right w:type="dxa" w:w="100"/>
+            </w:tcMar>
+            <w:vAlign w:val="center"/>
+          </w:tcPr>
+          <w:p>
+            <w:pPr>
+              <w:spacing w:after="40" w:line="260"/>
+            </w:pPr>
+            <w:r>
+              <w:rPr>
+                <w:rFonts w:ascii="Calibri" w:cs="Calibri" w:eastAsia="Calibri" w:hAnsi="Calibri"/>
+                <w:b w:val="false"/>
+                <w:bCs w:val="false"/>
+                <w:color w:val="000000"/>
+                <w:sz w:val="20"/>
+                <w:szCs w:val="20"/>
+              </w:rPr>
+              <w:t xml:space="preserve">Stage 2</w:t>
+            </w:r>
+          </w:p>
+        </w:tc>
+        <w:tc>
+          <w:tcPr>
+            <w:tcW w:type="dxa" w:w="2150"/>
+            <w:tcBorders>
+              <w:top w:val="single" w:color="D5DCE4" w:sz="4"/>
+              <w:left w:val="single" w:color="D5DCE4" w:sz="4"/>
+              <w:bottom w:val="single" w:color="D5DCE4" w:sz="4"/>
+              <w:right w:val="single" w:color="D5DCE4" w:sz="4"/>
+            </w:tcBorders>
+            <w:tcMar>
+              <w:top w:type="dxa" w:w="60"/>
+              <w:left w:type="dxa" w:w="100"/>
+              <w:bottom w:type="dxa" w:w="60"/>
+              <w:right w:type="dxa" w:w="100"/>
+            </w:tcMar>
+            <w:vAlign w:val="center"/>
+          </w:tcPr>
+          <w:p>
+            <w:pPr>
+              <w:spacing w:after="40" w:line="260"/>
+            </w:pPr>
+            <w:r>
+              <w:rPr>
+                <w:rFonts w:ascii="Calibri" w:cs="Calibri" w:eastAsia="Calibri" w:hAnsi="Calibri"/>
+                <w:b w:val="false"/>
+                <w:bCs w:val="false"/>
+                <w:color w:val="000000"/>
+                <w:sz w:val="20"/>
+                <w:szCs w:val="20"/>
+              </w:rPr>
+              <w:t xml:space="preserve">Fidelity to the original OSTA</w:t>
+            </w:r>
+          </w:p>
+        </w:tc>
+        <w:tc>
+          <w:tcPr>
+            <w:tcW w:type="dxa" w:w="2200"/>
+            <w:tcBorders>
+              <w:top w:val="single" w:color="D5DCE4" w:sz="4"/>
+              <w:left w:val="single" w:color="D5DCE4" w:sz="4"/>
+              <w:bottom w:val="single" w:color="D5DCE4" w:sz="4"/>
+              <w:right w:val="single" w:color="D5DCE4" w:sz="4"/>
+            </w:tcBorders>
+            <w:tcMar>
+              <w:top w:type="dxa" w:w="60"/>
+              <w:left w:type="dxa" w:w="100"/>
+              <w:bottom w:type="dxa" w:w="60"/>
+              <w:right w:type="dxa" w:w="100"/>
+            </w:tcMar>
+            <w:vAlign w:val="center"/>
+          </w:tcPr>
+          <w:p>
+            <w:pPr>
+              <w:spacing w:after="40" w:line="260"/>
+            </w:pPr>
+            <w:r>
+              <w:rPr>
+                <w:rFonts w:ascii="Calibri" w:cs="Calibri" w:eastAsia="Calibri" w:hAnsi="Calibri"/>
+                <w:b w:val="false"/>
+                <w:bCs w:val="false"/>
+                <w:color w:val="000000"/>
+                <w:sz w:val="20"/>
+                <w:szCs w:val="20"/>
+              </w:rPr>
+              <w:t xml:space="preserve">Focal loss, time weights, organ terms</w:t>
+            </w:r>
+          </w:p>
+        </w:tc>
+        <w:tc>
+          <w:tcPr>
+            <w:tcW w:type="dxa" w:w="1900"/>
+            <w:tcBorders>
+              <w:top w:val="single" w:color="D5DCE4" w:sz="4"/>
+              <w:left w:val="single" w:color="D5DCE4" w:sz="4"/>
+              <w:bottom w:val="single" w:color="D5DCE4" w:sz="4"/>
+              <w:right w:val="single" w:color="D5DCE4" w:sz="4"/>
+            </w:tcBorders>
+            <w:tcMar>
+              <w:top w:type="dxa" w:w="60"/>
+              <w:left w:type="dxa" w:w="100"/>
+              <w:bottom w:type="dxa" w:w="60"/>
+              <w:right w:type="dxa" w:w="100"/>
+            </w:tcMar>
+            <w:vAlign w:val="center"/>
+          </w:tcPr>
+          <w:p>
+            <w:pPr>
+              <w:spacing w:after="40" w:line="260"/>
+            </w:pPr>
+            <w:r>
+              <w:rPr>
+                <w:rFonts w:ascii="Calibri" w:cs="Calibri" w:eastAsia="Calibri" w:hAnsi="Calibri"/>
+                <w:b w:val="false"/>
+                <w:bCs w:val="false"/>
+                <w:color w:val="000000"/>
+                <w:sz w:val="20"/>
+                <w:szCs w:val="20"/>
+              </w:rPr>
+              <w:t xml:space="preserve">No gain over cross-entropy; retired</w:t>
+            </w:r>
+          </w:p>
+        </w:tc>
+      </w:tr>
+      <w:tr>
+        <w:trPr>
+          <w:cantSplit/>
+        </w:trPr>
+        <w:tc>
+          <w:tcPr>
+            <w:tcW w:type="dxa" w:w="1750"/>
+            <w:tcBorders>
+              <w:top w:val="single" w:color="D5DCE4" w:sz="4"/>
+              <w:left w:val="single" w:color="D5DCE4" w:sz="4"/>
+              <w:bottom w:val="single" w:color="D5DCE4" w:sz="4"/>
+              <w:right w:val="single" w:color="D5DCE4" w:sz="4"/>
+            </w:tcBorders>
+            <w:shd w:fill="EEF3F7" w:color="auto" w:val="clear"/>
+            <w:tcMar>
+              <w:top w:type="dxa" w:w="60"/>
+              <w:left w:type="dxa" w:w="100"/>
+              <w:bottom w:type="dxa" w:w="60"/>
+              <w:right w:type="dxa" w:w="100"/>
+            </w:tcMar>
+            <w:vAlign w:val="center"/>
+          </w:tcPr>
+          <w:p>
+            <w:pPr>
+              <w:spacing w:after="40" w:line="260"/>
+            </w:pPr>
+            <w:r>
+              <w:rPr>
+                <w:rFonts w:ascii="Calibri" w:cs="Calibri" w:eastAsia="Calibri" w:hAnsi="Calibri"/>
+                <w:b w:val="false"/>
+                <w:bCs w:val="false"/>
+                <w:color w:val="000000"/>
+                <w:sz w:val="20"/>
+                <w:szCs w:val="20"/>
+              </w:rPr>
+              <w:t xml:space="preserve">Logistic regression</w:t>
+            </w:r>
+          </w:p>
+        </w:tc>
+        <w:tc>
+          <w:tcPr>
+            <w:tcW w:type="dxa" w:w="1000"/>
+            <w:tcBorders>
+              <w:top w:val="single" w:color="D5DCE4" w:sz="4"/>
+              <w:left w:val="single" w:color="D5DCE4" w:sz="4"/>
+              <w:bottom w:val="single" w:color="D5DCE4" w:sz="4"/>
+              <w:right w:val="single" w:color="D5DCE4" w:sz="4"/>
+            </w:tcBorders>
+            <w:shd w:fill="EEF3F7" w:color="auto" w:val="clear"/>
+            <w:tcMar>
+              <w:top w:type="dxa" w:w="60"/>
+              <w:left w:type="dxa" w:w="100"/>
+              <w:bottom w:type="dxa" w:w="60"/>
+              <w:right w:type="dxa" w:w="100"/>
+            </w:tcMar>
+            <w:vAlign w:val="center"/>
+          </w:tcPr>
+          <w:p>
+            <w:pPr>
+              <w:spacing w:after="40" w:line="260"/>
+            </w:pPr>
+            <w:r>
+              <w:rPr>
+                <w:rFonts w:ascii="Calibri" w:cs="Calibri" w:eastAsia="Calibri" w:hAnsi="Calibri"/>
+                <w:b w:val="false"/>
+                <w:bCs w:val="false"/>
+                <w:color w:val="000000"/>
+                <w:sz w:val="20"/>
+                <w:szCs w:val="20"/>
+              </w:rPr>
+              <w:t xml:space="preserve">All</w:t>
+            </w:r>
+          </w:p>
+        </w:tc>
+        <w:tc>
+          <w:tcPr>
+            <w:tcW w:type="dxa" w:w="2150"/>
+            <w:tcBorders>
+              <w:top w:val="single" w:color="D5DCE4" w:sz="4"/>
+              <w:left w:val="single" w:color="D5DCE4" w:sz="4"/>
+              <w:bottom w:val="single" w:color="D5DCE4" w:sz="4"/>
+              <w:right w:val="single" w:color="D5DCE4" w:sz="4"/>
+            </w:tcBorders>
+            <w:shd w:fill="EEF3F7" w:color="auto" w:val="clear"/>
+            <w:tcMar>
+              <w:top w:type="dxa" w:w="60"/>
+              <w:left w:type="dxa" w:w="100"/>
+              <w:bottom w:type="dxa" w:w="60"/>
+              <w:right w:type="dxa" w:w="100"/>
+            </w:tcMar>
+            <w:vAlign w:val="center"/>
+          </w:tcPr>
+          <w:p>
+            <w:pPr>
+              <w:spacing w:after="40" w:line="260"/>
+            </w:pPr>
+            <w:r>
+              <w:rPr>
+                <w:rFonts w:ascii="Calibri" w:cs="Calibri" w:eastAsia="Calibri" w:hAnsi="Calibri"/>
+                <w:b w:val="false"/>
+                <w:bCs w:val="false"/>
+                <w:color w:val="000000"/>
+                <w:sz w:val="20"/>
+                <w:szCs w:val="20"/>
+              </w:rPr>
+              <w:t xml:space="preserve">Transparent baseline</w:t>
+            </w:r>
+          </w:p>
+        </w:tc>
+        <w:tc>
+          <w:tcPr>
+            <w:tcW w:type="dxa" w:w="2200"/>
+            <w:tcBorders>
+              <w:top w:val="single" w:color="D5DCE4" w:sz="4"/>
+              <w:left w:val="single" w:color="D5DCE4" w:sz="4"/>
+              <w:bottom w:val="single" w:color="D5DCE4" w:sz="4"/>
+              <w:right w:val="single" w:color="D5DCE4" w:sz="4"/>
+            </w:tcBorders>
+            <w:shd w:fill="EEF3F7" w:color="auto" w:val="clear"/>
+            <w:tcMar>
+              <w:top w:type="dxa" w:w="60"/>
+              <w:left w:type="dxa" w:w="100"/>
+              <w:bottom w:type="dxa" w:w="60"/>
+              <w:right w:type="dxa" w:w="100"/>
+            </w:tcMar>
+            <w:vAlign w:val="center"/>
+          </w:tcPr>
+          <w:p>
+            <w:pPr>
+              <w:spacing w:after="40" w:line="260"/>
+            </w:pPr>
+            <w:r>
+              <w:rPr>
+                <w:rFonts w:ascii="Calibri" w:cs="Calibri" w:eastAsia="Calibri" w:hAnsi="Calibri"/>
+                <w:b w:val="false"/>
+                <w:bCs w:val="false"/>
+                <w:color w:val="000000"/>
+                <w:sz w:val="20"/>
+                <w:szCs w:val="20"/>
+              </w:rPr>
+              <w:t xml:space="preserve">Linear, one hour at a time</w:t>
+            </w:r>
+          </w:p>
+        </w:tc>
+        <w:tc>
+          <w:tcPr>
+            <w:tcW w:type="dxa" w:w="1900"/>
+            <w:tcBorders>
+              <w:top w:val="single" w:color="D5DCE4" w:sz="4"/>
+              <w:left w:val="single" w:color="D5DCE4" w:sz="4"/>
+              <w:bottom w:val="single" w:color="D5DCE4" w:sz="4"/>
+              <w:right w:val="single" w:color="D5DCE4" w:sz="4"/>
+            </w:tcBorders>
+            <w:shd w:fill="EEF3F7" w:color="auto" w:val="clear"/>
+            <w:tcMar>
+              <w:top w:type="dxa" w:w="60"/>
+              <w:left w:type="dxa" w:w="100"/>
+              <w:bottom w:type="dxa" w:w="60"/>
+              <w:right w:type="dxa" w:w="100"/>
+            </w:tcMar>
+            <w:vAlign w:val="center"/>
+          </w:tcPr>
+          <w:p>
+            <w:pPr>
+              <w:spacing w:after="40" w:line="260"/>
+            </w:pPr>
+            <w:r>
+              <w:rPr>
+                <w:rFonts w:ascii="Calibri" w:cs="Calibri" w:eastAsia="Calibri" w:hAnsi="Calibri"/>
+                <w:b w:val="false"/>
+                <w:bCs w:val="false"/>
+                <w:color w:val="000000"/>
+                <w:sz w:val="20"/>
+                <w:szCs w:val="20"/>
+              </w:rPr>
+              <w:t xml:space="preserve">Kept</w:t>
+            </w:r>
+          </w:p>
+        </w:tc>
+      </w:tr>
+      <w:tr>
+        <w:trPr>
+          <w:cantSplit/>
+        </w:trPr>
+        <w:tc>
+          <w:tcPr>
+            <w:tcW w:type="dxa" w:w="1750"/>
+            <w:tcBorders>
+              <w:top w:val="single" w:color="D5DCE4" w:sz="4"/>
+              <w:left w:val="single" w:color="D5DCE4" w:sz="4"/>
+              <w:bottom w:val="single" w:color="D5DCE4" w:sz="4"/>
+              <w:right w:val="single" w:color="D5DCE4" w:sz="4"/>
+            </w:tcBorders>
+            <w:tcMar>
+              <w:top w:type="dxa" w:w="60"/>
+              <w:left w:type="dxa" w:w="100"/>
+              <w:bottom w:type="dxa" w:w="60"/>
+              <w:right w:type="dxa" w:w="100"/>
+            </w:tcMar>
+            <w:vAlign w:val="center"/>
+          </w:tcPr>
+          <w:p>
+            <w:pPr>
+              <w:spacing w:after="40" w:line="260"/>
+            </w:pPr>
+            <w:r>
+              <w:rPr>
+                <w:rFonts w:ascii="Calibri" w:cs="Calibri" w:eastAsia="Calibri" w:hAnsi="Calibri"/>
+                <w:b w:val="false"/>
+                <w:bCs w:val="false"/>
+                <w:color w:val="000000"/>
+                <w:sz w:val="20"/>
+                <w:szCs w:val="20"/>
+              </w:rPr>
+              <w:t xml:space="preserve">Boosted trees</w:t>
+            </w:r>
+          </w:p>
+        </w:tc>
+        <w:tc>
+          <w:tcPr>
+            <w:tcW w:type="dxa" w:w="1000"/>
+            <w:tcBorders>
+              <w:top w:val="single" w:color="D5DCE4" w:sz="4"/>
+              <w:left w:val="single" w:color="D5DCE4" w:sz="4"/>
+              <w:bottom w:val="single" w:color="D5DCE4" w:sz="4"/>
+              <w:right w:val="single" w:color="D5DCE4" w:sz="4"/>
+            </w:tcBorders>
+            <w:tcMar>
+              <w:top w:type="dxa" w:w="60"/>
+              <w:left w:type="dxa" w:w="100"/>
+              <w:bottom w:type="dxa" w:w="60"/>
+              <w:right w:type="dxa" w:w="100"/>
+            </w:tcMar>
+            <w:vAlign w:val="center"/>
+          </w:tcPr>
+          <w:p>
+            <w:pPr>
+              <w:spacing w:after="40" w:line="260"/>
+            </w:pPr>
+            <w:r>
+              <w:rPr>
+                <w:rFonts w:ascii="Calibri" w:cs="Calibri" w:eastAsia="Calibri" w:hAnsi="Calibri"/>
+                <w:b w:val="false"/>
+                <w:bCs w:val="false"/>
+                <w:color w:val="000000"/>
+                <w:sz w:val="20"/>
+                <w:szCs w:val="20"/>
+              </w:rPr>
+              <w:t xml:space="preserve">All</w:t>
+            </w:r>
+          </w:p>
+        </w:tc>
+        <w:tc>
+          <w:tcPr>
+            <w:tcW w:type="dxa" w:w="2150"/>
+            <w:tcBorders>
+              <w:top w:val="single" w:color="D5DCE4" w:sz="4"/>
+              <w:left w:val="single" w:color="D5DCE4" w:sz="4"/>
+              <w:bottom w:val="single" w:color="D5DCE4" w:sz="4"/>
+              <w:right w:val="single" w:color="D5DCE4" w:sz="4"/>
+            </w:tcBorders>
+            <w:tcMar>
+              <w:top w:type="dxa" w:w="60"/>
+              <w:left w:type="dxa" w:w="100"/>
+              <w:bottom w:type="dxa" w:w="60"/>
+              <w:right w:type="dxa" w:w="100"/>
+            </w:tcMar>
+            <w:vAlign w:val="center"/>
+          </w:tcPr>
+          <w:p>
+            <w:pPr>
+              <w:spacing w:after="40" w:line="260"/>
+            </w:pPr>
+            <w:r>
+              <w:rPr>
+                <w:rFonts w:ascii="Calibri" w:cs="Calibri" w:eastAsia="Calibri" w:hAnsi="Calibri"/>
+                <w:b w:val="false"/>
+                <w:bCs w:val="false"/>
+                <w:color w:val="000000"/>
+                <w:sz w:val="20"/>
+                <w:szCs w:val="20"/>
+              </w:rPr>
+              <w:t xml:space="preserve">Strong tabular baseline (Friedman, 2001)</w:t>
+            </w:r>
+          </w:p>
+        </w:tc>
+        <w:tc>
+          <w:tcPr>
+            <w:tcW w:type="dxa" w:w="2200"/>
+            <w:tcBorders>
+              <w:top w:val="single" w:color="D5DCE4" w:sz="4"/>
+              <w:left w:val="single" w:color="D5DCE4" w:sz="4"/>
+              <w:bottom w:val="single" w:color="D5DCE4" w:sz="4"/>
+              <w:right w:val="single" w:color="D5DCE4" w:sz="4"/>
+            </w:tcBorders>
+            <w:tcMar>
+              <w:top w:type="dxa" w:w="60"/>
+              <w:left w:type="dxa" w:w="100"/>
+              <w:bottom w:type="dxa" w:w="60"/>
+              <w:right w:type="dxa" w:w="100"/>
+            </w:tcMar>
+            <w:vAlign w:val="center"/>
+          </w:tcPr>
+          <w:p>
+            <w:pPr>
+              <w:spacing w:after="40" w:line="260"/>
+            </w:pPr>
+            <w:r>
+              <w:rPr>
+                <w:rFonts w:ascii="Calibri" w:cs="Calibri" w:eastAsia="Calibri" w:hAnsi="Calibri"/>
+                <w:b w:val="false"/>
+                <w:bCs w:val="false"/>
+                <w:color w:val="000000"/>
+                <w:sz w:val="20"/>
+                <w:szCs w:val="20"/>
+              </w:rPr>
+              <w:t xml:space="preserve">Non-linear, one hour at a time</w:t>
+            </w:r>
+          </w:p>
+        </w:tc>
+        <w:tc>
+          <w:tcPr>
+            <w:tcW w:type="dxa" w:w="1900"/>
+            <w:tcBorders>
+              <w:top w:val="single" w:color="D5DCE4" w:sz="4"/>
+              <w:left w:val="single" w:color="D5DCE4" w:sz="4"/>
+              <w:bottom w:val="single" w:color="D5DCE4" w:sz="4"/>
+              <w:right w:val="single" w:color="D5DCE4" w:sz="4"/>
+            </w:tcBorders>
+            <w:tcMar>
+              <w:top w:type="dxa" w:w="60"/>
+              <w:left w:type="dxa" w:w="100"/>
+              <w:bottom w:type="dxa" w:w="60"/>
+              <w:right w:type="dxa" w:w="100"/>
+            </w:tcMar>
+            <w:vAlign w:val="center"/>
+          </w:tcPr>
+          <w:p>
+            <w:pPr>
+              <w:spacing w:after="40" w:line="260"/>
+            </w:pPr>
+            <w:r>
+              <w:rPr>
+                <w:rFonts w:ascii="Calibri" w:cs="Calibri" w:eastAsia="Calibri" w:hAnsi="Calibri"/>
+                <w:b w:val="false"/>
+                <w:bCs w:val="false"/>
+                <w:color w:val="000000"/>
+                <w:sz w:val="20"/>
+                <w:szCs w:val="20"/>
+              </w:rPr>
+              <w:t xml:space="preserve">Kept</w:t>
+            </w:r>
+          </w:p>
+        </w:tc>
+      </w:tr>
+      <w:tr>
+        <w:trPr>
+          <w:cantSplit/>
+        </w:trPr>
+        <w:tc>
+          <w:tcPr>
+            <w:tcW w:type="dxa" w:w="1750"/>
+            <w:tcBorders>
+              <w:top w:val="single" w:color="D5DCE4" w:sz="4"/>
+              <w:left w:val="single" w:color="D5DCE4" w:sz="4"/>
+              <w:bottom w:val="single" w:color="D5DCE4" w:sz="4"/>
+              <w:right w:val="single" w:color="D5DCE4" w:sz="4"/>
+            </w:tcBorders>
+            <w:shd w:fill="EEF3F7" w:color="auto" w:val="clear"/>
+            <w:tcMar>
+              <w:top w:type="dxa" w:w="60"/>
+              <w:left w:type="dxa" w:w="100"/>
+              <w:bottom w:type="dxa" w:w="60"/>
+              <w:right w:type="dxa" w:w="100"/>
+            </w:tcMar>
+            <w:vAlign w:val="center"/>
+          </w:tcPr>
+          <w:p>
+            <w:pPr>
+              <w:spacing w:after="40" w:line="260"/>
+            </w:pPr>
+            <w:r>
+              <w:rPr>
+                <w:rFonts w:ascii="Calibri" w:cs="Calibri" w:eastAsia="Calibri" w:hAnsi="Calibri"/>
+                <w:b w:val="false"/>
+                <w:bCs w:val="false"/>
+                <w:color w:val="000000"/>
+                <w:sz w:val="20"/>
+                <w:szCs w:val="20"/>
+              </w:rPr>
+              <w:t xml:space="preserve">Flat OSTA</w:t>
+            </w:r>
+          </w:p>
+        </w:tc>
+        <w:tc>
+          <w:tcPr>
+            <w:tcW w:type="dxa" w:w="1000"/>
+            <w:tcBorders>
+              <w:top w:val="single" w:color="D5DCE4" w:sz="4"/>
+              <w:left w:val="single" w:color="D5DCE4" w:sz="4"/>
+              <w:bottom w:val="single" w:color="D5DCE4" w:sz="4"/>
+              <w:right w:val="single" w:color="D5DCE4" w:sz="4"/>
+            </w:tcBorders>
+            <w:shd w:fill="EEF3F7" w:color="auto" w:val="clear"/>
+            <w:tcMar>
+              <w:top w:type="dxa" w:w="60"/>
+              <w:left w:type="dxa" w:w="100"/>
+              <w:bottom w:type="dxa" w:w="60"/>
+              <w:right w:type="dxa" w:w="100"/>
+            </w:tcMar>
+            <w:vAlign w:val="center"/>
+          </w:tcPr>
+          <w:p>
+            <w:pPr>
+              <w:spacing w:after="40" w:line="260"/>
+            </w:pPr>
+            <w:r>
+              <w:rPr>
+                <w:rFonts w:ascii="Calibri" w:cs="Calibri" w:eastAsia="Calibri" w:hAnsi="Calibri"/>
+                <w:b w:val="false"/>
+                <w:bCs w:val="false"/>
+                <w:color w:val="000000"/>
+                <w:sz w:val="20"/>
+                <w:szCs w:val="20"/>
+              </w:rPr>
+              <w:t xml:space="preserve">Stage 3</w:t>
+            </w:r>
+          </w:p>
+        </w:tc>
+        <w:tc>
+          <w:tcPr>
+            <w:tcW w:type="dxa" w:w="2150"/>
+            <w:tcBorders>
+              <w:top w:val="single" w:color="D5DCE4" w:sz="4"/>
+              <w:left w:val="single" w:color="D5DCE4" w:sz="4"/>
+              <w:bottom w:val="single" w:color="D5DCE4" w:sz="4"/>
+              <w:right w:val="single" w:color="D5DCE4" w:sz="4"/>
+            </w:tcBorders>
+            <w:shd w:fill="EEF3F7" w:color="auto" w:val="clear"/>
+            <w:tcMar>
+              <w:top w:type="dxa" w:w="60"/>
+              <w:left w:type="dxa" w:w="100"/>
+              <w:bottom w:type="dxa" w:w="60"/>
+              <w:right w:type="dxa" w:w="100"/>
+            </w:tcMar>
+            <w:vAlign w:val="center"/>
+          </w:tcPr>
+          <w:p>
+            <w:pPr>
+              <w:spacing w:after="40" w:line="260"/>
+            </w:pPr>
+            <w:r>
+              <w:rPr>
+                <w:rFonts w:ascii="Calibri" w:cs="Calibri" w:eastAsia="Calibri" w:hAnsi="Calibri"/>
+                <w:b w:val="false"/>
+                <w:bCs w:val="false"/>
+                <w:color w:val="000000"/>
+                <w:sz w:val="20"/>
+                <w:szCs w:val="20"/>
+              </w:rPr>
+              <w:t xml:space="preserve">Test the organ hypothesis directly</w:t>
+            </w:r>
+          </w:p>
+        </w:tc>
+        <w:tc>
+          <w:tcPr>
+            <w:tcW w:type="dxa" w:w="2200"/>
+            <w:tcBorders>
+              <w:top w:val="single" w:color="D5DCE4" w:sz="4"/>
+              <w:left w:val="single" w:color="D5DCE4" w:sz="4"/>
+              <w:bottom w:val="single" w:color="D5DCE4" w:sz="4"/>
+              <w:right w:val="single" w:color="D5DCE4" w:sz="4"/>
+            </w:tcBorders>
+            <w:shd w:fill="EEF3F7" w:color="auto" w:val="clear"/>
+            <w:tcMar>
+              <w:top w:type="dxa" w:w="60"/>
+              <w:left w:type="dxa" w:w="100"/>
+              <w:bottom w:type="dxa" w:w="60"/>
+              <w:right w:type="dxa" w:w="100"/>
+            </w:tcMar>
+            <w:vAlign w:val="center"/>
+          </w:tcPr>
+          <w:p>
+            <w:pPr>
+              <w:spacing w:after="40" w:line="260"/>
+            </w:pPr>
+            <w:r>
+              <w:rPr>
+                <w:rFonts w:ascii="Calibri" w:cs="Calibri" w:eastAsia="Calibri" w:hAnsi="Calibri"/>
+                <w:b w:val="false"/>
+                <w:bCs w:val="false"/>
+                <w:color w:val="000000"/>
+                <w:sz w:val="20"/>
+                <w:szCs w:val="20"/>
+              </w:rPr>
+              <w:t xml:space="preserve">OSTA without organ grouping</w:t>
+            </w:r>
+          </w:p>
+        </w:tc>
+        <w:tc>
+          <w:tcPr>
+            <w:tcW w:type="dxa" w:w="1900"/>
+            <w:tcBorders>
+              <w:top w:val="single" w:color="D5DCE4" w:sz="4"/>
+              <w:left w:val="single" w:color="D5DCE4" w:sz="4"/>
+              <w:bottom w:val="single" w:color="D5DCE4" w:sz="4"/>
+              <w:right w:val="single" w:color="D5DCE4" w:sz="4"/>
+            </w:tcBorders>
+            <w:shd w:fill="EEF3F7" w:color="auto" w:val="clear"/>
+            <w:tcMar>
+              <w:top w:type="dxa" w:w="60"/>
+              <w:left w:type="dxa" w:w="100"/>
+              <w:bottom w:type="dxa" w:w="60"/>
+              <w:right w:type="dxa" w:w="100"/>
+            </w:tcMar>
+            <w:vAlign w:val="center"/>
+          </w:tcPr>
+          <w:p>
+            <w:pPr>
+              <w:spacing w:after="40" w:line="260"/>
+            </w:pPr>
+            <w:r>
+              <w:rPr>
+                <w:rFonts w:ascii="Calibri" w:cs="Calibri" w:eastAsia="Calibri" w:hAnsi="Calibri"/>
+                <w:b w:val="false"/>
+                <w:bCs w:val="false"/>
+                <w:color w:val="000000"/>
+                <w:sz w:val="20"/>
+                <w:szCs w:val="20"/>
+              </w:rPr>
+              <w:t xml:space="preserve">Beat OSTA on validation; shortlisted</w:t>
+            </w:r>
+          </w:p>
+        </w:tc>
+      </w:tr>
+      <w:tr>
+        <w:trPr>
+          <w:cantSplit/>
+        </w:trPr>
+        <w:tc>
+          <w:tcPr>
+            <w:tcW w:type="dxa" w:w="1750"/>
+            <w:tcBorders>
+              <w:top w:val="single" w:color="D5DCE4" w:sz="4"/>
+              <w:left w:val="single" w:color="D5DCE4" w:sz="4"/>
+              <w:bottom w:val="single" w:color="D5DCE4" w:sz="4"/>
+              <w:right w:val="single" w:color="D5DCE4" w:sz="4"/>
+            </w:tcBorders>
+            <w:tcMar>
+              <w:top w:type="dxa" w:w="60"/>
+              <w:left w:type="dxa" w:w="100"/>
+              <w:bottom w:type="dxa" w:w="60"/>
+              <w:right w:type="dxa" w:w="100"/>
+            </w:tcMar>
+            <w:vAlign w:val="center"/>
+          </w:tcPr>
+          <w:p>
+            <w:pPr>
+              <w:spacing w:after="40" w:line="260"/>
+            </w:pPr>
+            <w:r>
+              <w:rPr>
+                <w:rFonts w:ascii="Calibri" w:cs="Calibri" w:eastAsia="Calibri" w:hAnsi="Calibri"/>
+                <w:b w:val="false"/>
+                <w:bCs w:val="false"/>
+                <w:color w:val="000000"/>
+                <w:sz w:val="20"/>
+                <w:szCs w:val="20"/>
+              </w:rPr>
+              <w:t xml:space="preserve">GRU-D</w:t>
+            </w:r>
+          </w:p>
+        </w:tc>
+        <w:tc>
+          <w:tcPr>
+            <w:tcW w:type="dxa" w:w="1000"/>
+            <w:tcBorders>
+              <w:top w:val="single" w:color="D5DCE4" w:sz="4"/>
+              <w:left w:val="single" w:color="D5DCE4" w:sz="4"/>
+              <w:bottom w:val="single" w:color="D5DCE4" w:sz="4"/>
+              <w:right w:val="single" w:color="D5DCE4" w:sz="4"/>
+            </w:tcBorders>
+            <w:tcMar>
+              <w:top w:type="dxa" w:w="60"/>
+              <w:left w:type="dxa" w:w="100"/>
+              <w:bottom w:type="dxa" w:w="60"/>
+              <w:right w:type="dxa" w:w="100"/>
+            </w:tcMar>
+            <w:vAlign w:val="center"/>
+          </w:tcPr>
+          <w:p>
+            <w:pPr>
+              <w:spacing w:after="40" w:line="260"/>
+            </w:pPr>
+            <w:r>
+              <w:rPr>
+                <w:rFonts w:ascii="Calibri" w:cs="Calibri" w:eastAsia="Calibri" w:hAnsi="Calibri"/>
+                <w:b w:val="false"/>
+                <w:bCs w:val="false"/>
+                <w:color w:val="000000"/>
+                <w:sz w:val="20"/>
+                <w:szCs w:val="20"/>
+              </w:rPr>
+              <w:t xml:space="preserve">Stage 3</w:t>
+            </w:r>
+          </w:p>
+        </w:tc>
+        <w:tc>
+          <w:tcPr>
+            <w:tcW w:type="dxa" w:w="2150"/>
+            <w:tcBorders>
+              <w:top w:val="single" w:color="D5DCE4" w:sz="4"/>
+              <w:left w:val="single" w:color="D5DCE4" w:sz="4"/>
+              <w:bottom w:val="single" w:color="D5DCE4" w:sz="4"/>
+              <w:right w:val="single" w:color="D5DCE4" w:sz="4"/>
+            </w:tcBorders>
+            <w:tcMar>
+              <w:top w:type="dxa" w:w="60"/>
+              <w:left w:type="dxa" w:w="100"/>
+              <w:bottom w:type="dxa" w:w="60"/>
+              <w:right w:type="dxa" w:w="100"/>
+            </w:tcMar>
+            <w:vAlign w:val="center"/>
+          </w:tcPr>
+          <w:p>
+            <w:pPr>
+              <w:spacing w:after="40" w:line="260"/>
+            </w:pPr>
+            <w:r>
+              <w:rPr>
+                <w:rFonts w:ascii="Calibri" w:cs="Calibri" w:eastAsia="Calibri" w:hAnsi="Calibri"/>
+                <w:b w:val="false"/>
+                <w:bCs w:val="false"/>
+                <w:color w:val="000000"/>
+                <w:sz w:val="20"/>
+                <w:szCs w:val="20"/>
+              </w:rPr>
+              <w:t xml:space="preserve">Built for irregular, stale ICU data</w:t>
+            </w:r>
+          </w:p>
+        </w:tc>
+        <w:tc>
+          <w:tcPr>
+            <w:tcW w:type="dxa" w:w="2200"/>
+            <w:tcBorders>
+              <w:top w:val="single" w:color="D5DCE4" w:sz="4"/>
+              <w:left w:val="single" w:color="D5DCE4" w:sz="4"/>
+              <w:bottom w:val="single" w:color="D5DCE4" w:sz="4"/>
+              <w:right w:val="single" w:color="D5DCE4" w:sz="4"/>
+            </w:tcBorders>
+            <w:tcMar>
+              <w:top w:type="dxa" w:w="60"/>
+              <w:left w:type="dxa" w:w="100"/>
+              <w:bottom w:type="dxa" w:w="60"/>
+              <w:right w:type="dxa" w:w="100"/>
+            </w:tcMar>
+            <w:vAlign w:val="center"/>
+          </w:tcPr>
+          <w:p>
+            <w:pPr>
+              <w:spacing w:after="40" w:line="260"/>
+            </w:pPr>
+            <w:r>
+              <w:rPr>
+                <w:rFonts w:ascii="Calibri" w:cs="Calibri" w:eastAsia="Calibri" w:hAnsi="Calibri"/>
+                <w:b w:val="false"/>
+                <w:bCs w:val="false"/>
+                <w:color w:val="000000"/>
+                <w:sz w:val="20"/>
+                <w:szCs w:val="20"/>
+              </w:rPr>
+              <w:t xml:space="preserve">Recurrent; learned decay of old values</w:t>
+            </w:r>
+          </w:p>
+        </w:tc>
+        <w:tc>
+          <w:tcPr>
+            <w:tcW w:type="dxa" w:w="1900"/>
+            <w:tcBorders>
+              <w:top w:val="single" w:color="D5DCE4" w:sz="4"/>
+              <w:left w:val="single" w:color="D5DCE4" w:sz="4"/>
+              <w:bottom w:val="single" w:color="D5DCE4" w:sz="4"/>
+              <w:right w:val="single" w:color="D5DCE4" w:sz="4"/>
+            </w:tcBorders>
+            <w:tcMar>
+              <w:top w:type="dxa" w:w="60"/>
+              <w:left w:type="dxa" w:w="100"/>
+              <w:bottom w:type="dxa" w:w="60"/>
+              <w:right w:type="dxa" w:w="100"/>
+            </w:tcMar>
+            <w:vAlign w:val="center"/>
+          </w:tcPr>
+          <w:p>
+            <w:pPr>
+              <w:spacing w:after="40" w:line="260"/>
+            </w:pPr>
+            <w:r>
+              <w:rPr>
+                <w:rFonts w:ascii="Calibri" w:cs="Calibri" w:eastAsia="Calibri" w:hAnsi="Calibri"/>
+                <w:b w:val="false"/>
+                <w:bCs w:val="false"/>
+                <w:color w:val="000000"/>
+                <w:sz w:val="20"/>
+                <w:szCs w:val="20"/>
+              </w:rPr>
+              <w:t xml:space="preserve">Shortlisted</w:t>
+            </w:r>
+          </w:p>
+        </w:tc>
+      </w:tr>
+      <w:tr>
+        <w:trPr>
+          <w:cantSplit/>
+        </w:trPr>
+        <w:tc>
+          <w:tcPr>
+            <w:tcW w:type="dxa" w:w="1750"/>
+            <w:tcBorders>
+              <w:top w:val="single" w:color="D5DCE4" w:sz="4"/>
+              <w:left w:val="single" w:color="D5DCE4" w:sz="4"/>
+              <w:bottom w:val="single" w:color="D5DCE4" w:sz="4"/>
+              <w:right w:val="single" w:color="D5DCE4" w:sz="4"/>
+            </w:tcBorders>
+            <w:shd w:fill="EEF3F7" w:color="auto" w:val="clear"/>
+            <w:tcMar>
+              <w:top w:type="dxa" w:w="60"/>
+              <w:left w:type="dxa" w:w="100"/>
+              <w:bottom w:type="dxa" w:w="60"/>
+              <w:right w:type="dxa" w:w="100"/>
+            </w:tcMar>
+            <w:vAlign w:val="center"/>
+          </w:tcPr>
+          <w:p>
+            <w:pPr>
+              <w:spacing w:after="40" w:line="260"/>
+            </w:pPr>
+            <w:r>
+              <w:rPr>
+                <w:rFonts w:ascii="Calibri" w:cs="Calibri" w:eastAsia="Calibri" w:hAnsi="Calibri"/>
+                <w:b w:val="false"/>
+                <w:bCs w:val="false"/>
+                <w:color w:val="000000"/>
+                <w:sz w:val="20"/>
+                <w:szCs w:val="20"/>
+              </w:rPr>
+              <w:t xml:space="preserve">Temporal CNN</w:t>
+            </w:r>
+          </w:p>
+        </w:tc>
+        <w:tc>
+          <w:tcPr>
+            <w:tcW w:type="dxa" w:w="1000"/>
+            <w:tcBorders>
+              <w:top w:val="single" w:color="D5DCE4" w:sz="4"/>
+              <w:left w:val="single" w:color="D5DCE4" w:sz="4"/>
+              <w:bottom w:val="single" w:color="D5DCE4" w:sz="4"/>
+              <w:right w:val="single" w:color="D5DCE4" w:sz="4"/>
+            </w:tcBorders>
+            <w:shd w:fill="EEF3F7" w:color="auto" w:val="clear"/>
+            <w:tcMar>
+              <w:top w:type="dxa" w:w="60"/>
+              <w:left w:type="dxa" w:w="100"/>
+              <w:bottom w:type="dxa" w:w="60"/>
+              <w:right w:type="dxa" w:w="100"/>
+            </w:tcMar>
+            <w:vAlign w:val="center"/>
+          </w:tcPr>
+          <w:p>
+            <w:pPr>
+              <w:spacing w:after="40" w:line="260"/>
+            </w:pPr>
+            <w:r>
+              <w:rPr>
+                <w:rFonts w:ascii="Calibri" w:cs="Calibri" w:eastAsia="Calibri" w:hAnsi="Calibri"/>
+                <w:b w:val="false"/>
+                <w:bCs w:val="false"/>
+                <w:color w:val="000000"/>
+                <w:sz w:val="20"/>
+                <w:szCs w:val="20"/>
+              </w:rPr>
+              <w:t xml:space="preserve">Stage 3</w:t>
+            </w:r>
+          </w:p>
+        </w:tc>
+        <w:tc>
+          <w:tcPr>
+            <w:tcW w:type="dxa" w:w="2150"/>
+            <w:tcBorders>
+              <w:top w:val="single" w:color="D5DCE4" w:sz="4"/>
+              <w:left w:val="single" w:color="D5DCE4" w:sz="4"/>
+              <w:bottom w:val="single" w:color="D5DCE4" w:sz="4"/>
+              <w:right w:val="single" w:color="D5DCE4" w:sz="4"/>
+            </w:tcBorders>
+            <w:shd w:fill="EEF3F7" w:color="auto" w:val="clear"/>
+            <w:tcMar>
+              <w:top w:type="dxa" w:w="60"/>
+              <w:left w:type="dxa" w:w="100"/>
+              <w:bottom w:type="dxa" w:w="60"/>
+              <w:right w:type="dxa" w:w="100"/>
+            </w:tcMar>
+            <w:vAlign w:val="center"/>
+          </w:tcPr>
+          <w:p>
+            <w:pPr>
+              <w:spacing w:after="40" w:line="260"/>
+            </w:pPr>
+            <w:r>
+              <w:rPr>
+                <w:rFonts w:ascii="Calibri" w:cs="Calibri" w:eastAsia="Calibri" w:hAnsi="Calibri"/>
+                <w:b w:val="false"/>
+                <w:bCs w:val="false"/>
+                <w:color w:val="000000"/>
+                <w:sz w:val="20"/>
+                <w:szCs w:val="20"/>
+              </w:rPr>
+              <w:t xml:space="preserve">Common in the sepsis literature</w:t>
+            </w:r>
+          </w:p>
+        </w:tc>
+        <w:tc>
+          <w:tcPr>
+            <w:tcW w:type="dxa" w:w="2200"/>
+            <w:tcBorders>
+              <w:top w:val="single" w:color="D5DCE4" w:sz="4"/>
+              <w:left w:val="single" w:color="D5DCE4" w:sz="4"/>
+              <w:bottom w:val="single" w:color="D5DCE4" w:sz="4"/>
+              <w:right w:val="single" w:color="D5DCE4" w:sz="4"/>
+            </w:tcBorders>
+            <w:shd w:fill="EEF3F7" w:color="auto" w:val="clear"/>
+            <w:tcMar>
+              <w:top w:type="dxa" w:w="60"/>
+              <w:left w:type="dxa" w:w="100"/>
+              <w:bottom w:type="dxa" w:w="60"/>
+              <w:right w:type="dxa" w:w="100"/>
+            </w:tcMar>
+            <w:vAlign w:val="center"/>
+          </w:tcPr>
+          <w:p>
+            <w:pPr>
+              <w:spacing w:after="40" w:line="260"/>
+            </w:pPr>
+            <w:r>
+              <w:rPr>
+                <w:rFonts w:ascii="Calibri" w:cs="Calibri" w:eastAsia="Calibri" w:hAnsi="Calibri"/>
+                <w:b w:val="false"/>
+                <w:bCs w:val="false"/>
+                <w:color w:val="000000"/>
+                <w:sz w:val="20"/>
+                <w:szCs w:val="20"/>
+              </w:rPr>
+              <w:t xml:space="preserve">Causal convolutions; fixed look-back</w:t>
+            </w:r>
+          </w:p>
+        </w:tc>
+        <w:tc>
+          <w:tcPr>
+            <w:tcW w:type="dxa" w:w="1900"/>
+            <w:tcBorders>
+              <w:top w:val="single" w:color="D5DCE4" w:sz="4"/>
+              <w:left w:val="single" w:color="D5DCE4" w:sz="4"/>
+              <w:bottom w:val="single" w:color="D5DCE4" w:sz="4"/>
+              <w:right w:val="single" w:color="D5DCE4" w:sz="4"/>
+            </w:tcBorders>
+            <w:shd w:fill="EEF3F7" w:color="auto" w:val="clear"/>
+            <w:tcMar>
+              <w:top w:type="dxa" w:w="60"/>
+              <w:left w:type="dxa" w:w="100"/>
+              <w:bottom w:type="dxa" w:w="60"/>
+              <w:right w:type="dxa" w:w="100"/>
+            </w:tcMar>
+            <w:vAlign w:val="center"/>
+          </w:tcPr>
+          <w:p>
+            <w:pPr>
+              <w:spacing w:after="40" w:line="260"/>
+            </w:pPr>
+            <w:r>
+              <w:rPr>
+                <w:rFonts w:ascii="Calibri" w:cs="Calibri" w:eastAsia="Calibri" w:hAnsi="Calibri"/>
+                <w:b w:val="false"/>
+                <w:bCs w:val="false"/>
+                <w:color w:val="000000"/>
+                <w:sz w:val="20"/>
+                <w:szCs w:val="20"/>
+              </w:rPr>
+              <w:t xml:space="preserve">Shortlisted</w:t>
+            </w:r>
+          </w:p>
+        </w:tc>
+      </w:tr>
+      <w:tr>
+        <w:trPr>
+          <w:cantSplit/>
+        </w:trPr>
+        <w:tc>
+          <w:tcPr>
+            <w:tcW w:type="dxa" w:w="1750"/>
+            <w:tcBorders>
+              <w:top w:val="single" w:color="D5DCE4" w:sz="4"/>
+              <w:left w:val="single" w:color="D5DCE4" w:sz="4"/>
+              <w:bottom w:val="single" w:color="D5DCE4" w:sz="4"/>
+              <w:right w:val="single" w:color="D5DCE4" w:sz="4"/>
+            </w:tcBorders>
+            <w:tcMar>
+              <w:top w:type="dxa" w:w="60"/>
+              <w:left w:type="dxa" w:w="100"/>
+              <w:bottom w:type="dxa" w:w="60"/>
+              <w:right w:type="dxa" w:w="100"/>
+            </w:tcMar>
+            <w:vAlign w:val="center"/>
+          </w:tcPr>
+          <w:p>
+            <w:pPr>
+              <w:spacing w:after="40" w:line="260"/>
+            </w:pPr>
+            <w:r>
+              <w:rPr>
+                <w:rFonts w:ascii="Calibri" w:cs="Calibri" w:eastAsia="Calibri" w:hAnsi="Calibri"/>
+                <w:b w:val="false"/>
+                <w:bCs w:val="false"/>
+                <w:color w:val="000000"/>
+                <w:sz w:val="20"/>
+                <w:szCs w:val="20"/>
+              </w:rPr>
+              <w:t xml:space="preserve">Signatures + boosted trees</w:t>
+            </w:r>
+          </w:p>
+        </w:tc>
+        <w:tc>
+          <w:tcPr>
+            <w:tcW w:type="dxa" w:w="1000"/>
+            <w:tcBorders>
+              <w:top w:val="single" w:color="D5DCE4" w:sz="4"/>
+              <w:left w:val="single" w:color="D5DCE4" w:sz="4"/>
+              <w:bottom w:val="single" w:color="D5DCE4" w:sz="4"/>
+              <w:right w:val="single" w:color="D5DCE4" w:sz="4"/>
+            </w:tcBorders>
+            <w:tcMar>
+              <w:top w:type="dxa" w:w="60"/>
+              <w:left w:type="dxa" w:w="100"/>
+              <w:bottom w:type="dxa" w:w="60"/>
+              <w:right w:type="dxa" w:w="100"/>
+            </w:tcMar>
+            <w:vAlign w:val="center"/>
+          </w:tcPr>
+          <w:p>
+            <w:pPr>
+              <w:spacing w:after="40" w:line="260"/>
+            </w:pPr>
+            <w:r>
+              <w:rPr>
+                <w:rFonts w:ascii="Calibri" w:cs="Calibri" w:eastAsia="Calibri" w:hAnsi="Calibri"/>
+                <w:b w:val="false"/>
+                <w:bCs w:val="false"/>
+                <w:color w:val="000000"/>
+                <w:sz w:val="20"/>
+                <w:szCs w:val="20"/>
+              </w:rPr>
+              <w:t xml:space="preserve">Stage 3</w:t>
+            </w:r>
+          </w:p>
+        </w:tc>
+        <w:tc>
+          <w:tcPr>
+            <w:tcW w:type="dxa" w:w="2150"/>
+            <w:tcBorders>
+              <w:top w:val="single" w:color="D5DCE4" w:sz="4"/>
+              <w:left w:val="single" w:color="D5DCE4" w:sz="4"/>
+              <w:bottom w:val="single" w:color="D5DCE4" w:sz="4"/>
+              <w:right w:val="single" w:color="D5DCE4" w:sz="4"/>
+            </w:tcBorders>
+            <w:tcMar>
+              <w:top w:type="dxa" w:w="60"/>
+              <w:left w:type="dxa" w:w="100"/>
+              <w:bottom w:type="dxa" w:w="60"/>
+              <w:right w:type="dxa" w:w="100"/>
+            </w:tcMar>
+            <w:vAlign w:val="center"/>
+          </w:tcPr>
+          <w:p>
+            <w:pPr>
+              <w:spacing w:after="40" w:line="260"/>
+            </w:pPr>
+            <w:r>
+              <w:rPr>
+                <w:rFonts w:ascii="Calibri" w:cs="Calibri" w:eastAsia="Calibri" w:hAnsi="Calibri"/>
+                <w:b w:val="false"/>
+                <w:bCs w:val="false"/>
+                <w:color w:val="000000"/>
+                <w:sz w:val="20"/>
+                <w:szCs w:val="20"/>
+              </w:rPr>
+              <w:t xml:space="preserve">Benchmark against the published winner</w:t>
+            </w:r>
+          </w:p>
+        </w:tc>
+        <w:tc>
+          <w:tcPr>
+            <w:tcW w:type="dxa" w:w="2200"/>
+            <w:tcBorders>
+              <w:top w:val="single" w:color="D5DCE4" w:sz="4"/>
+              <w:left w:val="single" w:color="D5DCE4" w:sz="4"/>
+              <w:bottom w:val="single" w:color="D5DCE4" w:sz="4"/>
+              <w:right w:val="single" w:color="D5DCE4" w:sz="4"/>
+            </w:tcBorders>
+            <w:tcMar>
+              <w:top w:type="dxa" w:w="60"/>
+              <w:left w:type="dxa" w:w="100"/>
+              <w:bottom w:type="dxa" w:w="60"/>
+              <w:right w:type="dxa" w:w="100"/>
+            </w:tcMar>
+            <w:vAlign w:val="center"/>
+          </w:tcPr>
+          <w:p>
+            <w:pPr>
+              <w:spacing w:after="40" w:line="260"/>
+            </w:pPr>
+            <w:r>
+              <w:rPr>
+                <w:rFonts w:ascii="Calibri" w:cs="Calibri" w:eastAsia="Calibri" w:hAnsi="Calibri"/>
+                <w:b w:val="false"/>
+                <w:bCs w:val="false"/>
+                <w:color w:val="000000"/>
+                <w:sz w:val="20"/>
+                <w:szCs w:val="20"/>
+              </w:rPr>
+              <w:t xml:space="preserve">Trajectory summaries, then trees</w:t>
+            </w:r>
+          </w:p>
+        </w:tc>
+        <w:tc>
+          <w:tcPr>
+            <w:tcW w:type="dxa" w:w="1900"/>
+            <w:tcBorders>
+              <w:top w:val="single" w:color="D5DCE4" w:sz="4"/>
+              <w:left w:val="single" w:color="D5DCE4" w:sz="4"/>
+              <w:bottom w:val="single" w:color="D5DCE4" w:sz="4"/>
+              <w:right w:val="single" w:color="D5DCE4" w:sz="4"/>
+            </w:tcBorders>
+            <w:tcMar>
+              <w:top w:type="dxa" w:w="60"/>
+              <w:left w:type="dxa" w:w="100"/>
+              <w:bottom w:type="dxa" w:w="60"/>
+              <w:right w:type="dxa" w:w="100"/>
+            </w:tcMar>
+            <w:vAlign w:val="center"/>
+          </w:tcPr>
+          <w:p>
+            <w:pPr>
+              <w:spacing w:after="40" w:line="260"/>
+            </w:pPr>
+            <w:r>
+              <w:rPr>
+                <w:rFonts w:ascii="Calibri" w:cs="Calibri" w:eastAsia="Calibri" w:hAnsi="Calibri"/>
+                <w:b w:val="false"/>
+                <w:bCs w:val="false"/>
+                <w:color w:val="000000"/>
+                <w:sz w:val="20"/>
+                <w:szCs w:val="20"/>
+              </w:rPr>
+              <w:t xml:space="preserve">Kept as the benchmark</w:t>
+            </w:r>
+          </w:p>
+        </w:tc>
+      </w:tr>
+      <w:tr>
+        <w:trPr>
+          <w:cantSplit/>
+        </w:trPr>
+        <w:tc>
+          <w:tcPr>
+            <w:tcW w:type="dxa" w:w="1750"/>
+            <w:tcBorders>
+              <w:top w:val="single" w:color="D5DCE4" w:sz="4"/>
+              <w:left w:val="single" w:color="D5DCE4" w:sz="4"/>
+              <w:bottom w:val="single" w:color="D5DCE4" w:sz="4"/>
+              <w:right w:val="single" w:color="D5DCE4" w:sz="4"/>
+            </w:tcBorders>
+            <w:shd w:fill="EEF3F7" w:color="auto" w:val="clear"/>
+            <w:tcMar>
+              <w:top w:type="dxa" w:w="60"/>
+              <w:left w:type="dxa" w:w="100"/>
+              <w:bottom w:type="dxa" w:w="60"/>
+              <w:right w:type="dxa" w:w="100"/>
+            </w:tcMar>
+            <w:vAlign w:val="center"/>
+          </w:tcPr>
+          <w:p>
+            <w:pPr>
+              <w:spacing w:after="40" w:line="260"/>
+            </w:pPr>
+            <w:r>
+              <w:rPr>
+                <w:rFonts w:ascii="Calibri" w:cs="Calibri" w:eastAsia="Calibri" w:hAnsi="Calibri"/>
+                <w:b w:val="false"/>
+                <w:bCs w:val="false"/>
+                <w:color w:val="000000"/>
+                <w:sz w:val="20"/>
+                <w:szCs w:val="20"/>
+              </w:rPr>
+              <w:t xml:space="preserve">CNN to OSTA</w:t>
+            </w:r>
+          </w:p>
+        </w:tc>
+        <w:tc>
+          <w:tcPr>
+            <w:tcW w:type="dxa" w:w="1000"/>
+            <w:tcBorders>
+              <w:top w:val="single" w:color="D5DCE4" w:sz="4"/>
+              <w:left w:val="single" w:color="D5DCE4" w:sz="4"/>
+              <w:bottom w:val="single" w:color="D5DCE4" w:sz="4"/>
+              <w:right w:val="single" w:color="D5DCE4" w:sz="4"/>
+            </w:tcBorders>
+            <w:shd w:fill="EEF3F7" w:color="auto" w:val="clear"/>
+            <w:tcMar>
+              <w:top w:type="dxa" w:w="60"/>
+              <w:left w:type="dxa" w:w="100"/>
+              <w:bottom w:type="dxa" w:w="60"/>
+              <w:right w:type="dxa" w:w="100"/>
+            </w:tcMar>
+            <w:vAlign w:val="center"/>
+          </w:tcPr>
+          <w:p>
+            <w:pPr>
+              <w:spacing w:after="40" w:line="260"/>
+            </w:pPr>
+            <w:r>
+              <w:rPr>
+                <w:rFonts w:ascii="Calibri" w:cs="Calibri" w:eastAsia="Calibri" w:hAnsi="Calibri"/>
+                <w:b w:val="false"/>
+                <w:bCs w:val="false"/>
+                <w:color w:val="000000"/>
+                <w:sz w:val="20"/>
+                <w:szCs w:val="20"/>
+              </w:rPr>
+              <w:t xml:space="preserve">Stage 3</w:t>
+            </w:r>
+          </w:p>
+        </w:tc>
+        <w:tc>
+          <w:tcPr>
+            <w:tcW w:type="dxa" w:w="2150"/>
+            <w:tcBorders>
+              <w:top w:val="single" w:color="D5DCE4" w:sz="4"/>
+              <w:left w:val="single" w:color="D5DCE4" w:sz="4"/>
+              <w:bottom w:val="single" w:color="D5DCE4" w:sz="4"/>
+              <w:right w:val="single" w:color="D5DCE4" w:sz="4"/>
+            </w:tcBorders>
+            <w:shd w:fill="EEF3F7" w:color="auto" w:val="clear"/>
+            <w:tcMar>
+              <w:top w:type="dxa" w:w="60"/>
+              <w:left w:type="dxa" w:w="100"/>
+              <w:bottom w:type="dxa" w:w="60"/>
+              <w:right w:type="dxa" w:w="100"/>
+            </w:tcMar>
+            <w:vAlign w:val="center"/>
+          </w:tcPr>
+          <w:p>
+            <w:pPr>
+              <w:spacing w:after="40" w:line="260"/>
+            </w:pPr>
+            <w:r>
+              <w:rPr>
+                <w:rFonts w:ascii="Calibri" w:cs="Calibri" w:eastAsia="Calibri" w:hAnsi="Calibri"/>
+                <w:b w:val="false"/>
+                <w:bCs w:val="false"/>
+                <w:color w:val="000000"/>
+                <w:sz w:val="20"/>
+                <w:szCs w:val="20"/>
+              </w:rPr>
+              <w:t xml:space="preserve">Read each signal on its own terms</w:t>
+            </w:r>
+          </w:p>
+        </w:tc>
+        <w:tc>
+          <w:tcPr>
+            <w:tcW w:type="dxa" w:w="2200"/>
+            <w:tcBorders>
+              <w:top w:val="single" w:color="D5DCE4" w:sz="4"/>
+              <w:left w:val="single" w:color="D5DCE4" w:sz="4"/>
+              <w:bottom w:val="single" w:color="D5DCE4" w:sz="4"/>
+              <w:right w:val="single" w:color="D5DCE4" w:sz="4"/>
+            </w:tcBorders>
+            <w:shd w:fill="EEF3F7" w:color="auto" w:val="clear"/>
+            <w:tcMar>
+              <w:top w:type="dxa" w:w="60"/>
+              <w:left w:type="dxa" w:w="100"/>
+              <w:bottom w:type="dxa" w:w="60"/>
+              <w:right w:type="dxa" w:w="100"/>
+            </w:tcMar>
+            <w:vAlign w:val="center"/>
+          </w:tcPr>
+          <w:p>
+            <w:pPr>
+              <w:spacing w:after="40" w:line="260"/>
+            </w:pPr>
+            <w:r>
+              <w:rPr>
+                <w:rFonts w:ascii="Calibri" w:cs="Calibri" w:eastAsia="Calibri" w:hAnsi="Calibri"/>
+                <w:b w:val="false"/>
+                <w:bCs w:val="false"/>
+                <w:color w:val="000000"/>
+                <w:sz w:val="20"/>
+                <w:szCs w:val="20"/>
+              </w:rPr>
+              <w:t xml:space="preserve">Per-channel encoder before OSTA</w:t>
+            </w:r>
+          </w:p>
+        </w:tc>
+        <w:tc>
+          <w:tcPr>
+            <w:tcW w:type="dxa" w:w="1900"/>
+            <w:tcBorders>
+              <w:top w:val="single" w:color="D5DCE4" w:sz="4"/>
+              <w:left w:val="single" w:color="D5DCE4" w:sz="4"/>
+              <w:bottom w:val="single" w:color="D5DCE4" w:sz="4"/>
+              <w:right w:val="single" w:color="D5DCE4" w:sz="4"/>
+            </w:tcBorders>
+            <w:shd w:fill="EEF3F7" w:color="auto" w:val="clear"/>
+            <w:tcMar>
+              <w:top w:type="dxa" w:w="60"/>
+              <w:left w:type="dxa" w:w="100"/>
+              <w:bottom w:type="dxa" w:w="60"/>
+              <w:right w:type="dxa" w:w="100"/>
+            </w:tcMar>
+            <w:vAlign w:val="center"/>
+          </w:tcPr>
+          <w:p>
+            <w:pPr>
+              <w:spacing w:after="40" w:line="260"/>
+            </w:pPr>
+            <w:r>
+              <w:rPr>
+                <w:rFonts w:ascii="Calibri" w:cs="Calibri" w:eastAsia="Calibri" w:hAnsi="Calibri"/>
+                <w:b w:val="false"/>
+                <w:bCs w:val="false"/>
+                <w:color w:val="000000"/>
+                <w:sz w:val="20"/>
+                <w:szCs w:val="20"/>
+              </w:rPr>
+              <w:t xml:space="preserve">Supervised control for pretraining</w:t>
+            </w:r>
+          </w:p>
+        </w:tc>
+      </w:tr>
+      <w:tr>
+        <w:trPr>
+          <w:cantSplit/>
+        </w:trPr>
+        <w:tc>
+          <w:tcPr>
+            <w:tcW w:type="dxa" w:w="1750"/>
+            <w:tcBorders>
+              <w:top w:val="single" w:color="D5DCE4" w:sz="4"/>
+              <w:left w:val="single" w:color="D5DCE4" w:sz="4"/>
+              <w:bottom w:val="single" w:color="D5DCE4" w:sz="4"/>
+              <w:right w:val="single" w:color="D5DCE4" w:sz="4"/>
+            </w:tcBorders>
+            <w:tcMar>
+              <w:top w:type="dxa" w:w="60"/>
+              <w:left w:type="dxa" w:w="100"/>
+              <w:bottom w:type="dxa" w:w="60"/>
+              <w:right w:type="dxa" w:w="100"/>
+            </w:tcMar>
+            <w:vAlign w:val="center"/>
+          </w:tcPr>
+          <w:p>
+            <w:pPr>
+              <w:spacing w:after="40" w:line="260"/>
+            </w:pPr>
+            <w:r>
+              <w:rPr>
+                <w:rFonts w:ascii="Calibri" w:cs="Calibri" w:eastAsia="Calibri" w:hAnsi="Calibri"/>
+                <w:b w:val="false"/>
+                <w:bCs w:val="false"/>
+                <w:color w:val="000000"/>
+                <w:sz w:val="20"/>
+                <w:szCs w:val="20"/>
+              </w:rPr>
+              <w:t xml:space="preserve">Event OSTA</w:t>
+            </w:r>
+          </w:p>
+        </w:tc>
+        <w:tc>
+          <w:tcPr>
+            <w:tcW w:type="dxa" w:w="1000"/>
+            <w:tcBorders>
+              <w:top w:val="single" w:color="D5DCE4" w:sz="4"/>
+              <w:left w:val="single" w:color="D5DCE4" w:sz="4"/>
+              <w:bottom w:val="single" w:color="D5DCE4" w:sz="4"/>
+              <w:right w:val="single" w:color="D5DCE4" w:sz="4"/>
+            </w:tcBorders>
+            <w:tcMar>
+              <w:top w:type="dxa" w:w="60"/>
+              <w:left w:type="dxa" w:w="100"/>
+              <w:bottom w:type="dxa" w:w="60"/>
+              <w:right w:type="dxa" w:w="100"/>
+            </w:tcMar>
+            <w:vAlign w:val="center"/>
+          </w:tcPr>
+          <w:p>
+            <w:pPr>
+              <w:spacing w:after="40" w:line="260"/>
+            </w:pPr>
+            <w:r>
+              <w:rPr>
+                <w:rFonts w:ascii="Calibri" w:cs="Calibri" w:eastAsia="Calibri" w:hAnsi="Calibri"/>
+                <w:b w:val="false"/>
+                <w:bCs w:val="false"/>
+                <w:color w:val="000000"/>
+                <w:sz w:val="20"/>
+                <w:szCs w:val="20"/>
+              </w:rPr>
+              <w:t xml:space="preserve">Stage 3</w:t>
+            </w:r>
+          </w:p>
+        </w:tc>
+        <w:tc>
+          <w:tcPr>
+            <w:tcW w:type="dxa" w:w="2150"/>
+            <w:tcBorders>
+              <w:top w:val="single" w:color="D5DCE4" w:sz="4"/>
+              <w:left w:val="single" w:color="D5DCE4" w:sz="4"/>
+              <w:bottom w:val="single" w:color="D5DCE4" w:sz="4"/>
+              <w:right w:val="single" w:color="D5DCE4" w:sz="4"/>
+            </w:tcBorders>
+            <w:tcMar>
+              <w:top w:type="dxa" w:w="60"/>
+              <w:left w:type="dxa" w:w="100"/>
+              <w:bottom w:type="dxa" w:w="60"/>
+              <w:right w:type="dxa" w:w="100"/>
+            </w:tcMar>
+            <w:vAlign w:val="center"/>
+          </w:tcPr>
+          <w:p>
+            <w:pPr>
+              <w:spacing w:after="40" w:line="260"/>
+            </w:pPr>
+            <w:r>
+              <w:rPr>
+                <w:rFonts w:ascii="Calibri" w:cs="Calibri" w:eastAsia="Calibri" w:hAnsi="Calibri"/>
+                <w:b w:val="false"/>
+                <w:bCs w:val="false"/>
+                <w:color w:val="000000"/>
+                <w:sz w:val="20"/>
+                <w:szCs w:val="20"/>
+              </w:rPr>
+              <w:t xml:space="preserve">Use real measurements, not carried values</w:t>
+            </w:r>
+          </w:p>
+        </w:tc>
+        <w:tc>
+          <w:tcPr>
+            <w:tcW w:type="dxa" w:w="2200"/>
+            <w:tcBorders>
+              <w:top w:val="single" w:color="D5DCE4" w:sz="4"/>
+              <w:left w:val="single" w:color="D5DCE4" w:sz="4"/>
+              <w:bottom w:val="single" w:color="D5DCE4" w:sz="4"/>
+              <w:right w:val="single" w:color="D5DCE4" w:sz="4"/>
+            </w:tcBorders>
+            <w:tcMar>
+              <w:top w:type="dxa" w:w="60"/>
+              <w:left w:type="dxa" w:w="100"/>
+              <w:bottom w:type="dxa" w:w="60"/>
+              <w:right w:type="dxa" w:w="100"/>
+            </w:tcMar>
+            <w:vAlign w:val="center"/>
+          </w:tcPr>
+          <w:p>
+            <w:pPr>
+              <w:spacing w:after="40" w:line="260"/>
+            </w:pPr>
+            <w:r>
+              <w:rPr>
+                <w:rFonts w:ascii="Calibri" w:cs="Calibri" w:eastAsia="Calibri" w:hAnsi="Calibri"/>
+                <w:b w:val="false"/>
+                <w:bCs w:val="false"/>
+                <w:color w:val="000000"/>
+                <w:sz w:val="20"/>
+                <w:szCs w:val="20"/>
+              </w:rPr>
+              <w:t xml:space="preserve">Attention to fresh vital signs only</w:t>
+            </w:r>
+          </w:p>
+        </w:tc>
+        <w:tc>
+          <w:tcPr>
+            <w:tcW w:type="dxa" w:w="1900"/>
+            <w:tcBorders>
+              <w:top w:val="single" w:color="D5DCE4" w:sz="4"/>
+              <w:left w:val="single" w:color="D5DCE4" w:sz="4"/>
+              <w:bottom w:val="single" w:color="D5DCE4" w:sz="4"/>
+              <w:right w:val="single" w:color="D5DCE4" w:sz="4"/>
+            </w:tcBorders>
+            <w:tcMar>
+              <w:top w:type="dxa" w:w="60"/>
+              <w:left w:type="dxa" w:w="100"/>
+              <w:bottom w:type="dxa" w:w="60"/>
+              <w:right w:type="dxa" w:w="100"/>
+            </w:tcMar>
+            <w:vAlign w:val="center"/>
+          </w:tcPr>
+          <w:p>
+            <w:pPr>
+              <w:spacing w:after="40" w:line="260"/>
+            </w:pPr>
+            <w:r>
+              <w:rPr>
+                <w:rFonts w:ascii="Calibri" w:cs="Calibri" w:eastAsia="Calibri" w:hAnsi="Calibri"/>
+                <w:b w:val="false"/>
+                <w:bCs w:val="false"/>
+                <w:color w:val="000000"/>
+                <w:sz w:val="20"/>
+                <w:szCs w:val="20"/>
+              </w:rPr>
+              <w:t xml:space="preserve">Not shortlisted</w:t>
+            </w:r>
+          </w:p>
+        </w:tc>
+      </w:tr>
+      <w:tr>
+        <w:trPr>
+          <w:cantSplit/>
+        </w:trPr>
+        <w:tc>
+          <w:tcPr>
+            <w:tcW w:type="dxa" w:w="1750"/>
+            <w:tcBorders>
+              <w:top w:val="single" w:color="D5DCE4" w:sz="4"/>
+              <w:left w:val="single" w:color="D5DCE4" w:sz="4"/>
+              <w:bottom w:val="single" w:color="D5DCE4" w:sz="4"/>
+              <w:right w:val="single" w:color="D5DCE4" w:sz="4"/>
+            </w:tcBorders>
+            <w:shd w:fill="EEF3F7" w:color="auto" w:val="clear"/>
+            <w:tcMar>
+              <w:top w:type="dxa" w:w="60"/>
+              <w:left w:type="dxa" w:w="100"/>
+              <w:bottom w:type="dxa" w:w="60"/>
+              <w:right w:type="dxa" w:w="100"/>
+            </w:tcMar>
+            <w:vAlign w:val="center"/>
+          </w:tcPr>
+          <w:p>
+            <w:pPr>
+              <w:spacing w:after="40" w:line="260"/>
+            </w:pPr>
+            <w:r>
+              <w:rPr>
+                <w:rFonts w:ascii="Calibri" w:cs="Calibri" w:eastAsia="Calibri" w:hAnsi="Calibri"/>
+                <w:b w:val="false"/>
+                <w:bCs w:val="false"/>
+                <w:color w:val="000000"/>
+                <w:sz w:val="20"/>
+                <w:szCs w:val="20"/>
+              </w:rPr>
+              <w:t xml:space="preserve">Self-supervised CNN to OSTA and flat twin</w:t>
+            </w:r>
+          </w:p>
+        </w:tc>
+        <w:tc>
+          <w:tcPr>
+            <w:tcW w:type="dxa" w:w="1000"/>
+            <w:tcBorders>
+              <w:top w:val="single" w:color="D5DCE4" w:sz="4"/>
+              <w:left w:val="single" w:color="D5DCE4" w:sz="4"/>
+              <w:bottom w:val="single" w:color="D5DCE4" w:sz="4"/>
+              <w:right w:val="single" w:color="D5DCE4" w:sz="4"/>
+            </w:tcBorders>
+            <w:shd w:fill="EEF3F7" w:color="auto" w:val="clear"/>
+            <w:tcMar>
+              <w:top w:type="dxa" w:w="60"/>
+              <w:left w:type="dxa" w:w="100"/>
+              <w:bottom w:type="dxa" w:w="60"/>
+              <w:right w:type="dxa" w:w="100"/>
+            </w:tcMar>
+            <w:vAlign w:val="center"/>
+          </w:tcPr>
+          <w:p>
+            <w:pPr>
+              <w:spacing w:after="40" w:line="260"/>
+            </w:pPr>
+            <w:r>
+              <w:rPr>
+                <w:rFonts w:ascii="Calibri" w:cs="Calibri" w:eastAsia="Calibri" w:hAnsi="Calibri"/>
+                <w:b w:val="false"/>
+                <w:bCs w:val="false"/>
+                <w:color w:val="000000"/>
+                <w:sz w:val="20"/>
+                <w:szCs w:val="20"/>
+              </w:rPr>
+              <w:t xml:space="preserve">Stage 3</w:t>
+            </w:r>
+          </w:p>
+        </w:tc>
+        <w:tc>
+          <w:tcPr>
+            <w:tcW w:type="dxa" w:w="2150"/>
+            <w:tcBorders>
+              <w:top w:val="single" w:color="D5DCE4" w:sz="4"/>
+              <w:left w:val="single" w:color="D5DCE4" w:sz="4"/>
+              <w:bottom w:val="single" w:color="D5DCE4" w:sz="4"/>
+              <w:right w:val="single" w:color="D5DCE4" w:sz="4"/>
+            </w:tcBorders>
+            <w:shd w:fill="EEF3F7" w:color="auto" w:val="clear"/>
+            <w:tcMar>
+              <w:top w:type="dxa" w:w="60"/>
+              <w:left w:type="dxa" w:w="100"/>
+              <w:bottom w:type="dxa" w:w="60"/>
+              <w:right w:type="dxa" w:w="100"/>
+            </w:tcMar>
+            <w:vAlign w:val="center"/>
+          </w:tcPr>
+          <w:p>
+            <w:pPr>
+              <w:spacing w:after="40" w:line="260"/>
+            </w:pPr>
+            <w:r>
+              <w:rPr>
+                <w:rFonts w:ascii="Calibri" w:cs="Calibri" w:eastAsia="Calibri" w:hAnsi="Calibri"/>
+                <w:b w:val="false"/>
+                <w:bCs w:val="false"/>
+                <w:color w:val="000000"/>
+                <w:sz w:val="20"/>
+                <w:szCs w:val="20"/>
+              </w:rPr>
+              <w:t xml:space="preserve">Few labelled sepsis cases</w:t>
+            </w:r>
+          </w:p>
+        </w:tc>
+        <w:tc>
+          <w:tcPr>
+            <w:tcW w:type="dxa" w:w="2200"/>
+            <w:tcBorders>
+              <w:top w:val="single" w:color="D5DCE4" w:sz="4"/>
+              <w:left w:val="single" w:color="D5DCE4" w:sz="4"/>
+              <w:bottom w:val="single" w:color="D5DCE4" w:sz="4"/>
+              <w:right w:val="single" w:color="D5DCE4" w:sz="4"/>
+            </w:tcBorders>
+            <w:shd w:fill="EEF3F7" w:color="auto" w:val="clear"/>
+            <w:tcMar>
+              <w:top w:type="dxa" w:w="60"/>
+              <w:left w:type="dxa" w:w="100"/>
+              <w:bottom w:type="dxa" w:w="60"/>
+              <w:right w:type="dxa" w:w="100"/>
+            </w:tcMar>
+            <w:vAlign w:val="center"/>
+          </w:tcPr>
+          <w:p>
+            <w:pPr>
+              <w:spacing w:after="40" w:line="260"/>
+            </w:pPr>
+            <w:r>
+              <w:rPr>
+                <w:rFonts w:ascii="Calibri" w:cs="Calibri" w:eastAsia="Calibri" w:hAnsi="Calibri"/>
+                <w:b w:val="false"/>
+                <w:bCs w:val="false"/>
+                <w:color w:val="000000"/>
+                <w:sz w:val="20"/>
+                <w:szCs w:val="20"/>
+              </w:rPr>
+              <w:t xml:space="preserve">Encoder pretrained without labels</w:t>
+            </w:r>
+          </w:p>
+        </w:tc>
+        <w:tc>
+          <w:tcPr>
+            <w:tcW w:type="dxa" w:w="1900"/>
+            <w:tcBorders>
+              <w:top w:val="single" w:color="D5DCE4" w:sz="4"/>
+              <w:left w:val="single" w:color="D5DCE4" w:sz="4"/>
+              <w:bottom w:val="single" w:color="D5DCE4" w:sz="4"/>
+              <w:right w:val="single" w:color="D5DCE4" w:sz="4"/>
+            </w:tcBorders>
+            <w:shd w:fill="EEF3F7" w:color="auto" w:val="clear"/>
+            <w:tcMar>
+              <w:top w:type="dxa" w:w="60"/>
+              <w:left w:type="dxa" w:w="100"/>
+              <w:bottom w:type="dxa" w:w="60"/>
+              <w:right w:type="dxa" w:w="100"/>
+            </w:tcMar>
+            <w:vAlign w:val="center"/>
+          </w:tcPr>
+          <w:p>
+            <w:pPr>
+              <w:spacing w:after="40" w:line="260"/>
+            </w:pPr>
+            <w:r>
+              <w:rPr>
+                <w:rFonts w:ascii="Calibri" w:cs="Calibri" w:eastAsia="Calibri" w:hAnsi="Calibri"/>
+                <w:b w:val="false"/>
+                <w:bCs w:val="false"/>
+                <w:color w:val="000000"/>
+                <w:sz w:val="20"/>
+                <w:szCs w:val="20"/>
+              </w:rPr>
+              <w:t xml:space="preserve">Added to the full cohort as declared exploratory pair</w:t>
+            </w:r>
+          </w:p>
+        </w:tc>
+      </w:tr>
+      <w:tr>
+        <w:trPr>
+          <w:cantSplit/>
+        </w:trPr>
+        <w:tc>
+          <w:tcPr>
+            <w:tcW w:type="dxa" w:w="1750"/>
+            <w:tcBorders>
+              <w:top w:val="single" w:color="D5DCE4" w:sz="4"/>
+              <w:left w:val="single" w:color="D5DCE4" w:sz="4"/>
+              <w:bottom w:val="single" w:color="D5DCE4" w:sz="4"/>
+              <w:right w:val="single" w:color="D5DCE4" w:sz="4"/>
+            </w:tcBorders>
+            <w:tcMar>
+              <w:top w:type="dxa" w:w="60"/>
+              <w:left w:type="dxa" w:w="100"/>
+              <w:bottom w:type="dxa" w:w="60"/>
+              <w:right w:type="dxa" w:w="100"/>
+            </w:tcMar>
+            <w:vAlign w:val="center"/>
+          </w:tcPr>
+          <w:p>
+            <w:pPr>
+              <w:spacing w:after="40" w:line="260"/>
+            </w:pPr>
+            <w:r>
+              <w:rPr>
+                <w:rFonts w:ascii="Calibri" w:cs="Calibri" w:eastAsia="Calibri" w:hAnsi="Calibri"/>
+                <w:b w:val="false"/>
+                <w:bCs w:val="false"/>
+                <w:color w:val="000000"/>
+                <w:sz w:val="20"/>
+                <w:szCs w:val="20"/>
+              </w:rPr>
+              <w:t xml:space="preserve">Pooled-encoder twins</w:t>
+            </w:r>
+          </w:p>
+        </w:tc>
+        <w:tc>
+          <w:tcPr>
+            <w:tcW w:type="dxa" w:w="1000"/>
+            <w:tcBorders>
+              <w:top w:val="single" w:color="D5DCE4" w:sz="4"/>
+              <w:left w:val="single" w:color="D5DCE4" w:sz="4"/>
+              <w:bottom w:val="single" w:color="D5DCE4" w:sz="4"/>
+              <w:right w:val="single" w:color="D5DCE4" w:sz="4"/>
+            </w:tcBorders>
+            <w:tcMar>
+              <w:top w:type="dxa" w:w="60"/>
+              <w:left w:type="dxa" w:w="100"/>
+              <w:bottom w:type="dxa" w:w="60"/>
+              <w:right w:type="dxa" w:w="100"/>
+            </w:tcMar>
+            <w:vAlign w:val="center"/>
+          </w:tcPr>
+          <w:p>
+            <w:pPr>
+              <w:spacing w:after="40" w:line="260"/>
+            </w:pPr>
+            <w:r>
+              <w:rPr>
+                <w:rFonts w:ascii="Calibri" w:cs="Calibri" w:eastAsia="Calibri" w:hAnsi="Calibri"/>
+                <w:b w:val="false"/>
+                <w:bCs w:val="false"/>
+                <w:color w:val="000000"/>
+                <w:sz w:val="20"/>
+                <w:szCs w:val="20"/>
+              </w:rPr>
+              <w:t xml:space="preserve">Stage 3</w:t>
+            </w:r>
+          </w:p>
+        </w:tc>
+        <w:tc>
+          <w:tcPr>
+            <w:tcW w:type="dxa" w:w="2150"/>
+            <w:tcBorders>
+              <w:top w:val="single" w:color="D5DCE4" w:sz="4"/>
+              <w:left w:val="single" w:color="D5DCE4" w:sz="4"/>
+              <w:bottom w:val="single" w:color="D5DCE4" w:sz="4"/>
+              <w:right w:val="single" w:color="D5DCE4" w:sz="4"/>
+            </w:tcBorders>
+            <w:tcMar>
+              <w:top w:type="dxa" w:w="60"/>
+              <w:left w:type="dxa" w:w="100"/>
+              <w:bottom w:type="dxa" w:w="60"/>
+              <w:right w:type="dxa" w:w="100"/>
+            </w:tcMar>
+            <w:vAlign w:val="center"/>
+          </w:tcPr>
+          <w:p>
+            <w:pPr>
+              <w:spacing w:after="40" w:line="260"/>
+            </w:pPr>
+            <w:r>
+              <w:rPr>
+                <w:rFonts w:ascii="Calibri" w:cs="Calibri" w:eastAsia="Calibri" w:hAnsi="Calibri"/>
+                <w:b w:val="false"/>
+                <w:bCs w:val="false"/>
+                <w:color w:val="000000"/>
+                <w:sz w:val="20"/>
+                <w:szCs w:val="20"/>
+              </w:rPr>
+              <w:t xml:space="preserve">Adaptation across hospital systems</w:t>
+            </w:r>
+          </w:p>
+        </w:tc>
+        <w:tc>
+          <w:tcPr>
+            <w:tcW w:type="dxa" w:w="2200"/>
+            <w:tcBorders>
+              <w:top w:val="single" w:color="D5DCE4" w:sz="4"/>
+              <w:left w:val="single" w:color="D5DCE4" w:sz="4"/>
+              <w:bottom w:val="single" w:color="D5DCE4" w:sz="4"/>
+              <w:right w:val="single" w:color="D5DCE4" w:sz="4"/>
+            </w:tcBorders>
+            <w:tcMar>
+              <w:top w:type="dxa" w:w="60"/>
+              <w:left w:type="dxa" w:w="100"/>
+              <w:bottom w:type="dxa" w:w="60"/>
+              <w:right w:type="dxa" w:w="100"/>
+            </w:tcMar>
+            <w:vAlign w:val="center"/>
+          </w:tcPr>
+          <w:p>
+            <w:pPr>
+              <w:spacing w:after="40" w:line="260"/>
+            </w:pPr>
+            <w:r>
+              <w:rPr>
+                <w:rFonts w:ascii="Calibri" w:cs="Calibri" w:eastAsia="Calibri" w:hAnsi="Calibri"/>
+                <w:b w:val="false"/>
+                <w:bCs w:val="false"/>
+                <w:color w:val="000000"/>
+                <w:sz w:val="20"/>
+                <w:szCs w:val="20"/>
+              </w:rPr>
+              <w:t xml:space="preserve">Pretrained on both databases</w:t>
+            </w:r>
+          </w:p>
+        </w:tc>
+        <w:tc>
+          <w:tcPr>
+            <w:tcW w:type="dxa" w:w="1900"/>
+            <w:tcBorders>
+              <w:top w:val="single" w:color="D5DCE4" w:sz="4"/>
+              <w:left w:val="single" w:color="D5DCE4" w:sz="4"/>
+              <w:bottom w:val="single" w:color="D5DCE4" w:sz="4"/>
+              <w:right w:val="single" w:color="D5DCE4" w:sz="4"/>
+            </w:tcBorders>
+            <w:tcMar>
+              <w:top w:type="dxa" w:w="60"/>
+              <w:left w:type="dxa" w:w="100"/>
+              <w:bottom w:type="dxa" w:w="60"/>
+              <w:right w:type="dxa" w:w="100"/>
+            </w:tcMar>
+            <w:vAlign w:val="center"/>
+          </w:tcPr>
+          <w:p>
+            <w:pPr>
+              <w:spacing w:after="40" w:line="260"/>
+            </w:pPr>
+            <w:r>
+              <w:rPr>
+                <w:rFonts w:ascii="Calibri" w:cs="Calibri" w:eastAsia="Calibri" w:hAnsi="Calibri"/>
+                <w:b w:val="false"/>
+                <w:bCs w:val="false"/>
+                <w:color w:val="000000"/>
+                <w:sz w:val="20"/>
+                <w:szCs w:val="20"/>
+              </w:rPr>
+              <w:t xml:space="preserve">Not shortlisted</w:t>
+            </w:r>
+          </w:p>
+        </w:tc>
+      </w:tr>
+      <w:tr>
+        <w:trPr>
+          <w:cantSplit/>
+        </w:trPr>
+        <w:tc>
+          <w:tcPr>
+            <w:tcW w:type="dxa" w:w="1750"/>
+            <w:tcBorders>
+              <w:top w:val="single" w:color="D5DCE4" w:sz="4"/>
+              <w:left w:val="single" w:color="D5DCE4" w:sz="4"/>
+              <w:bottom w:val="single" w:color="D5DCE4" w:sz="4"/>
+              <w:right w:val="single" w:color="D5DCE4" w:sz="4"/>
+            </w:tcBorders>
+            <w:shd w:fill="EEF3F7" w:color="auto" w:val="clear"/>
+            <w:tcMar>
+              <w:top w:type="dxa" w:w="60"/>
+              <w:left w:type="dxa" w:w="100"/>
+              <w:bottom w:type="dxa" w:w="60"/>
+              <w:right w:type="dxa" w:w="100"/>
+            </w:tcMar>
+            <w:vAlign w:val="center"/>
+          </w:tcPr>
+          <w:p>
+            <w:pPr>
+              <w:spacing w:after="40" w:line="260"/>
+            </w:pPr>
+            <w:r>
+              <w:rPr>
+                <w:rFonts w:ascii="Calibri" w:cs="Calibri" w:eastAsia="Calibri" w:hAnsi="Calibri"/>
+                <w:b w:val="false"/>
+                <w:bCs w:val="false"/>
+                <w:color w:val="000000"/>
+                <w:sz w:val="20"/>
+                <w:szCs w:val="20"/>
+              </w:rPr>
+              <w:t xml:space="preserve">Hazard head</w:t>
+            </w:r>
+          </w:p>
+        </w:tc>
+        <w:tc>
+          <w:tcPr>
+            <w:tcW w:type="dxa" w:w="1000"/>
+            <w:tcBorders>
+              <w:top w:val="single" w:color="D5DCE4" w:sz="4"/>
+              <w:left w:val="single" w:color="D5DCE4" w:sz="4"/>
+              <w:bottom w:val="single" w:color="D5DCE4" w:sz="4"/>
+              <w:right w:val="single" w:color="D5DCE4" w:sz="4"/>
+            </w:tcBorders>
+            <w:shd w:fill="EEF3F7" w:color="auto" w:val="clear"/>
+            <w:tcMar>
+              <w:top w:type="dxa" w:w="60"/>
+              <w:left w:type="dxa" w:w="100"/>
+              <w:bottom w:type="dxa" w:w="60"/>
+              <w:right w:type="dxa" w:w="100"/>
+            </w:tcMar>
+            <w:vAlign w:val="center"/>
+          </w:tcPr>
+          <w:p>
+            <w:pPr>
+              <w:spacing w:after="40" w:line="260"/>
+            </w:pPr>
+            <w:r>
+              <w:rPr>
+                <w:rFonts w:ascii="Calibri" w:cs="Calibri" w:eastAsia="Calibri" w:hAnsi="Calibri"/>
+                <w:b w:val="false"/>
+                <w:bCs w:val="false"/>
+                <w:color w:val="000000"/>
+                <w:sz w:val="20"/>
+                <w:szCs w:val="20"/>
+              </w:rPr>
+              <w:t xml:space="preserve">Stage 3</w:t>
+            </w:r>
+          </w:p>
+        </w:tc>
+        <w:tc>
+          <w:tcPr>
+            <w:tcW w:type="dxa" w:w="2150"/>
+            <w:tcBorders>
+              <w:top w:val="single" w:color="D5DCE4" w:sz="4"/>
+              <w:left w:val="single" w:color="D5DCE4" w:sz="4"/>
+              <w:bottom w:val="single" w:color="D5DCE4" w:sz="4"/>
+              <w:right w:val="single" w:color="D5DCE4" w:sz="4"/>
+            </w:tcBorders>
+            <w:shd w:fill="EEF3F7" w:color="auto" w:val="clear"/>
+            <w:tcMar>
+              <w:top w:type="dxa" w:w="60"/>
+              <w:left w:type="dxa" w:w="100"/>
+              <w:bottom w:type="dxa" w:w="60"/>
+              <w:right w:type="dxa" w:w="100"/>
+            </w:tcMar>
+            <w:vAlign w:val="center"/>
+          </w:tcPr>
+          <w:p>
+            <w:pPr>
+              <w:spacing w:after="40" w:line="260"/>
+            </w:pPr>
+            <w:r>
+              <w:rPr>
+                <w:rFonts w:ascii="Calibri" w:cs="Calibri" w:eastAsia="Calibri" w:hAnsi="Calibri"/>
+                <w:b w:val="false"/>
+                <w:bCs w:val="false"/>
+                <w:color w:val="000000"/>
+                <w:sz w:val="20"/>
+                <w:szCs w:val="20"/>
+              </w:rPr>
+              <w:t xml:space="preserve">Use the timing of onset</w:t>
+            </w:r>
+          </w:p>
+        </w:tc>
+        <w:tc>
+          <w:tcPr>
+            <w:tcW w:type="dxa" w:w="2200"/>
+            <w:tcBorders>
+              <w:top w:val="single" w:color="D5DCE4" w:sz="4"/>
+              <w:left w:val="single" w:color="D5DCE4" w:sz="4"/>
+              <w:bottom w:val="single" w:color="D5DCE4" w:sz="4"/>
+              <w:right w:val="single" w:color="D5DCE4" w:sz="4"/>
+            </w:tcBorders>
+            <w:shd w:fill="EEF3F7" w:color="auto" w:val="clear"/>
+            <w:tcMar>
+              <w:top w:type="dxa" w:w="60"/>
+              <w:left w:type="dxa" w:w="100"/>
+              <w:bottom w:type="dxa" w:w="60"/>
+              <w:right w:type="dxa" w:w="100"/>
+            </w:tcMar>
+            <w:vAlign w:val="center"/>
+          </w:tcPr>
+          <w:p>
+            <w:pPr>
+              <w:spacing w:after="40" w:line="260"/>
+            </w:pPr>
+            <w:r>
+              <w:rPr>
+                <w:rFonts w:ascii="Calibri" w:cs="Calibri" w:eastAsia="Calibri" w:hAnsi="Calibri"/>
+                <w:b w:val="false"/>
+                <w:bCs w:val="false"/>
+                <w:color w:val="000000"/>
+                <w:sz w:val="20"/>
+                <w:szCs w:val="20"/>
+              </w:rPr>
+              <w:t xml:space="preserve">Survival curve at 1 to 24 h</w:t>
+            </w:r>
+          </w:p>
+        </w:tc>
+        <w:tc>
+          <w:tcPr>
+            <w:tcW w:type="dxa" w:w="1900"/>
+            <w:tcBorders>
+              <w:top w:val="single" w:color="D5DCE4" w:sz="4"/>
+              <w:left w:val="single" w:color="D5DCE4" w:sz="4"/>
+              <w:bottom w:val="single" w:color="D5DCE4" w:sz="4"/>
+              <w:right w:val="single" w:color="D5DCE4" w:sz="4"/>
+            </w:tcBorders>
+            <w:shd w:fill="EEF3F7" w:color="auto" w:val="clear"/>
+            <w:tcMar>
+              <w:top w:type="dxa" w:w="60"/>
+              <w:left w:type="dxa" w:w="100"/>
+              <w:bottom w:type="dxa" w:w="60"/>
+              <w:right w:type="dxa" w:w="100"/>
+            </w:tcMar>
+            <w:vAlign w:val="center"/>
+          </w:tcPr>
+          <w:p>
+            <w:pPr>
+              <w:spacing w:after="40" w:line="260"/>
+            </w:pPr>
+            <w:r>
+              <w:rPr>
+                <w:rFonts w:ascii="Calibri" w:cs="Calibri" w:eastAsia="Calibri" w:hAnsi="Calibri"/>
+                <w:b w:val="false"/>
+                <w:bCs w:val="false"/>
+                <w:color w:val="000000"/>
+                <w:sz w:val="20"/>
+                <w:szCs w:val="20"/>
+              </w:rPr>
+              <w:t xml:space="preserve">Not shortlisted</w:t>
+            </w:r>
+          </w:p>
+        </w:tc>
+      </w:tr>
+      <w:tr>
+        <w:trPr>
+          <w:cantSplit/>
+        </w:trPr>
+        <w:tc>
+          <w:tcPr>
+            <w:tcW w:type="dxa" w:w="1750"/>
+            <w:tcBorders>
+              <w:top w:val="single" w:color="D5DCE4" w:sz="4"/>
+              <w:left w:val="single" w:color="D5DCE4" w:sz="4"/>
+              <w:bottom w:val="single" w:color="D5DCE4" w:sz="4"/>
+              <w:right w:val="single" w:color="D5DCE4" w:sz="4"/>
+            </w:tcBorders>
+            <w:tcMar>
+              <w:top w:type="dxa" w:w="60"/>
+              <w:left w:type="dxa" w:w="100"/>
+              <w:bottom w:type="dxa" w:w="60"/>
+              <w:right w:type="dxa" w:w="100"/>
+            </w:tcMar>
+            <w:vAlign w:val="center"/>
+          </w:tcPr>
+          <w:p>
+            <w:pPr>
+              <w:spacing w:after="40" w:line="260"/>
+            </w:pPr>
+            <w:r>
+              <w:rPr>
+                <w:rFonts w:ascii="Calibri" w:cs="Calibri" w:eastAsia="Calibri" w:hAnsi="Calibri"/>
+                <w:b w:val="false"/>
+                <w:bCs w:val="false"/>
+                <w:color w:val="000000"/>
+                <w:sz w:val="20"/>
+                <w:szCs w:val="20"/>
+              </w:rPr>
+              <w:t xml:space="preserve">Mean ensemble</w:t>
+            </w:r>
+          </w:p>
+        </w:tc>
+        <w:tc>
+          <w:tcPr>
+            <w:tcW w:type="dxa" w:w="1000"/>
+            <w:tcBorders>
+              <w:top w:val="single" w:color="D5DCE4" w:sz="4"/>
+              <w:left w:val="single" w:color="D5DCE4" w:sz="4"/>
+              <w:bottom w:val="single" w:color="D5DCE4" w:sz="4"/>
+              <w:right w:val="single" w:color="D5DCE4" w:sz="4"/>
+            </w:tcBorders>
+            <w:tcMar>
+              <w:top w:type="dxa" w:w="60"/>
+              <w:left w:type="dxa" w:w="100"/>
+              <w:bottom w:type="dxa" w:w="60"/>
+              <w:right w:type="dxa" w:w="100"/>
+            </w:tcMar>
+            <w:vAlign w:val="center"/>
+          </w:tcPr>
+          <w:p>
+            <w:pPr>
+              <w:spacing w:after="40" w:line="260"/>
+            </w:pPr>
+            <w:r>
+              <w:rPr>
+                <w:rFonts w:ascii="Calibri" w:cs="Calibri" w:eastAsia="Calibri" w:hAnsi="Calibri"/>
+                <w:b w:val="false"/>
+                <w:bCs w:val="false"/>
+                <w:color w:val="000000"/>
+                <w:sz w:val="20"/>
+                <w:szCs w:val="20"/>
+              </w:rPr>
+              <w:t xml:space="preserve">Stage 3</w:t>
+            </w:r>
+          </w:p>
+        </w:tc>
+        <w:tc>
+          <w:tcPr>
+            <w:tcW w:type="dxa" w:w="2150"/>
+            <w:tcBorders>
+              <w:top w:val="single" w:color="D5DCE4" w:sz="4"/>
+              <w:left w:val="single" w:color="D5DCE4" w:sz="4"/>
+              <w:bottom w:val="single" w:color="D5DCE4" w:sz="4"/>
+              <w:right w:val="single" w:color="D5DCE4" w:sz="4"/>
+            </w:tcBorders>
+            <w:tcMar>
+              <w:top w:type="dxa" w:w="60"/>
+              <w:left w:type="dxa" w:w="100"/>
+              <w:bottom w:type="dxa" w:w="60"/>
+              <w:right w:type="dxa" w:w="100"/>
+            </w:tcMar>
+            <w:vAlign w:val="center"/>
+          </w:tcPr>
+          <w:p>
+            <w:pPr>
+              <w:spacing w:after="40" w:line="260"/>
+            </w:pPr>
+            <w:r>
+              <w:rPr>
+                <w:rFonts w:ascii="Calibri" w:cs="Calibri" w:eastAsia="Calibri" w:hAnsi="Calibri"/>
+                <w:b w:val="false"/>
+                <w:bCs w:val="false"/>
+                <w:color w:val="000000"/>
+                <w:sz w:val="20"/>
+                <w:szCs w:val="20"/>
+              </w:rPr>
+              <w:t xml:space="preserve">Average out single-model errors</w:t>
+            </w:r>
+          </w:p>
+        </w:tc>
+        <w:tc>
+          <w:tcPr>
+            <w:tcW w:type="dxa" w:w="2200"/>
+            <w:tcBorders>
+              <w:top w:val="single" w:color="D5DCE4" w:sz="4"/>
+              <w:left w:val="single" w:color="D5DCE4" w:sz="4"/>
+              <w:bottom w:val="single" w:color="D5DCE4" w:sz="4"/>
+              <w:right w:val="single" w:color="D5DCE4" w:sz="4"/>
+            </w:tcBorders>
+            <w:tcMar>
+              <w:top w:type="dxa" w:w="60"/>
+              <w:left w:type="dxa" w:w="100"/>
+              <w:bottom w:type="dxa" w:w="60"/>
+              <w:right w:type="dxa" w:w="100"/>
+            </w:tcMar>
+            <w:vAlign w:val="center"/>
+          </w:tcPr>
+          <w:p>
+            <w:pPr>
+              <w:spacing w:after="40" w:line="260"/>
+            </w:pPr>
+            <w:r>
+              <w:rPr>
+                <w:rFonts w:ascii="Calibri" w:cs="Calibri" w:eastAsia="Calibri" w:hAnsi="Calibri"/>
+                <w:b w:val="false"/>
+                <w:bCs w:val="false"/>
+                <w:color w:val="000000"/>
+                <w:sz w:val="20"/>
+                <w:szCs w:val="20"/>
+              </w:rPr>
+              <w:t xml:space="preserve">Mean of OSTA, CNN-Transformer and the self-supervised model</w:t>
+            </w:r>
+          </w:p>
+        </w:tc>
+        <w:tc>
+          <w:tcPr>
+            <w:tcW w:type="dxa" w:w="1900"/>
+            <w:tcBorders>
+              <w:top w:val="single" w:color="D5DCE4" w:sz="4"/>
+              <w:left w:val="single" w:color="D5DCE4" w:sz="4"/>
+              <w:bottom w:val="single" w:color="D5DCE4" w:sz="4"/>
+              <w:right w:val="single" w:color="D5DCE4" w:sz="4"/>
+            </w:tcBorders>
+            <w:tcMar>
+              <w:top w:type="dxa" w:w="60"/>
+              <w:left w:type="dxa" w:w="100"/>
+              <w:bottom w:type="dxa" w:w="60"/>
+              <w:right w:type="dxa" w:w="100"/>
+            </w:tcMar>
+            <w:vAlign w:val="center"/>
+          </w:tcPr>
+          <w:p>
+            <w:pPr>
+              <w:spacing w:after="40" w:line="260"/>
+            </w:pPr>
+            <w:r>
+              <w:rPr>
+                <w:rFonts w:ascii="Calibri" w:cs="Calibri" w:eastAsia="Calibri" w:hAnsi="Calibri"/>
+                <w:b w:val="false"/>
+                <w:bCs w:val="false"/>
+                <w:color w:val="000000"/>
+                <w:sz w:val="20"/>
+                <w:szCs w:val="20"/>
+              </w:rPr>
+              <w:t xml:space="preserve">Secondary analysis</w:t>
+            </w:r>
+          </w:p>
+        </w:tc>
+      </w:tr>
+    </w:tbl>
+    <w:p>
+      <w:pPr>
+        <w:spacing w:after="160"/>
+      </w:pPr>
+    </w:p>
+    <w:p>
+      <w:pPr>
+        <w:pStyle w:val="Heading2"/>
+        <w:spacing w:after="120" w:before="240"/>
+      </w:pPr>
+      <w:r>
+        <w:rPr>
+          <w:rFonts w:ascii="Calibri" w:cs="Calibri" w:eastAsia="Calibri" w:hAnsi="Calibri"/>
+        </w:rPr>
+        <w:t xml:space="preserve">4.7 Publications and dissemination</w:t>
       </w:r>
     </w:p>
     <w:p>
@@ -5273,7 +9367,7 @@
         <w:rPr>
           <w:rFonts w:ascii="Calibri" w:cs="Calibri" w:eastAsia="Calibri" w:hAnsi="Calibri"/>
         </w:rPr>
-        <w:t xml:space="preserve">4.7 Deviations from the March 2026 plan</w:t>
+        <w:t xml:space="preserve">4.8 Deviations from the March 2026 plan</w:t>
       </w:r>
     </w:p>
     <w:tbl>
@@ -8700,6 +12794,303 @@
           <w:szCs w:val="22"/>
         </w:rPr>
         <w:t xml:space="preserve">The period turned a set of promising but leaky results into an honest, transferable research programme. The candidate audited and retired the earlier models, built a causal pipeline across two raw ICU databases with one shared definition of sepsis and a clinician-defined predictor set, moved evaluation to clinical utility with a sealed holdout, and produced preliminary evidence that, on identical MIMIC-IV hours, all 21 models compared, including the competition winner's own method, keep a positive utility, while transfer to a second hospital system remains the open problem. Three manuscripts were submitted. The next period scales the evaluation to the full cohort, opens the holdout once, brings in the clinicians who would receive the alarm, and prepares the prospective test on hospital patients that the whole programme points towards.</w:t>
+      </w:r>
+    </w:p>
+    <w:p>
+      <w:pPr>
+        <w:pStyle w:val="Heading1"/>
+        <w:spacing w:after="160" w:before="360"/>
+      </w:pPr>
+      <w:r>
+        <w:rPr>
+          <w:rFonts w:ascii="Calibri" w:cs="Calibri" w:eastAsia="Calibri" w:hAnsi="Calibri"/>
+        </w:rPr>
+        <w:t xml:space="preserve">9. References</w:t>
+      </w:r>
+    </w:p>
+    <w:p>
+      <w:pPr>
+        <w:spacing w:after="80" w:before="0" w:line="276"/>
+        <w:jc w:val="left"/>
+      </w:pPr>
+      <w:r>
+        <w:rPr>
+          <w:rFonts w:ascii="Calibri" w:cs="Calibri" w:eastAsia="Calibri" w:hAnsi="Calibri"/>
+          <w:b w:val="false"/>
+          <w:bCs w:val="false"/>
+          <w:i w:val="false"/>
+          <w:iCs w:val="false"/>
+          <w:color w:val="000000"/>
+          <w:sz w:val="20"/>
+          <w:szCs w:val="20"/>
+        </w:rPr>
+        <w:t xml:space="preserve">Bai S, Kolter JZ, Koltun V. An empirical evaluation of generic convolutional and recurrent networks for sequence modeling. arXiv:1803.01271. 2018.</w:t>
+      </w:r>
+    </w:p>
+    <w:p>
+      <w:pPr>
+        <w:spacing w:after="80" w:before="0" w:line="276"/>
+        <w:jc w:val="left"/>
+      </w:pPr>
+      <w:r>
+        <w:rPr>
+          <w:rFonts w:ascii="Calibri" w:cs="Calibri" w:eastAsia="Calibri" w:hAnsi="Calibri"/>
+          <w:b w:val="false"/>
+          <w:bCs w:val="false"/>
+          <w:i w:val="false"/>
+          <w:iCs w:val="false"/>
+          <w:color w:val="000000"/>
+          <w:sz w:val="20"/>
+          <w:szCs w:val="20"/>
+        </w:rPr>
+        <w:t xml:space="preserve">Che Z, Purushotham S, Cho K, Sontag D, Liu Y. Recurrent neural networks for multivariate time series with missing values. Sci Rep. 2018;8:6085.</w:t>
+      </w:r>
+    </w:p>
+    <w:p>
+      <w:pPr>
+        <w:spacing w:after="80" w:before="0" w:line="276"/>
+        <w:jc w:val="left"/>
+      </w:pPr>
+      <w:r>
+        <w:rPr>
+          <w:rFonts w:ascii="Calibri" w:cs="Calibri" w:eastAsia="Calibri" w:hAnsi="Calibri"/>
+          <w:b w:val="false"/>
+          <w:bCs w:val="false"/>
+          <w:i w:val="false"/>
+          <w:iCs w:val="false"/>
+          <w:color w:val="000000"/>
+          <w:sz w:val="20"/>
+          <w:szCs w:val="20"/>
+        </w:rPr>
+        <w:t xml:space="preserve">Friedman JH. Greedy function approximation: a gradient boosting machine. Ann Stat. 2001;29:1189-1232.</w:t>
+      </w:r>
+    </w:p>
+    <w:p>
+      <w:pPr>
+        <w:spacing w:after="80" w:before="0" w:line="276"/>
+        <w:jc w:val="left"/>
+      </w:pPr>
+      <w:r>
+        <w:rPr>
+          <w:rFonts w:ascii="Calibri" w:cs="Calibri" w:eastAsia="Calibri" w:hAnsi="Calibri"/>
+          <w:b w:val="false"/>
+          <w:bCs w:val="false"/>
+          <w:i w:val="false"/>
+          <w:iCs w:val="false"/>
+          <w:color w:val="000000"/>
+          <w:sz w:val="20"/>
+          <w:szCs w:val="20"/>
+        </w:rPr>
+        <w:t xml:space="preserve">Gensheimer MF, Narasimhan B. A scalable discrete-time survival model for neural networks. PeerJ. 2019;7:e6257.</w:t>
+      </w:r>
+    </w:p>
+    <w:p>
+      <w:pPr>
+        <w:spacing w:after="80" w:before="0" w:line="276"/>
+        <w:jc w:val="left"/>
+      </w:pPr>
+      <w:r>
+        <w:rPr>
+          <w:rFonts w:ascii="Calibri" w:cs="Calibri" w:eastAsia="Calibri" w:hAnsi="Calibri"/>
+          <w:b w:val="false"/>
+          <w:bCs w:val="false"/>
+          <w:i w:val="false"/>
+          <w:iCs w:val="false"/>
+          <w:color w:val="000000"/>
+          <w:sz w:val="20"/>
+          <w:szCs w:val="20"/>
+        </w:rPr>
+        <w:t xml:space="preserve">Horn M, Moor M, Bock C, Rieck B, Borgwardt K. Set functions for time series. International Conference on Machine Learning (ICML). 2020.</w:t>
+      </w:r>
+    </w:p>
+    <w:p>
+      <w:pPr>
+        <w:spacing w:after="80" w:before="0" w:line="276"/>
+        <w:jc w:val="left"/>
+      </w:pPr>
+      <w:r>
+        <w:rPr>
+          <w:rFonts w:ascii="Calibri" w:cs="Calibri" w:eastAsia="Calibri" w:hAnsi="Calibri"/>
+          <w:b w:val="false"/>
+          <w:bCs w:val="false"/>
+          <w:i w:val="false"/>
+          <w:iCs w:val="false"/>
+          <w:color w:val="000000"/>
+          <w:sz w:val="20"/>
+          <w:szCs w:val="20"/>
+        </w:rPr>
+        <w:t xml:space="preserve">Kapoor S, Narayanan A. Leakage and the reproducibility crisis in machine-learning-based science. Patterns. 2023;4:100804.</w:t>
+      </w:r>
+    </w:p>
+    <w:p>
+      <w:pPr>
+        <w:spacing w:after="80" w:before="0" w:line="276"/>
+        <w:jc w:val="left"/>
+      </w:pPr>
+      <w:r>
+        <w:rPr>
+          <w:rFonts w:ascii="Calibri" w:cs="Calibri" w:eastAsia="Calibri" w:hAnsi="Calibri"/>
+          <w:b w:val="false"/>
+          <w:bCs w:val="false"/>
+          <w:i w:val="false"/>
+          <w:iCs w:val="false"/>
+          <w:color w:val="000000"/>
+          <w:sz w:val="20"/>
+          <w:szCs w:val="20"/>
+        </w:rPr>
+        <w:t xml:space="preserve">Lin TY, Goyal P, Girshick R, He K, Dollar P. Focal loss for dense object detection. IEEE International Conference on Computer Vision (ICCV). 2017.</w:t>
+      </w:r>
+    </w:p>
+    <w:p>
+      <w:pPr>
+        <w:spacing w:after="80" w:before="0" w:line="276"/>
+        <w:jc w:val="left"/>
+      </w:pPr>
+      <w:r>
+        <w:rPr>
+          <w:rFonts w:ascii="Calibri" w:cs="Calibri" w:eastAsia="Calibri" w:hAnsi="Calibri"/>
+          <w:b w:val="false"/>
+          <w:bCs w:val="false"/>
+          <w:i w:val="false"/>
+          <w:iCs w:val="false"/>
+          <w:color w:val="000000"/>
+          <w:sz w:val="20"/>
+          <w:szCs w:val="20"/>
+        </w:rPr>
+        <w:t xml:space="preserve">Moor M, Rieck B, Horn M, Jutzeler CR, Borgwardt K. Early prediction of sepsis in the ICU using machine learning: a systematic review. Front Med. 2021;8:607952.</w:t>
+      </w:r>
+    </w:p>
+    <w:p>
+      <w:pPr>
+        <w:spacing w:after="80" w:before="0" w:line="276"/>
+        <w:jc w:val="left"/>
+      </w:pPr>
+      <w:r>
+        <w:rPr>
+          <w:rFonts w:ascii="Calibri" w:cs="Calibri" w:eastAsia="Calibri" w:hAnsi="Calibri"/>
+          <w:b w:val="false"/>
+          <w:bCs w:val="false"/>
+          <w:i w:val="false"/>
+          <w:iCs w:val="false"/>
+          <w:color w:val="000000"/>
+          <w:sz w:val="20"/>
+          <w:szCs w:val="20"/>
+        </w:rPr>
+        <w:t xml:space="preserve">Morrill JH, Kormilitzin A, Nevado-Holgado AJ, et al. Utilization of the signature method to identify the early onset of sepsis from multivariate physiological time series in critical care monitoring. Crit Care Med. 2020;48:e976-e981.</w:t>
+      </w:r>
+    </w:p>
+    <w:p>
+      <w:pPr>
+        <w:spacing w:after="80" w:before="0" w:line="276"/>
+        <w:jc w:val="left"/>
+      </w:pPr>
+      <w:r>
+        <w:rPr>
+          <w:rFonts w:ascii="Calibri" w:cs="Calibri" w:eastAsia="Calibri" w:hAnsi="Calibri"/>
+          <w:b w:val="false"/>
+          <w:bCs w:val="false"/>
+          <w:i w:val="false"/>
+          <w:iCs w:val="false"/>
+          <w:color w:val="000000"/>
+          <w:sz w:val="20"/>
+          <w:szCs w:val="20"/>
+        </w:rPr>
+        <w:t xml:space="preserve">Reyna MA, Josef CS, Jeter R, et al. Early prediction of sepsis from clinical data: the PhysioNet/Computing in Cardiology Challenge 2019. Crit Care Med. 2020;48:210-217.</w:t>
+      </w:r>
+    </w:p>
+    <w:p>
+      <w:pPr>
+        <w:spacing w:after="80" w:before="0" w:line="276"/>
+        <w:jc w:val="left"/>
+      </w:pPr>
+      <w:r>
+        <w:rPr>
+          <w:rFonts w:ascii="Calibri" w:cs="Calibri" w:eastAsia="Calibri" w:hAnsi="Calibri"/>
+          <w:b w:val="false"/>
+          <w:bCs w:val="false"/>
+          <w:i w:val="false"/>
+          <w:iCs w:val="false"/>
+          <w:color w:val="000000"/>
+          <w:sz w:val="20"/>
+          <w:szCs w:val="20"/>
+        </w:rPr>
+        <w:t xml:space="preserve">Vaswani A, Shazeer N, Parmar N, et al. Attention is all you need. Advances in Neural Information Processing Systems (NeurIPS). 2017.</w:t>
+      </w:r>
+    </w:p>
+    <w:p>
+      <w:pPr>
+        <w:spacing w:after="80" w:before="0" w:line="276"/>
+        <w:jc w:val="left"/>
+      </w:pPr>
+      <w:r>
+        <w:rPr>
+          <w:rFonts w:ascii="Calibri" w:cs="Calibri" w:eastAsia="Calibri" w:hAnsi="Calibri"/>
+          <w:b w:val="false"/>
+          <w:bCs w:val="false"/>
+          <w:i w:val="false"/>
+          <w:iCs w:val="false"/>
+          <w:color w:val="000000"/>
+          <w:sz w:val="20"/>
+          <w:szCs w:val="20"/>
+        </w:rPr>
+        <w:t xml:space="preserve">Vincent JL, Moreno R, Takala J, et al. The SOFA (Sepsis-related Organ Failure Assessment) score to describe organ dysfunction/failure. Intensive Care Med. 1996;22:707-710.</w:t>
+      </w:r>
+    </w:p>
+    <w:p>
+      <w:pPr>
+        <w:spacing w:after="80" w:before="0" w:line="276"/>
+        <w:jc w:val="left"/>
+      </w:pPr>
+      <w:r>
+        <w:rPr>
+          <w:rFonts w:ascii="Calibri" w:cs="Calibri" w:eastAsia="Calibri" w:hAnsi="Calibri"/>
+          <w:b w:val="false"/>
+          <w:bCs w:val="false"/>
+          <w:i w:val="false"/>
+          <w:iCs w:val="false"/>
+          <w:color w:val="000000"/>
+          <w:sz w:val="20"/>
+          <w:szCs w:val="20"/>
+        </w:rPr>
+        <w:t xml:space="preserve">Wong A, Otles E, Donnelly JP, et al. External validation of a widely implemented proprietary sepsis prediction model in hospitalized patients. JAMA Intern Med. 2021;181:1065-1070.</w:t>
+      </w:r>
+    </w:p>
+    <w:p>
+      <w:pPr>
+        <w:spacing w:after="80" w:before="0" w:line="276"/>
+        <w:jc w:val="left"/>
+      </w:pPr>
+      <w:r>
+        <w:rPr>
+          <w:rFonts w:ascii="Calibri" w:cs="Calibri" w:eastAsia="Calibri" w:hAnsi="Calibri"/>
+          <w:b w:val="false"/>
+          <w:bCs w:val="false"/>
+          <w:i w:val="false"/>
+          <w:iCs w:val="false"/>
+          <w:color w:val="000000"/>
+          <w:sz w:val="20"/>
+          <w:szCs w:val="20"/>
+        </w:rPr>
+        <w:t xml:space="preserve">Yeche H, Dresdner G, Locatello F, Huser M, Ratsch G. Neighborhood contrastive learning applied to online patient monitoring. International Conference on Machine Learning (ICML). 2021.</w:t>
+      </w:r>
+    </w:p>
+    <w:p>
+      <w:pPr>
+        <w:spacing w:after="80" w:before="0" w:line="276"/>
+        <w:jc w:val="left"/>
+      </w:pPr>
+      <w:r>
+        <w:rPr>
+          <w:rFonts w:ascii="Calibri" w:cs="Calibri" w:eastAsia="Calibri" w:hAnsi="Calibri"/>
+          <w:b w:val="false"/>
+          <w:bCs w:val="false"/>
+          <w:i w:val="false"/>
+          <w:iCs w:val="false"/>
+          <w:color w:val="000000"/>
+          <w:sz w:val="20"/>
+          <w:szCs w:val="20"/>
+        </w:rPr>
+        <w:t xml:space="preserve">Yeche H, Pace A, Ratsch G, Kuznetsova R. Temporal label smoothing for early event prediction. International Conference on Machine Learning (ICML). 2023.</w:t>
       </w:r>
     </w:p>
     <w:sectPr>

</xml_diff>

<commit_message>
Final code-audited study protocol; earlier disclosures; 659 predictors
PROTOCOL.md rewritten after a claim-by-claim audit against the code embedded in
the _11 notebook: exact label, cohort exclusions, hourly grid, holdout hash,
splits, availability and expiry rules, every predictor class, model
architectures and sizes, losses, both alarm thresholds, which metrics carry
bootstrap intervals, conformal and stress definitions, decision rules as
implemented, legacy notebook, development history, open TO FREEZE items.
PROTOCOL_DEVIATIONS.md adds disclosures E1-E4. Deck, RD6 report: 659 predictors.

Co-Authored-By: Claude Opus 5.5 <noreply@anthropic.com>
Claude-Session: https://claude.ai/code/session_01LgDqxV9dzSvE8XpquGaBd5
</commit_message>
<xml_diff>
--- a/dev/presentation/RD6_Progress_Report_Elrggal_Oct2026.docx
+++ b/dev/presentation/RD6_Progress_Report_Elrggal_Oct2026.docx
@@ -981,7 +981,7 @@
           <w:sz w:val="22"/>
           <w:szCs w:val="22"/>
         </w:rPr>
-        <w:t xml:space="preserve">Define the predictor set from the bedside: the full clinical picture (655 predictors), with antibiotics and cultures that define the label excluded, prophylactic antibiotics separated by a guideline rule, and clinician-suspicion proxies declared and tested in sensitivity analyses.</w:t>
+        <w:t xml:space="preserve">Define the predictor set from the bedside: the full clinical picture (659 predictors), with antibiotics and cultures that define the label excluded, prophylactic antibiotics separated by a guideline rule, and clinician-suspicion proxies declared and tested in sensitivity analyses.</w:t>
       </w:r>
     </w:p>
     <w:p>
@@ -2459,7 +2459,7 @@
           <w:sz w:val="22"/>
           <w:szCs w:val="22"/>
         </w:rPr>
-        <w:t xml:space="preserve">Every value is used only from the hour it was recorded in the system (store time where available), expires after 24 hours (no expiry for weight and Glasgow Coma Scale components), and is accompanied by a measured-or-not flag and an age channel. The 655 predictors were defined by the candidate from clinical practice and fall into the following groups:</w:t>
+        <w:t xml:space="preserve">Every value is used only from the hour it was recorded in the system (store time where available), expires after 24 hours (no expiry for weight and Glasgow Coma Scale components), and is accompanied by a measured-or-not flag and an age channel. The 659 predictors (a few, such as prophylaxis and earlier-admission history, are recorded in MIMIC-IV only and are missing by design in eICU) were defined by the candidate from clinical practice and fall into the following groups:</w:t>
       </w:r>
     </w:p>
     <w:tbl>
@@ -3142,7 +3142,7 @@
                 <w:sz w:val="20"/>
                 <w:szCs w:val="20"/>
               </w:rPr>
-              <w:t xml:space="preserve">antibiotics and cultures that define suspected infection; race, ethnicity and insurance (fairness analysis only); anything recorded after the prediction hour</w:t>
+              <w:t xml:space="preserve">antibiotics and cultures that define suspected infection; race, ethnicity and insurance (reserved for a planned fairness analysis); anything recorded after the prediction hour</w:t>
             </w:r>
           </w:p>
         </w:tc>
@@ -3474,7 +3474,7 @@
           <w:sz w:val="22"/>
           <w:szCs w:val="22"/>
         </w:rPr>
-        <w:t xml:space="preserve">Sepsis-3 labels and cohorts were extracted for both raw databases with the benchmark pipeline, including a repair of a defect in the pinned benchmark code that halted eICU extraction. The feature pipeline passed through five versions during the period, each adding predictor classes identified from clinical practice (comorbidity and admission context, devices and drug exposures, vasopressor dose, full SOFA and lab deltas, prophylactic antibiotics), to the current 655 predictors with masks and ages. All stages are keyed and resumable, and the raw-table scans are shared between runs.</w:t>
+        <w:t xml:space="preserve">Sepsis-3 labels and cohorts were extracted for both raw databases with the benchmark pipeline, including a repair of a defect in the pinned benchmark code that halted eICU extraction. The feature pipeline passed through five versions during the period, each adding predictor classes identified from clinical practice (comorbidity and admission context, devices and drug exposures, vasopressor dose, full SOFA and lab deltas, prophylactic antibiotics), to the current 659 predictors with masks and ages. All stages are keyed and resumable, and the raw-table scans are shared between runs.</w:t>
       </w:r>
     </w:p>
     <w:p>

</xml_diff>

<commit_message>
Winner comparison: 'winner's approach' not 'method'; state which bars are internal
The signature benchmark is the winner's approach (signature features on our
predictors with our boosted trees), not a replication of its pipeline. Slide 13,
the RD6 report and the protocol now say that our MIMIC-IV bars are the
counterpart of the winner's 0.43 (internal; PhysioNet hospital A is Beth Israel
Deaconess, the MIMIC-IV hospital) and that the counterpart of its -0.12 is the
sealed cross-database holdout, so PhysioNet is not an external test for a
MIMIC-IV-trained model.

Co-Authored-By: Claude Fable 5.1 <noreply@anthropic.com>
Claude-Session: https://claude.ai/code/session_01LgDqxV9dzSvE8XpquGaBd5
</commit_message>
<xml_diff>
--- a/dev/presentation/RD6_Progress_Report_Elrggal_Oct2026.docx
+++ b/dev/presentation/RD6_Progress_Report_Elrggal_Oct2026.docx
@@ -1004,7 +1004,7 @@
           <w:sz w:val="22"/>
           <w:szCs w:val="22"/>
         </w:rPr>
-        <w:t xml:space="preserve">Evaluate architectures as hypotheses, including the candidate's OSTA-Transformer, against the same model without organ structure, simpler sequence models, the PhysioNet winner's method and self-supervised pretraining, with decision rules fixed before results exist.</w:t>
+        <w:t xml:space="preserve">Evaluate architectures as hypotheses, including the candidate's OSTA-Transformer, against the same model without organ structure, simpler sequence models, the PhysioNet winner's approach and self-supervised pretraining, with decision rules fixed before results exist.</w:t>
       </w:r>
     </w:p>
     <w:p>
@@ -3227,7 +3227,7 @@
           <w:sz w:val="22"/>
           <w:szCs w:val="22"/>
         </w:rPr>
-        <w:t xml:space="preserve">Literature benchmark: path signatures with boosted trees, the method of the PhysioNet 2019 winner, replicated on the same hours.</w:t>
+        <w:t xml:space="preserve">Literature benchmark: path signatures with boosted trees, following the approach of the PhysioNet 2019 winner (signature features of the vital-sign trajectories, then gradient boosting) on the same hours and predictors. It is the winner's approach, not a replication of its full pipeline.</w:t>
       </w:r>
     </w:p>
     <w:p>
@@ -4748,7 +4748,7 @@
                 <w:sz w:val="20"/>
                 <w:szCs w:val="20"/>
               </w:rPr>
-              <w:t xml:space="preserve">Winner's method rebuilt in this pipeline</w:t>
+              <w:t xml:space="preserve">Winner's approach (signatures + boosted trees) rebuilt in this pipeline</w:t>
             </w:r>
           </w:p>
         </w:tc>
@@ -5180,7 +5180,7 @@
           <w:sz w:val="22"/>
           <w:szCs w:val="22"/>
         </w:rPr>
-        <w:t xml:space="preserve">On a database built from raw tables with every hour scored causally, every model keeps a positive utility, including the competition winner's own method, whereas the published winner fell below zero as soon as it left its training hospitals. The architectures differ more in point estimate than their overlapping intervals can support at this sample size. Transfer is the open problem: MIMIC-IV models scored on eICU development patients give utilities of -0.03 to 0.04 with intervals that include zero (hourly AUROC 0.58 to 0.68). eICU has the weaker antibiotic-only label and is the focus of the native eICU results (running at the time of writing), the full cohort, leave-hospital-out evaluation and label harmonisation.</w:t>
+        <w:t xml:space="preserve">On a database built from raw tables with every hour scored causally, every model keeps a positive utility, including the competition winner's approach. These are internal results: the counterpart of the winner's 0.43 on its own hospitals, one of which (Beth Israel Deaconess, hospital system A of the challenge) is also the MIMIC-IV hospital. The counterpart of the winner's -0.12 on an unseen hospital is the sealed cross-database holdout, which has not been opened. The architectures differ more in point estimate than their overlapping intervals can support at this sample size. Transfer is the open problem: MIMIC-IV models scored on eICU development patients give utilities of -0.03 to 0.04 with intervals that include zero (hourly AUROC 0.58 to 0.68). eICU has the weaker antibiotic-only label and is the focus of the native eICU results (running at the time of writing), the full cohort, leave-hospital-out evaluation and label harmonisation.</w:t>
       </w:r>
     </w:p>
     <w:p>

</xml_diff>

<commit_message>
Results slides: remove published winner bars; claim only what the data support
Slide 13 now shows 8 of the 21 models scored on identical MIMIC-IV hours
(baselines, the winner's approach, this project's models) with no published
external numbers, titled 'all 21 models score above zero; none is shown to be
best'. Slide 12 no longer calls the leak 'the biggest single correction' or
reads utility 0.22 as a clinical benefit; post-onset hours are described as
scored-as-warnings rather than 'labelled positive'. RD6 and the protocol
soften the same claims; a paired per-stay utility comparison is recorded as a
planned analysis.

Co-Authored-By: Claude Fable 5.1 <noreply@anthropic.com>
Claude-Session: https://claude.ai/code/session_01LgDqxV9dzSvE8XpquGaBd5
</commit_message>
<xml_diff>
--- a/dev/presentation/RD6_Progress_Report_Elrggal_Oct2026.docx
+++ b/dev/presentation/RD6_Progress_Report_Elrggal_Oct2026.docx
@@ -3443,7 +3443,7 @@
           <w:sz w:val="22"/>
           <w:szCs w:val="22"/>
         </w:rPr>
-        <w:t xml:space="preserve">Rebuilt causally, the OSTA-Transformer on the PhysioNet 2019 test set (three-seed ensemble) achieves a patient-level AUROC of 0.81, an hourly AUROC of 0.80 and a normalised utility of 0.22 (0.30 at the conformal operating point, sensitivity 0.70, specificity 0.72). With 1.6 per cent of hours positive, these are the honest baseline figures from which all later work is measured. This finding is itself a contribution: it demonstrates how far leakage inflates published scores and defines the audit that the new pipeline passes by construction.</w:t>
+        <w:t xml:space="preserve">Rebuilt causally, the OSTA-Transformer on the PhysioNet 2019 test set (three-seed ensemble) achieves a patient-level AUROC of 0.81, an hourly AUROC of 0.80 and a normalised utility of 0.22 (0.30 at the conformal operating point, sensitivity 0.70, specificity 0.72). With 1.6 per cent of hours positive, these are the honest baseline figures from which all later work is measured. This finding is itself a contribution: it illustrates how much apparent performance can rest on leakage (the rebuild changed other parts of the pipeline too, so the drop is not a pure measure of the leak) and defines the audit that the new pipeline passes by construction.</w:t>
       </w:r>
     </w:p>
     <w:p>
@@ -5373,7 +5373,7 @@
           <w:sz w:val="22"/>
           <w:szCs w:val="22"/>
         </w:rPr>
-        <w:t xml:space="preserve">Stage 3 was designed from those findings. First, the organ hypothesis is tested directly: flat OSTA is the same model with all predictors in one group, and organ structure is kept only if OSTA beats it on validation. Second, models built for irregular ICU data in the sepsis literature (Moor et al., 2021) were added on identical hours: GRU-D, which lets stale measurements decay towards normal (Che et al., 2018); a causal temporal convolutional network (Bai et al., 2018); and the PhysioNet 2019 winner's method, path signatures with boosted trees (Morrill et al., 2020). Third, because labelled sepsis cases are scarce, the self-supervised models first learn physiology from unlabelled stays by forecasting values and organ scores (Yèche et al., 2021), a per-channel encoder reads each signal with its own measurement pattern, event attention uses only fresh measurements (Horn et al., 2020), and a discrete-time hazard head uses when onset happens rather than only whether (Gensheimer and Narasimhan, 2019). Finally, the training loss was aligned with the clinical score: the utility-weighted loss weights each hour by what an alarm there is worth, compared against plain cross-entropy and temporal label smoothing (Yèche et al., 2023). The observer features, gated and ungated guidance, the extra-label control and the original OSTA loss were retired; output fusion, the CNN-Transformer, OSTA and the two baselines were kept. The preliminary outcome is in Sections 4.4 and 4.5: all 21 models have positive utility on MIMIC-IV, organ structure is not supported at this sample size, and the full cohort will rank the shortlisted models.</w:t>
+        <w:t xml:space="preserve">Stage 3 was designed from those findings. First, the organ hypothesis is tested directly: flat OSTA is the same model with all predictors in one group, and organ structure is kept only if OSTA beats it on validation. Second, models built for irregular ICU data in the sepsis literature (Moor et al., 2021) were added on identical hours: GRU-D, which lets stale measurements decay towards normal (Che et al., 2018); a causal temporal convolutional network (Bai et al., 2018); and the PhysioNet 2019 winner's method, path signatures with boosted trees (Morrill et al., 2020). Third, because labelled sepsis cases are scarce, the self-supervised models first learn physiology from unlabelled stays by forecasting values and organ scores (Yèche et al., 2021), a per-channel encoder reads each signal with its own measurement pattern, event attention uses only fresh measurements (Horn et al., 2020), and a discrete-time hazard head uses when onset happens rather than only whether (Gensheimer and Narasimhan, 2019). Finally, the training loss was aligned with the clinical score: the utility-weighted loss weights each hour by what an alarm there is worth, compared against plain cross-entropy and temporal label smoothing (Yèche et al., 2023). The observer features, gated and ungated guidance, the extra-label control and the original OSTA loss were retired; output fusion, the CNN-Transformer, OSTA and the two baselines were kept. The preliminary outcome is in Sections 4.4 and 4.5: all 21 models have positive utility on MIMIC-IV, organ structure is not supported at this sample size, and the full cohort will narrow the uncertainty among the shortlisted models, though it may still leave several level.</w:t>
       </w:r>
     </w:p>
     <w:p>

</xml_diff>

<commit_message>
Fold the completed eICU arm of run 4cd752bef2ccbd42 into the deck, RD6 report, protocol and script
- dev/results: aggregate notebook outputs and a results digest for the run
- Deck: slide 13 right panel with per-model MIMIC-IV-to-eICU bars and the
  eICU-at-home band; slides 14, 15 and backup 23 updated
- RD6: two-database results table, eICU paragraph, rule outcomes, cohort counts
- PROTOCOL.md: stage-1 outcome on eICU and the cross-database reading of the
  rules; PROTOCOL_DEVIATIONS.md: D1 addendum; Word copies regenerated
- Rehearsal script re-exported (Word and PDF); handover and change log updated

Co-Authored-By: Claude Fable 5.1 <noreply@anthropic.com>
Claude-Session: https://claude.ai/code/session_01LgDqxV9dzSvE8XpquGaBd5
</commit_message>
<xml_diff>
--- a/dev/presentation/RD6_Progress_Report_Elrggal_Oct2026.docx
+++ b/dev/presentation/RD6_Progress_Report_Elrggal_Oct2026.docx
@@ -2011,7 +2011,7 @@
                 <w:sz w:val="20"/>
                 <w:szCs w:val="20"/>
               </w:rPr>
-              <w:t xml:space="preserve">fixed random sample of 10,000 stays; 8,795 after benchmark exclusions</w:t>
+              <w:t xml:space="preserve">fixed random sample of 10,000 stays; 8,758 after benchmark exclusions</w:t>
             </w:r>
           </w:p>
         </w:tc>
@@ -2156,7 +2156,7 @@
                 <w:sz w:val="20"/>
                 <w:szCs w:val="20"/>
               </w:rPr>
-              <w:t xml:space="preserve">fixed random sample of 10,000 stays; 5,710 after benchmark exclusions</w:t>
+              <w:t xml:space="preserve">fixed random sample of 10,000 stays; 5,623 after benchmark exclusions</w:t>
             </w:r>
           </w:p>
         </w:tc>
@@ -4322,7 +4322,7 @@
           <w:sz w:val="22"/>
           <w:szCs w:val="22"/>
         </w:rPr>
-        <w:t xml:space="preserve">The following are preliminary results from the prespecified comparison on the MIMIC-IV development test split of the 10,000-stay sample (one run). Every model was scored on identical hours with the official PhysioNet utility scorer. The sealed holdout has not been opened and nothing was tuned on test data. Full results will appear in the manuscript in preparation.</w:t>
+        <w:t xml:space="preserve">The following are preliminary results from the prespecified comparison (run 4cd752bef2ccbd42, completed 22 October 2026, one seed) on the development test splits of the two 10,000-stay samples. Every model was scored on identical hours with the official PhysioNet utility scorer. The sealed holdout has not been opened and nothing was tuned on test data. Full results will appear in the manuscript in preparation.</w:t>
       </w:r>
     </w:p>
     <w:tbl>
@@ -4339,8 +4339,9 @@
         <w:tblLayout w:type="fixed"/>
       </w:tblPr>
       <w:tblGrid>
-        <w:gridCol w:w="3200"/>
-        <w:gridCol w:w="5800"/>
+        <w:gridCol w:w="2300"/>
+        <w:gridCol w:w="3400"/>
+        <w:gridCol w:w="3300"/>
       </w:tblGrid>
       <w:tr>
         <w:trPr>
@@ -4349,7 +4350,7 @@
         </w:trPr>
         <w:tc>
           <w:tcPr>
-            <w:tcW w:type="dxa" w:w="3200"/>
+            <w:tcW w:type="dxa" w:w="2300"/>
             <w:tcBorders>
               <w:top w:val="single" w:color="D5DCE4" w:sz="4"/>
               <w:left w:val="single" w:color="D5DCE4" w:sz="4"/>
@@ -4384,7 +4385,7 @@
         </w:tc>
         <w:tc>
           <w:tcPr>
-            <w:tcW w:type="dxa" w:w="5800"/>
+            <w:tcW w:type="dxa" w:w="3400"/>
             <w:tcBorders>
               <w:top w:val="single" w:color="D5DCE4" w:sz="4"/>
               <w:left w:val="single" w:color="D5DCE4" w:sz="4"/>
@@ -4414,6 +4415,41 @@
                 <w:szCs w:val="20"/>
               </w:rPr>
               <w:t xml:space="preserve">MIMIC-IV development test split</w:t>
+            </w:r>
+          </w:p>
+        </w:tc>
+        <w:tc>
+          <w:tcPr>
+            <w:tcW w:type="dxa" w:w="3300"/>
+            <w:tcBorders>
+              <w:top w:val="single" w:color="D5DCE4" w:sz="4"/>
+              <w:left w:val="single" w:color="D5DCE4" w:sz="4"/>
+              <w:bottom w:val="single" w:color="D5DCE4" w:sz="4"/>
+              <w:right w:val="single" w:color="D5DCE4" w:sz="4"/>
+            </w:tcBorders>
+            <w:shd w:fill="14213D" w:color="auto" w:val="clear"/>
+            <w:tcMar>
+              <w:top w:type="dxa" w:w="60"/>
+              <w:left w:type="dxa" w:w="100"/>
+              <w:bottom w:type="dxa" w:w="60"/>
+              <w:right w:type="dxa" w:w="100"/>
+            </w:tcMar>
+            <w:vAlign w:val="center"/>
+          </w:tcPr>
+          <w:p>
+            <w:pPr>
+              <w:spacing w:after="40" w:line="260"/>
+            </w:pPr>
+            <w:r>
+              <w:rPr>
+                <w:rFonts w:ascii="Calibri" w:cs="Calibri" w:eastAsia="Calibri" w:hAnsi="Calibri"/>
+                <w:b/>
+                <w:bCs/>
+                <w:color w:val="FFFFFF"/>
+                <w:sz w:val="20"/>
+                <w:szCs w:val="20"/>
+              </w:rPr>
+              <w:t xml:space="preserve">eICU development test split</w:t>
             </w:r>
           </w:p>
         </w:tc>
@@ -4424,7 +4460,7 @@
         </w:trPr>
         <w:tc>
           <w:tcPr>
-            <w:tcW w:type="dxa" w:w="3200"/>
+            <w:tcW w:type="dxa" w:w="2300"/>
             <w:tcBorders>
               <w:top w:val="single" w:color="D5DCE4" w:sz="4"/>
               <w:left w:val="single" w:color="D5DCE4" w:sz="4"/>
@@ -4458,35 +4494,69 @@
         </w:tc>
         <w:tc>
           <w:tcPr>
-            <w:tcW w:type="dxa" w:w="5800"/>
-            <w:tcBorders>
-              <w:top w:val="single" w:color="D5DCE4" w:sz="4"/>
-              <w:left w:val="single" w:color="D5DCE4" w:sz="4"/>
-              <w:bottom w:val="single" w:color="D5DCE4" w:sz="4"/>
-              <w:right w:val="single" w:color="D5DCE4" w:sz="4"/>
-            </w:tcBorders>
-            <w:tcMar>
-              <w:top w:type="dxa" w:w="60"/>
-              <w:left w:type="dxa" w:w="100"/>
-              <w:bottom w:type="dxa" w:w="60"/>
-              <w:right w:type="dxa" w:w="100"/>
-            </w:tcMar>
-            <w:vAlign w:val="center"/>
-          </w:tcPr>
-          <w:p>
-            <w:pPr>
-              <w:spacing w:after="40" w:line="260"/>
-            </w:pPr>
-            <w:r>
-              <w:rPr>
-                <w:rFonts w:ascii="Calibri" w:cs="Calibri" w:eastAsia="Calibri" w:hAnsi="Calibri"/>
-                <w:b w:val="false"/>
-                <w:bCs w:val="false"/>
-                <w:color w:val="000000"/>
-                <w:sz w:val="20"/>
-                <w:szCs w:val="20"/>
-              </w:rPr>
-              <w:t xml:space="preserve">1,422 stays, 63,488 hours, 71 sepsis events; 0.65 % of hours positive</w:t>
+            <w:tcW w:type="dxa" w:w="3400"/>
+            <w:tcBorders>
+              <w:top w:val="single" w:color="D5DCE4" w:sz="4"/>
+              <w:left w:val="single" w:color="D5DCE4" w:sz="4"/>
+              <w:bottom w:val="single" w:color="D5DCE4" w:sz="4"/>
+              <w:right w:val="single" w:color="D5DCE4" w:sz="4"/>
+            </w:tcBorders>
+            <w:tcMar>
+              <w:top w:type="dxa" w:w="60"/>
+              <w:left w:type="dxa" w:w="100"/>
+              <w:bottom w:type="dxa" w:w="60"/>
+              <w:right w:type="dxa" w:w="100"/>
+            </w:tcMar>
+            <w:vAlign w:val="center"/>
+          </w:tcPr>
+          <w:p>
+            <w:pPr>
+              <w:spacing w:after="40" w:line="260"/>
+            </w:pPr>
+            <w:r>
+              <w:rPr>
+                <w:rFonts w:ascii="Calibri" w:cs="Calibri" w:eastAsia="Calibri" w:hAnsi="Calibri"/>
+                <w:b w:val="false"/>
+                <w:bCs w:val="false"/>
+                <w:color w:val="000000"/>
+                <w:sz w:val="20"/>
+                <w:szCs w:val="20"/>
+              </w:rPr>
+              <w:t xml:space="preserve">1,422 stays, 63,488 hours, 71 sepsis events; 0.65 % of hours positive; one hospital</w:t>
+            </w:r>
+          </w:p>
+        </w:tc>
+        <w:tc>
+          <w:tcPr>
+            <w:tcW w:type="dxa" w:w="3300"/>
+            <w:tcBorders>
+              <w:top w:val="single" w:color="D5DCE4" w:sz="4"/>
+              <w:left w:val="single" w:color="D5DCE4" w:sz="4"/>
+              <w:bottom w:val="single" w:color="D5DCE4" w:sz="4"/>
+              <w:right w:val="single" w:color="D5DCE4" w:sz="4"/>
+            </w:tcBorders>
+            <w:tcMar>
+              <w:top w:type="dxa" w:w="60"/>
+              <w:left w:type="dxa" w:w="100"/>
+              <w:bottom w:type="dxa" w:w="60"/>
+              <w:right w:type="dxa" w:w="100"/>
+            </w:tcMar>
+            <w:vAlign w:val="center"/>
+          </w:tcPr>
+          <w:p>
+            <w:pPr>
+              <w:spacing w:after="40" w:line="260"/>
+            </w:pPr>
+            <w:r>
+              <w:rPr>
+                <w:rFonts w:ascii="Calibri" w:cs="Calibri" w:eastAsia="Calibri" w:hAnsi="Calibri"/>
+                <w:b w:val="false"/>
+                <w:bCs w:val="false"/>
+                <w:color w:val="000000"/>
+                <w:sz w:val="20"/>
+                <w:szCs w:val="20"/>
+              </w:rPr>
+              <w:t xml:space="preserve">888 stays, 37,648 hours, 45 sepsis events; 0.70 % of hours positive; about 100 hospitals in the sample</w:t>
             </w:r>
           </w:p>
         </w:tc>
@@ -4497,7 +4567,7 @@
         </w:trPr>
         <w:tc>
           <w:tcPr>
-            <w:tcW w:type="dxa" w:w="3200"/>
+            <w:tcW w:type="dxa" w:w="2300"/>
             <w:tcBorders>
               <w:top w:val="single" w:color="D5DCE4" w:sz="4"/>
               <w:left w:val="single" w:color="D5DCE4" w:sz="4"/>
@@ -4532,7 +4602,7 @@
         </w:tc>
         <w:tc>
           <w:tcPr>
-            <w:tcW w:type="dxa" w:w="5800"/>
+            <w:tcW w:type="dxa" w:w="3400"/>
             <w:tcBorders>
               <w:top w:val="single" w:color="D5DCE4" w:sz="4"/>
               <w:left w:val="single" w:color="D5DCE4" w:sz="4"/>
@@ -4562,6 +4632,41 @@
                 <w:szCs w:val="20"/>
               </w:rPr>
               <w:t xml:space="preserve">21: sixteen architectures, loss comparators (cross-entropy and time-to-onset weighted) and a mean ensemble</w:t>
+            </w:r>
+          </w:p>
+        </w:tc>
+        <w:tc>
+          <w:tcPr>
+            <w:tcW w:type="dxa" w:w="3300"/>
+            <w:tcBorders>
+              <w:top w:val="single" w:color="D5DCE4" w:sz="4"/>
+              <w:left w:val="single" w:color="D5DCE4" w:sz="4"/>
+              <w:bottom w:val="single" w:color="D5DCE4" w:sz="4"/>
+              <w:right w:val="single" w:color="D5DCE4" w:sz="4"/>
+            </w:tcBorders>
+            <w:shd w:fill="EEF3F7" w:color="auto" w:val="clear"/>
+            <w:tcMar>
+              <w:top w:type="dxa" w:w="60"/>
+              <w:left w:type="dxa" w:w="100"/>
+              <w:bottom w:type="dxa" w:w="60"/>
+              <w:right w:type="dxa" w:w="100"/>
+            </w:tcMar>
+            <w:vAlign w:val="center"/>
+          </w:tcPr>
+          <w:p>
+            <w:pPr>
+              <w:spacing w:after="40" w:line="260"/>
+            </w:pPr>
+            <w:r>
+              <w:rPr>
+                <w:rFonts w:ascii="Calibri" w:cs="Calibri" w:eastAsia="Calibri" w:hAnsi="Calibri"/>
+                <w:b w:val="false"/>
+                <w:bCs w:val="false"/>
+                <w:color w:val="000000"/>
+                <w:sz w:val="20"/>
+                <w:szCs w:val="20"/>
+              </w:rPr>
+              <w:t xml:space="preserve">the same 21</w:t>
             </w:r>
           </w:p>
         </w:tc>
@@ -4572,7 +4677,7 @@
         </w:trPr>
         <w:tc>
           <w:tcPr>
-            <w:tcW w:type="dxa" w:w="3200"/>
+            <w:tcW w:type="dxa" w:w="2300"/>
             <w:tcBorders>
               <w:top w:val="single" w:color="D5DCE4" w:sz="4"/>
               <w:left w:val="single" w:color="D5DCE4" w:sz="4"/>
@@ -4606,7 +4711,7 @@
         </w:tc>
         <w:tc>
           <w:tcPr>
-            <w:tcW w:type="dxa" w:w="5800"/>
+            <w:tcW w:type="dxa" w:w="3400"/>
             <w:tcBorders>
               <w:top w:val="single" w:color="D5DCE4" w:sz="4"/>
               <w:left w:val="single" w:color="D5DCE4" w:sz="4"/>
@@ -4635,6 +4740,40 @@
                 <w:szCs w:val="20"/>
               </w:rPr>
               <w:t xml:space="preserve">all 21 models above zero, every 95 % CI above zero; range 0.08 to 0.29</w:t>
+            </w:r>
+          </w:p>
+        </w:tc>
+        <w:tc>
+          <w:tcPr>
+            <w:tcW w:type="dxa" w:w="3300"/>
+            <w:tcBorders>
+              <w:top w:val="single" w:color="D5DCE4" w:sz="4"/>
+              <w:left w:val="single" w:color="D5DCE4" w:sz="4"/>
+              <w:bottom w:val="single" w:color="D5DCE4" w:sz="4"/>
+              <w:right w:val="single" w:color="D5DCE4" w:sz="4"/>
+            </w:tcBorders>
+            <w:tcMar>
+              <w:top w:type="dxa" w:w="60"/>
+              <w:left w:type="dxa" w:w="100"/>
+              <w:bottom w:type="dxa" w:w="60"/>
+              <w:right w:type="dxa" w:w="100"/>
+            </w:tcMar>
+            <w:vAlign w:val="center"/>
+          </w:tcPr>
+          <w:p>
+            <w:pPr>
+              <w:spacing w:after="40" w:line="260"/>
+            </w:pPr>
+            <w:r>
+              <w:rPr>
+                <w:rFonts w:ascii="Calibri" w:cs="Calibri" w:eastAsia="Calibri" w:hAnsi="Calibri"/>
+                <w:b w:val="false"/>
+                <w:bCs w:val="false"/>
+                <w:color w:val="000000"/>
+                <w:sz w:val="20"/>
+                <w:szCs w:val="20"/>
+              </w:rPr>
+              <w:t xml:space="preserve">point estimates 0.00 to 0.08 with wide intervals (upper limits up to 0.16); at the false-alarm budget several OSTA variants raised no alarm at all</w:t>
             </w:r>
           </w:p>
         </w:tc>
@@ -4645,7 +4784,7 @@
         </w:trPr>
         <w:tc>
           <w:tcPr>
-            <w:tcW w:type="dxa" w:w="3200"/>
+            <w:tcW w:type="dxa" w:w="2300"/>
             <w:tcBorders>
               <w:top w:val="single" w:color="D5DCE4" w:sz="4"/>
               <w:left w:val="single" w:color="D5DCE4" w:sz="4"/>
@@ -4680,7 +4819,7 @@
         </w:tc>
         <w:tc>
           <w:tcPr>
-            <w:tcW w:type="dxa" w:w="5800"/>
+            <w:tcW w:type="dxa" w:w="3400"/>
             <w:tcBorders>
               <w:top w:val="single" w:color="D5DCE4" w:sz="4"/>
               <w:left w:val="single" w:color="D5DCE4" w:sz="4"/>
@@ -4710,6 +4849,41 @@
                 <w:szCs w:val="20"/>
               </w:rPr>
               <w:t xml:space="preserve">0.23 (95 % CI 0.13 to 0.34)</w:t>
+            </w:r>
+          </w:p>
+        </w:tc>
+        <w:tc>
+          <w:tcPr>
+            <w:tcW w:type="dxa" w:w="3300"/>
+            <w:tcBorders>
+              <w:top w:val="single" w:color="D5DCE4" w:sz="4"/>
+              <w:left w:val="single" w:color="D5DCE4" w:sz="4"/>
+              <w:bottom w:val="single" w:color="D5DCE4" w:sz="4"/>
+              <w:right w:val="single" w:color="D5DCE4" w:sz="4"/>
+            </w:tcBorders>
+            <w:shd w:fill="EEF3F7" w:color="auto" w:val="clear"/>
+            <w:tcMar>
+              <w:top w:type="dxa" w:w="60"/>
+              <w:left w:type="dxa" w:w="100"/>
+              <w:bottom w:type="dxa" w:w="60"/>
+              <w:right w:type="dxa" w:w="100"/>
+            </w:tcMar>
+            <w:vAlign w:val="center"/>
+          </w:tcPr>
+          <w:p>
+            <w:pPr>
+              <w:spacing w:after="40" w:line="260"/>
+            </w:pPr>
+            <w:r>
+              <w:rPr>
+                <w:rFonts w:ascii="Calibri" w:cs="Calibri" w:eastAsia="Calibri" w:hAnsi="Calibri"/>
+                <w:b w:val="false"/>
+                <w:bCs w:val="false"/>
+                <w:color w:val="000000"/>
+                <w:sz w:val="20"/>
+                <w:szCs w:val="20"/>
+              </w:rPr>
+              <w:t xml:space="preserve">0.01 (no alarms within budget)</w:t>
             </w:r>
           </w:p>
         </w:tc>
@@ -4720,7 +4894,7 @@
         </w:trPr>
         <w:tc>
           <w:tcPr>
-            <w:tcW w:type="dxa" w:w="3200"/>
+            <w:tcW w:type="dxa" w:w="2300"/>
             <w:tcBorders>
               <w:top w:val="single" w:color="D5DCE4" w:sz="4"/>
               <w:left w:val="single" w:color="D5DCE4" w:sz="4"/>
@@ -4754,7 +4928,7 @@
         </w:tc>
         <w:tc>
           <w:tcPr>
-            <w:tcW w:type="dxa" w:w="5800"/>
+            <w:tcW w:type="dxa" w:w="3400"/>
             <w:tcBorders>
               <w:top w:val="single" w:color="D5DCE4" w:sz="4"/>
               <w:left w:val="single" w:color="D5DCE4" w:sz="4"/>
@@ -4783,6 +4957,40 @@
                 <w:szCs w:val="20"/>
               </w:rPr>
               <w:t xml:space="preserve">0.15 (95 % CI 0.06 to 0.22)</w:t>
+            </w:r>
+          </w:p>
+        </w:tc>
+        <w:tc>
+          <w:tcPr>
+            <w:tcW w:type="dxa" w:w="3300"/>
+            <w:tcBorders>
+              <w:top w:val="single" w:color="D5DCE4" w:sz="4"/>
+              <w:left w:val="single" w:color="D5DCE4" w:sz="4"/>
+              <w:bottom w:val="single" w:color="D5DCE4" w:sz="4"/>
+              <w:right w:val="single" w:color="D5DCE4" w:sz="4"/>
+            </w:tcBorders>
+            <w:tcMar>
+              <w:top w:type="dxa" w:w="60"/>
+              <w:left w:type="dxa" w:w="100"/>
+              <w:bottom w:type="dxa" w:w="60"/>
+              <w:right w:type="dxa" w:w="100"/>
+            </w:tcMar>
+            <w:vAlign w:val="center"/>
+          </w:tcPr>
+          <w:p>
+            <w:pPr>
+              <w:spacing w:after="40" w:line="260"/>
+            </w:pPr>
+            <w:r>
+              <w:rPr>
+                <w:rFonts w:ascii="Calibri" w:cs="Calibri" w:eastAsia="Calibri" w:hAnsi="Calibri"/>
+                <w:b w:val="false"/>
+                <w:bCs w:val="false"/>
+                <w:color w:val="000000"/>
+                <w:sz w:val="20"/>
+                <w:szCs w:val="20"/>
+              </w:rPr>
+              <w:t xml:space="preserve">0.02</w:t>
             </w:r>
           </w:p>
         </w:tc>
@@ -4793,7 +5001,7 @@
         </w:trPr>
         <w:tc>
           <w:tcPr>
-            <w:tcW w:type="dxa" w:w="3200"/>
+            <w:tcW w:type="dxa" w:w="2300"/>
             <w:tcBorders>
               <w:top w:val="single" w:color="D5DCE4" w:sz="4"/>
               <w:left w:val="single" w:color="D5DCE4" w:sz="4"/>
@@ -4828,7 +5036,7 @@
         </w:tc>
         <w:tc>
           <w:tcPr>
-            <w:tcW w:type="dxa" w:w="5800"/>
+            <w:tcW w:type="dxa" w:w="3400"/>
             <w:tcBorders>
               <w:top w:val="single" w:color="D5DCE4" w:sz="4"/>
               <w:left w:val="single" w:color="D5DCE4" w:sz="4"/>
@@ -4858,6 +5066,41 @@
                 <w:szCs w:val="20"/>
               </w:rPr>
               <w:t xml:space="preserve">self-supervised CNN encoder with OSTA head 0.29 (0.17 to 0.39); CNN with OSTA head 0.28; mean ensemble 0.28</w:t>
+            </w:r>
+          </w:p>
+        </w:tc>
+        <w:tc>
+          <w:tcPr>
+            <w:tcW w:type="dxa" w:w="3300"/>
+            <w:tcBorders>
+              <w:top w:val="single" w:color="D5DCE4" w:sz="4"/>
+              <w:left w:val="single" w:color="D5DCE4" w:sz="4"/>
+              <w:bottom w:val="single" w:color="D5DCE4" w:sz="4"/>
+              <w:right w:val="single" w:color="D5DCE4" w:sz="4"/>
+            </w:tcBorders>
+            <w:shd w:fill="EEF3F7" w:color="auto" w:val="clear"/>
+            <w:tcMar>
+              <w:top w:type="dxa" w:w="60"/>
+              <w:left w:type="dxa" w:w="100"/>
+              <w:bottom w:type="dxa" w:w="60"/>
+              <w:right w:type="dxa" w:w="100"/>
+            </w:tcMar>
+            <w:vAlign w:val="center"/>
+          </w:tcPr>
+          <w:p>
+            <w:pPr>
+              <w:spacing w:after="40" w:line="260"/>
+            </w:pPr>
+            <w:r>
+              <w:rPr>
+                <w:rFonts w:ascii="Calibri" w:cs="Calibri" w:eastAsia="Calibri" w:hAnsi="Calibri"/>
+                <w:b w:val="false"/>
+                <w:bCs w:val="false"/>
+                <w:color w:val="000000"/>
+                <w:sz w:val="20"/>
+                <w:szCs w:val="20"/>
+              </w:rPr>
+              <w:t xml:space="preserve">CNN-Transformer 0.08; GRU-D 0.07; temporal CNN 0.04</w:t>
             </w:r>
           </w:p>
         </w:tc>
@@ -4868,69 +5111,103 @@
         </w:trPr>
         <w:tc>
           <w:tcPr>
-            <w:tcW w:type="dxa" w:w="3200"/>
-            <w:tcBorders>
-              <w:top w:val="single" w:color="D5DCE4" w:sz="4"/>
-              <w:left w:val="single" w:color="D5DCE4" w:sz="4"/>
-              <w:bottom w:val="single" w:color="D5DCE4" w:sz="4"/>
-              <w:right w:val="single" w:color="D5DCE4" w:sz="4"/>
-            </w:tcBorders>
-            <w:tcMar>
-              <w:top w:type="dxa" w:w="60"/>
-              <w:left w:type="dxa" w:w="100"/>
-              <w:bottom w:type="dxa" w:w="60"/>
-              <w:right w:type="dxa" w:w="100"/>
-            </w:tcMar>
-            <w:vAlign w:val="center"/>
-          </w:tcPr>
-          <w:p>
-            <w:pPr>
-              <w:spacing w:after="40" w:line="260"/>
-            </w:pPr>
-            <w:r>
-              <w:rPr>
-                <w:rFonts w:ascii="Calibri" w:cs="Calibri" w:eastAsia="Calibri" w:hAnsi="Calibri"/>
-                <w:b w:val="false"/>
-                <w:bCs w:val="false"/>
-                <w:color w:val="000000"/>
-                <w:sz w:val="20"/>
-                <w:szCs w:val="20"/>
-              </w:rPr>
-              <w:t xml:space="preserve">Model chosen by the validation rule</w:t>
-            </w:r>
-          </w:p>
-        </w:tc>
-        <w:tc>
-          <w:tcPr>
-            <w:tcW w:type="dxa" w:w="5800"/>
-            <w:tcBorders>
-              <w:top w:val="single" w:color="D5DCE4" w:sz="4"/>
-              <w:left w:val="single" w:color="D5DCE4" w:sz="4"/>
-              <w:bottom w:val="single" w:color="D5DCE4" w:sz="4"/>
-              <w:right w:val="single" w:color="D5DCE4" w:sz="4"/>
-            </w:tcBorders>
-            <w:tcMar>
-              <w:top w:type="dxa" w:w="60"/>
-              <w:left w:type="dxa" w:w="100"/>
-              <w:bottom w:type="dxa" w:w="60"/>
-              <w:right w:type="dxa" w:w="100"/>
-            </w:tcMar>
-            <w:vAlign w:val="center"/>
-          </w:tcPr>
-          <w:p>
-            <w:pPr>
-              <w:spacing w:after="40" w:line="260"/>
-            </w:pPr>
-            <w:r>
-              <w:rPr>
-                <w:rFonts w:ascii="Calibri" w:cs="Calibri" w:eastAsia="Calibri" w:hAnsi="Calibri"/>
-                <w:b w:val="false"/>
-                <w:bCs w:val="false"/>
-                <w:color w:val="000000"/>
-                <w:sz w:val="20"/>
-                <w:szCs w:val="20"/>
-              </w:rPr>
-              <w:t xml:space="preserve">GRU-D, 0.19 (0.08 to 0.29)</w:t>
+            <w:tcW w:type="dxa" w:w="2300"/>
+            <w:tcBorders>
+              <w:top w:val="single" w:color="D5DCE4" w:sz="4"/>
+              <w:left w:val="single" w:color="D5DCE4" w:sz="4"/>
+              <w:bottom w:val="single" w:color="D5DCE4" w:sz="4"/>
+              <w:right w:val="single" w:color="D5DCE4" w:sz="4"/>
+            </w:tcBorders>
+            <w:tcMar>
+              <w:top w:type="dxa" w:w="60"/>
+              <w:left w:type="dxa" w:w="100"/>
+              <w:bottom w:type="dxa" w:w="60"/>
+              <w:right w:type="dxa" w:w="100"/>
+            </w:tcMar>
+            <w:vAlign w:val="center"/>
+          </w:tcPr>
+          <w:p>
+            <w:pPr>
+              <w:spacing w:after="40" w:line="260"/>
+            </w:pPr>
+            <w:r>
+              <w:rPr>
+                <w:rFonts w:ascii="Calibri" w:cs="Calibri" w:eastAsia="Calibri" w:hAnsi="Calibri"/>
+                <w:b w:val="false"/>
+                <w:bCs w:val="false"/>
+                <w:color w:val="000000"/>
+                <w:sz w:val="20"/>
+                <w:szCs w:val="20"/>
+              </w:rPr>
+              <w:t xml:space="preserve">Models chosen by the validation rule</w:t>
+            </w:r>
+          </w:p>
+        </w:tc>
+        <w:tc>
+          <w:tcPr>
+            <w:tcW w:type="dxa" w:w="3400"/>
+            <w:tcBorders>
+              <w:top w:val="single" w:color="D5DCE4" w:sz="4"/>
+              <w:left w:val="single" w:color="D5DCE4" w:sz="4"/>
+              <w:bottom w:val="single" w:color="D5DCE4" w:sz="4"/>
+              <w:right w:val="single" w:color="D5DCE4" w:sz="4"/>
+            </w:tcBorders>
+            <w:tcMar>
+              <w:top w:type="dxa" w:w="60"/>
+              <w:left w:type="dxa" w:w="100"/>
+              <w:bottom w:type="dxa" w:w="60"/>
+              <w:right w:type="dxa" w:w="100"/>
+            </w:tcMar>
+            <w:vAlign w:val="center"/>
+          </w:tcPr>
+          <w:p>
+            <w:pPr>
+              <w:spacing w:after="40" w:line="260"/>
+            </w:pPr>
+            <w:r>
+              <w:rPr>
+                <w:rFonts w:ascii="Calibri" w:cs="Calibri" w:eastAsia="Calibri" w:hAnsi="Calibri"/>
+                <w:b w:val="false"/>
+                <w:bCs w:val="false"/>
+                <w:color w:val="000000"/>
+                <w:sz w:val="20"/>
+                <w:szCs w:val="20"/>
+              </w:rPr>
+              <w:t xml:space="preserve">GRU-D 0.19 (0.08 to 0.29), temporal CNN 0.17, flat OSTA 0.23</w:t>
+            </w:r>
+          </w:p>
+        </w:tc>
+        <w:tc>
+          <w:tcPr>
+            <w:tcW w:type="dxa" w:w="3300"/>
+            <w:tcBorders>
+              <w:top w:val="single" w:color="D5DCE4" w:sz="4"/>
+              <w:left w:val="single" w:color="D5DCE4" w:sz="4"/>
+              <w:bottom w:val="single" w:color="D5DCE4" w:sz="4"/>
+              <w:right w:val="single" w:color="D5DCE4" w:sz="4"/>
+            </w:tcBorders>
+            <w:tcMar>
+              <w:top w:type="dxa" w:w="60"/>
+              <w:left w:type="dxa" w:w="100"/>
+              <w:bottom w:type="dxa" w:w="60"/>
+              <w:right w:type="dxa" w:w="100"/>
+            </w:tcMar>
+            <w:vAlign w:val="center"/>
+          </w:tcPr>
+          <w:p>
+            <w:pPr>
+              <w:spacing w:after="40" w:line="260"/>
+            </w:pPr>
+            <w:r>
+              <w:rPr>
+                <w:rFonts w:ascii="Calibri" w:cs="Calibri" w:eastAsia="Calibri" w:hAnsi="Calibri"/>
+                <w:b w:val="false"/>
+                <w:bCs w:val="false"/>
+                <w:color w:val="000000"/>
+                <w:sz w:val="20"/>
+                <w:szCs w:val="20"/>
+              </w:rPr>
+              <w:t xml:space="preserve">GRU-D 0.07, flat OSTA 0.03, pooled self-supervised flat CNN 0.04</w:t>
             </w:r>
           </w:p>
         </w:tc>
@@ -4941,7 +5218,7 @@
         </w:trPr>
         <w:tc>
           <w:tcPr>
-            <w:tcW w:type="dxa" w:w="3200"/>
+            <w:tcW w:type="dxa" w:w="2300"/>
             <w:tcBorders>
               <w:top w:val="single" w:color="D5DCE4" w:sz="4"/>
               <w:left w:val="single" w:color="D5DCE4" w:sz="4"/>
@@ -4976,7 +5253,7 @@
         </w:tc>
         <w:tc>
           <w:tcPr>
-            <w:tcW w:type="dxa" w:w="5800"/>
+            <w:tcW w:type="dxa" w:w="3400"/>
             <w:tcBorders>
               <w:top w:val="single" w:color="D5DCE4" w:sz="4"/>
               <w:left w:val="single" w:color="D5DCE4" w:sz="4"/>
@@ -5006,6 +5283,41 @@
                 <w:szCs w:val="20"/>
               </w:rPr>
               <w:t xml:space="preserve">0.08 (0.01 to 0.16)</w:t>
+            </w:r>
+          </w:p>
+        </w:tc>
+        <w:tc>
+          <w:tcPr>
+            <w:tcW w:type="dxa" w:w="3300"/>
+            <w:tcBorders>
+              <w:top w:val="single" w:color="D5DCE4" w:sz="4"/>
+              <w:left w:val="single" w:color="D5DCE4" w:sz="4"/>
+              <w:bottom w:val="single" w:color="D5DCE4" w:sz="4"/>
+              <w:right w:val="single" w:color="D5DCE4" w:sz="4"/>
+            </w:tcBorders>
+            <w:shd w:fill="EEF3F7" w:color="auto" w:val="clear"/>
+            <w:tcMar>
+              <w:top w:type="dxa" w:w="60"/>
+              <w:left w:type="dxa" w:w="100"/>
+              <w:bottom w:type="dxa" w:w="60"/>
+              <w:right w:type="dxa" w:w="100"/>
+            </w:tcMar>
+            <w:vAlign w:val="center"/>
+          </w:tcPr>
+          <w:p>
+            <w:pPr>
+              <w:spacing w:after="40" w:line="260"/>
+            </w:pPr>
+            <w:r>
+              <w:rPr>
+                <w:rFonts w:ascii="Calibri" w:cs="Calibri" w:eastAsia="Calibri" w:hAnsi="Calibri"/>
+                <w:b w:val="false"/>
+                <w:bCs w:val="false"/>
+                <w:color w:val="000000"/>
+                <w:sz w:val="20"/>
+                <w:szCs w:val="20"/>
+              </w:rPr>
+              <w:t xml:space="preserve">0.01</w:t>
             </w:r>
           </w:p>
         </w:tc>
@@ -5016,7 +5328,7 @@
         </w:trPr>
         <w:tc>
           <w:tcPr>
-            <w:tcW w:type="dxa" w:w="3200"/>
+            <w:tcW w:type="dxa" w:w="2300"/>
             <w:tcBorders>
               <w:top w:val="single" w:color="D5DCE4" w:sz="4"/>
               <w:left w:val="single" w:color="D5DCE4" w:sz="4"/>
@@ -5050,7 +5362,7 @@
         </w:tc>
         <w:tc>
           <w:tcPr>
-            <w:tcW w:type="dxa" w:w="5800"/>
+            <w:tcW w:type="dxa" w:w="3400"/>
             <w:tcBorders>
               <w:top w:val="single" w:color="D5DCE4" w:sz="4"/>
               <w:left w:val="single" w:color="D5DCE4" w:sz="4"/>
@@ -5079,6 +5391,40 @@
                 <w:szCs w:val="20"/>
               </w:rPr>
               <w:t xml:space="preserve">0.72 to 0.84 across models</w:t>
+            </w:r>
+          </w:p>
+        </w:tc>
+        <w:tc>
+          <w:tcPr>
+            <w:tcW w:type="dxa" w:w="3300"/>
+            <w:tcBorders>
+              <w:top w:val="single" w:color="D5DCE4" w:sz="4"/>
+              <w:left w:val="single" w:color="D5DCE4" w:sz="4"/>
+              <w:bottom w:val="single" w:color="D5DCE4" w:sz="4"/>
+              <w:right w:val="single" w:color="D5DCE4" w:sz="4"/>
+            </w:tcBorders>
+            <w:tcMar>
+              <w:top w:type="dxa" w:w="60"/>
+              <w:left w:type="dxa" w:w="100"/>
+              <w:bottom w:type="dxa" w:w="60"/>
+              <w:right w:type="dxa" w:w="100"/>
+            </w:tcMar>
+            <w:vAlign w:val="center"/>
+          </w:tcPr>
+          <w:p>
+            <w:pPr>
+              <w:spacing w:after="40" w:line="260"/>
+            </w:pPr>
+            <w:r>
+              <w:rPr>
+                <w:rFonts w:ascii="Calibri" w:cs="Calibri" w:eastAsia="Calibri" w:hAnsi="Calibri"/>
+                <w:b w:val="false"/>
+                <w:bCs w:val="false"/>
+                <w:color w:val="000000"/>
+                <w:sz w:val="20"/>
+                <w:szCs w:val="20"/>
+              </w:rPr>
+              <w:t xml:space="preserve">0.53 to 0.68 across models</w:t>
             </w:r>
           </w:p>
         </w:tc>
@@ -5089,7 +5435,7 @@
         </w:trPr>
         <w:tc>
           <w:tcPr>
-            <w:tcW w:type="dxa" w:w="3200"/>
+            <w:tcW w:type="dxa" w:w="2300"/>
             <w:tcBorders>
               <w:top w:val="single" w:color="D5DCE4" w:sz="4"/>
               <w:left w:val="single" w:color="D5DCE4" w:sz="4"/>
@@ -5118,20 +5464,128 @@
                 <w:sz w:val="20"/>
                 <w:szCs w:val="20"/>
               </w:rPr>
+              <w:t xml:space="preserve">Transfer: models of the other database scored on these patients</w:t>
+            </w:r>
+          </w:p>
+        </w:tc>
+        <w:tc>
+          <w:tcPr>
+            <w:tcW w:type="dxa" w:w="3400"/>
+            <w:tcBorders>
+              <w:top w:val="single" w:color="D5DCE4" w:sz="4"/>
+              <w:left w:val="single" w:color="D5DCE4" w:sz="4"/>
+              <w:bottom w:val="single" w:color="D5DCE4" w:sz="4"/>
+              <w:right w:val="single" w:color="D5DCE4" w:sz="4"/>
+            </w:tcBorders>
+            <w:shd w:fill="EEF3F7" w:color="auto" w:val="clear"/>
+            <w:tcMar>
+              <w:top w:type="dxa" w:w="60"/>
+              <w:left w:type="dxa" w:w="100"/>
+              <w:bottom w:type="dxa" w:w="60"/>
+              <w:right w:type="dxa" w:w="100"/>
+            </w:tcMar>
+            <w:vAlign w:val="center"/>
+          </w:tcPr>
+          <w:p>
+            <w:pPr>
+              <w:spacing w:after="40" w:line="260"/>
+            </w:pPr>
+            <w:r>
+              <w:rPr>
+                <w:rFonts w:ascii="Calibri" w:cs="Calibri" w:eastAsia="Calibri" w:hAnsi="Calibri"/>
+                <w:b w:val="false"/>
+                <w:bCs w:val="false"/>
+                <w:color w:val="000000"/>
+                <w:sz w:val="20"/>
+                <w:szCs w:val="20"/>
+              </w:rPr>
+              <w:t xml:space="preserve">eICU-trained models on MIMIC-IV patients: -0.00 to +0.03, most OSTA variants silent; AUROC 0.57 to 0.74</w:t>
+            </w:r>
+          </w:p>
+        </w:tc>
+        <w:tc>
+          <w:tcPr>
+            <w:tcW w:type="dxa" w:w="3300"/>
+            <w:tcBorders>
+              <w:top w:val="single" w:color="D5DCE4" w:sz="4"/>
+              <w:left w:val="single" w:color="D5DCE4" w:sz="4"/>
+              <w:bottom w:val="single" w:color="D5DCE4" w:sz="4"/>
+              <w:right w:val="single" w:color="D5DCE4" w:sz="4"/>
+            </w:tcBorders>
+            <w:shd w:fill="EEF3F7" w:color="auto" w:val="clear"/>
+            <w:tcMar>
+              <w:top w:type="dxa" w:w="60"/>
+              <w:left w:type="dxa" w:w="100"/>
+              <w:bottom w:type="dxa" w:w="60"/>
+              <w:right w:type="dxa" w:w="100"/>
+            </w:tcMar>
+            <w:vAlign w:val="center"/>
+          </w:tcPr>
+          <w:p>
+            <w:pPr>
+              <w:spacing w:after="40" w:line="260"/>
+            </w:pPr>
+            <w:r>
+              <w:rPr>
+                <w:rFonts w:ascii="Calibri" w:cs="Calibri" w:eastAsia="Calibri" w:hAnsi="Calibri"/>
+                <w:b w:val="false"/>
+                <w:bCs w:val="false"/>
+                <w:color w:val="000000"/>
+                <w:sz w:val="20"/>
+                <w:szCs w:val="20"/>
+              </w:rPr>
+              <w:t xml:space="preserve">MIMIC-IV-trained models on eICU patients: -0.03 to +0.04 (logistic -0.15); AUROC 0.58 to 0.68</w:t>
+            </w:r>
+          </w:p>
+        </w:tc>
+      </w:tr>
+      <w:tr>
+        <w:trPr>
+          <w:cantSplit/>
+        </w:trPr>
+        <w:tc>
+          <w:tcPr>
+            <w:tcW w:type="dxa" w:w="2300"/>
+            <w:tcBorders>
+              <w:top w:val="single" w:color="D5DCE4" w:sz="4"/>
+              <w:left w:val="single" w:color="D5DCE4" w:sz="4"/>
+              <w:bottom w:val="single" w:color="D5DCE4" w:sz="4"/>
+              <w:right w:val="single" w:color="D5DCE4" w:sz="4"/>
+            </w:tcBorders>
+            <w:tcMar>
+              <w:top w:type="dxa" w:w="60"/>
+              <w:left w:type="dxa" w:w="100"/>
+              <w:bottom w:type="dxa" w:w="60"/>
+              <w:right w:type="dxa" w:w="100"/>
+            </w:tcMar>
+            <w:vAlign w:val="center"/>
+          </w:tcPr>
+          <w:p>
+            <w:pPr>
+              <w:spacing w:after="40" w:line="260"/>
+            </w:pPr>
+            <w:r>
+              <w:rPr>
+                <w:rFonts w:ascii="Calibri" w:cs="Calibri" w:eastAsia="Calibri" w:hAnsi="Calibri"/>
+                <w:b w:val="false"/>
+                <w:bCs w:val="false"/>
+                <w:color w:val="000000"/>
+                <w:sz w:val="20"/>
+                <w:szCs w:val="20"/>
+              </w:rPr>
               <w:t xml:space="preserve">Reference points</w:t>
             </w:r>
           </w:p>
         </w:tc>
         <w:tc>
           <w:tcPr>
-            <w:tcW w:type="dxa" w:w="5800"/>
-            <w:tcBorders>
-              <w:top w:val="single" w:color="D5DCE4" w:sz="4"/>
-              <w:left w:val="single" w:color="D5DCE4" w:sz="4"/>
-              <w:bottom w:val="single" w:color="D5DCE4" w:sz="4"/>
-              <w:right w:val="single" w:color="D5DCE4" w:sz="4"/>
-            </w:tcBorders>
-            <w:shd w:fill="EEF3F7" w:color="auto" w:val="clear"/>
+            <w:tcW w:type="dxa" w:w="3400"/>
+            <w:tcBorders>
+              <w:top w:val="single" w:color="D5DCE4" w:sz="4"/>
+              <w:left w:val="single" w:color="D5DCE4" w:sz="4"/>
+              <w:bottom w:val="single" w:color="D5DCE4" w:sz="4"/>
+              <w:right w:val="single" w:color="D5DCE4" w:sz="4"/>
+            </w:tcBorders>
             <w:tcMar>
               <w:top w:type="dxa" w:w="60"/>
               <w:left w:type="dxa" w:w="100"/>
@@ -5154,6 +5608,40 @@
                 <w:szCs w:val="20"/>
               </w:rPr>
               <w:t xml:space="preserve">PhysioNet 2019 winner: 0.43 on new patients from its training hospitals, -0.12 on the hidden hospital; our causal OSTA on PhysioNet: 0.22</w:t>
+            </w:r>
+          </w:p>
+        </w:tc>
+        <w:tc>
+          <w:tcPr>
+            <w:tcW w:type="dxa" w:w="3300"/>
+            <w:tcBorders>
+              <w:top w:val="single" w:color="D5DCE4" w:sz="4"/>
+              <w:left w:val="single" w:color="D5DCE4" w:sz="4"/>
+              <w:bottom w:val="single" w:color="D5DCE4" w:sz="4"/>
+              <w:right w:val="single" w:color="D5DCE4" w:sz="4"/>
+            </w:tcBorders>
+            <w:tcMar>
+              <w:top w:type="dxa" w:w="60"/>
+              <w:left w:type="dxa" w:w="100"/>
+              <w:bottom w:type="dxa" w:w="60"/>
+              <w:right w:type="dxa" w:w="100"/>
+            </w:tcMar>
+            <w:vAlign w:val="center"/>
+          </w:tcPr>
+          <w:p>
+            <w:pPr>
+              <w:spacing w:after="40" w:line="260"/>
+            </w:pPr>
+            <w:r>
+              <w:rPr>
+                <w:rFonts w:ascii="Calibri" w:cs="Calibri" w:eastAsia="Calibri" w:hAnsi="Calibri"/>
+                <w:b w:val="false"/>
+                <w:bCs w:val="false"/>
+                <w:color w:val="000000"/>
+                <w:sz w:val="20"/>
+                <w:szCs w:val="20"/>
+              </w:rPr>
+              <w:t xml:space="preserve"/>
             </w:r>
           </w:p>
         </w:tc>
@@ -5180,7 +5668,26 @@
           <w:sz w:val="22"/>
           <w:szCs w:val="22"/>
         </w:rPr>
-        <w:t xml:space="preserve">On a database built from raw tables with every hour scored causally, every model keeps a positive utility, including the competition winner's approach. These are internal results: the counterpart of the winner's 0.43 on its own hospitals, one of which (Beth Israel Deaconess, hospital system A of the challenge) is also the MIMIC-IV hospital. The counterpart of the winner's -0.12 on an unseen hospital is the sealed cross-database holdout, which has not been opened. The architectures differ more in point estimate than their overlapping intervals can support at this sample size. Transfer is the open problem: MIMIC-IV models scored on eICU development patients give utilities of -0.03 to 0.04 with intervals that include zero (hourly AUROC 0.58 to 0.68). eICU has the weaker antibiotic-only label and is the focus of the native eICU results (running at the time of writing), the full cohort, leave-hospital-out evaluation and label harmonisation.</w:t>
+        <w:t xml:space="preserve">On MIMIC-IV, built from raw tables with every hour scored causally, every model keeps a positive utility, including the competition winner's approach. These are internal results: the counterpart of the winner's 0.43 on its own hospitals, one of which (Beth Israel Deaconess, hospital system A of the challenge) is also the MIMIC-IV hospital. The architectures differ more in point estimate than their overlapping intervals can support at this sample size.</w:t>
+      </w:r>
+    </w:p>
+    <w:p>
+      <w:pPr>
+        <w:spacing w:after="120" w:before="0" w:line="276"/>
+        <w:jc w:val="left"/>
+      </w:pPr>
+      <w:r>
+        <w:rPr>
+          <w:rFonts w:ascii="Calibri" w:cs="Calibri" w:eastAsia="Calibri" w:hAnsi="Calibri"/>
+          <w:b w:val="false"/>
+          <w:bCs w:val="false"/>
+          <w:i w:val="false"/>
+          <w:iCs w:val="false"/>
+          <w:color w:val="000000"/>
+          <w:sz w:val="22"/>
+          <w:szCs w:val="22"/>
+        </w:rPr>
+        <w:t xml:space="preserve">On eICU the picture is different and is reported as found. With 45 sepsis events in the test split, spread over about a hundred hospitals and labelled by the weaker antibiotic-only definition, every model sits near zero whether it was trained on eICU itself (0.00 to 0.08) or trained on MIMIC-IV and transferred (-0.03 to +0.04); eICU-trained models transferred to MIMIC-IV also stay near zero. Hourly discrimination on eICU (AUROC 0.53 to 0.68) is far below MIMIC-IV (0.72 to 0.84). The design separates the three possible readings at stage 2: too few events and too few hours per hospital for the models to learn (the full cohort has about twenty times more); the label (the antibiotic-only harmonisation sensitivity on MIMIC-IV); and genuine site heterogeneity (leave-hospital-out evaluation across the eICU hospitals). The counterpart of the winner's -0.12 on an unseen hospital remains the sealed cross-database holdout, which has not been opened.</w:t>
       </w:r>
     </w:p>
     <w:p>
@@ -5230,7 +5737,7 @@
           <w:sz w:val="22"/>
           <w:szCs w:val="22"/>
         </w:rPr>
-        <w:t xml:space="preserve">The decision rules fixed before any result were applied on validation only. Organ structure is not supported at this sample size: OSTA did not beat its flat counterpart on validation, and this is reported as found. The loss comparison is undecided (cross-entropy ranked first for OSTA, the utility-weighted loss for the self-supervised model, the time-to-onset loss last for both). The shortlist for the full cohort is GRU-D, the temporal CNN and flat OSTA, plus the baselines and the winner's method. One declared deviation was recorded before the full-cohort run: the self-supervised CNN with an OSTA head had the highest test point estimate (0.29) without being chosen on validation, so it is added together with its flat twin as an exploratory pair, labelled as such, with the primary conclusions drawn from the rule-chosen models only; the pair also tests the organ question a second time at scale. The next lever is data: the full cohort has about nine times more sepsis cases and runs with three seeds.</w:t>
+        <w:t xml:space="preserve">The decision rules fixed before any result were applied on validation only, on each database. Organ structure is not supported on either database: OSTA did not beat its flat counterpart on validation in MIMIC-IV or in eICU, and this is reported as found. In the loss comparison plain cross-entropy ranked first in three of the four cases (OSTA on both databases and the self-supervised model on eICU; the utility-weighted loss won only for the self-supervised model on MIMIC-IV), and the time-to-onset loss ranked last in every case; the stage-2 loss is fixed from this rule in the protocol before the full-cohort run. The validation rule shortlisted GRU-D, the temporal CNN and flat OSTA on MIMIC-IV and GRU-D, flat OSTA and the pooled self-supervised flat CNN on eICU; the full-cohort arms are the union of the two (four new arms) plus the baselines and the winner's approach. One declared deviation was recorded before the full-cohort run: the self-supervised CNN with an OSTA head had the highest test point estimate (0.29) without being chosen on validation, so it is added together with its flat twin as an exploratory pair, labelled as such, with the primary conclusions drawn from the rule-chosen models only; the pair also tests the organ question a second time at scale. The next lever is data: the full cohort has about nine times more sepsis cases and runs with three seeds.</w:t>
       </w:r>
     </w:p>
     <w:p>

</xml_diff>